<commit_message>
Added passengers edit to departure
</commit_message>
<xml_diff>
--- a/Docs/Выходные документы/Договор/jp-aero-contract-draft.docx
+++ b/Docs/Выходные документы/Договор/jp-aero-contract-draft.docx
@@ -1,6 +1,6 @@
 
 <file path=word/document.xml><?xml version="1.0" encoding="utf-8"?>
-<w:document xmlns:wpc="http://schemas.microsoft.com/office/word/2010/wordprocessingCanvas" xmlns:cx="http://schemas.microsoft.com/office/drawing/2014/chartex" xmlns:cx1="http://schemas.microsoft.com/office/drawing/2015/9/8/chartex" xmlns:cx2="http://schemas.microsoft.com/office/drawing/2015/10/21/chartex" xmlns:cx3="http://schemas.microsoft.com/office/drawing/2016/5/9/chartex" xmlns:cx4="http://schemas.microsoft.com/office/drawing/2016/5/10/chartex" xmlns:cx5="http://schemas.microsoft.com/office/drawing/2016/5/11/chartex" xmlns:cx6="http://schemas.microsoft.com/office/drawing/2016/5/12/chartex" xmlns:cx7="http://schemas.microsoft.com/office/drawing/2016/5/13/chartex" xmlns:cx8="http://schemas.microsoft.com/office/drawing/2016/5/14/chartex" xmlns:mc="http://schemas.openxmlformats.org/markup-compatibility/2006" xmlns:aink="http://schemas.microsoft.com/office/drawing/2016/ink" xmlns:am3d="http://schemas.microsoft.com/office/drawing/2017/model3d" xmlns:o="urn:schemas-microsoft-com:office:office" xmlns:r="http://schemas.openxmlformats.org/officeDocument/2006/relationships" xmlns:m="http://schemas.openxmlformats.org/officeDocument/2006/math" xmlns:v="urn:schemas-microsoft-com:vml" xmlns:wp14="http://schemas.microsoft.com/office/word/2010/wordprocessingDrawing" xmlns:wp="http://schemas.openxmlformats.org/drawingml/2006/wordprocessingDrawing" xmlns:w10="urn:schemas-microsoft-com:office:word" xmlns:w="http://schemas.openxmlformats.org/wordprocessingml/2006/main" xmlns:w14="http://schemas.microsoft.com/office/word/2010/wordml" xmlns:w15="http://schemas.microsoft.com/office/word/2012/wordml" xmlns:w16cex="http://schemas.microsoft.com/office/word/2018/wordml/cex" xmlns:w16cid="http://schemas.microsoft.com/office/word/2016/wordml/cid" xmlns:w16="http://schemas.microsoft.com/office/word/2018/wordml" xmlns:w16sdtdh="http://schemas.microsoft.com/office/word/2020/wordml/sdtdatahash" xmlns:w16se="http://schemas.microsoft.com/office/word/2015/wordml/symex" xmlns:wpg="http://schemas.microsoft.com/office/word/2010/wordprocessingGroup" xmlns:wpi="http://schemas.microsoft.com/office/word/2010/wordprocessingInk" xmlns:wne="http://schemas.microsoft.com/office/word/2006/wordml" xmlns:wps="http://schemas.microsoft.com/office/word/2010/wordprocessingShape" mc:Ignorable="w14 w15 w16se w16cid w16 w16cex w16sdtdh wp14">
+<w:document xmlns:wpc="http://schemas.microsoft.com/office/word/2010/wordprocessingCanvas" xmlns:cx="http://schemas.microsoft.com/office/drawing/2014/chartex" xmlns:cx1="http://schemas.microsoft.com/office/drawing/2015/9/8/chartex" xmlns:cx2="http://schemas.microsoft.com/office/drawing/2015/10/21/chartex" xmlns:cx3="http://schemas.microsoft.com/office/drawing/2016/5/9/chartex" xmlns:cx4="http://schemas.microsoft.com/office/drawing/2016/5/10/chartex" xmlns:cx5="http://schemas.microsoft.com/office/drawing/2016/5/11/chartex" xmlns:cx6="http://schemas.microsoft.com/office/drawing/2016/5/12/chartex" xmlns:cx7="http://schemas.microsoft.com/office/drawing/2016/5/13/chartex" xmlns:cx8="http://schemas.microsoft.com/office/drawing/2016/5/14/chartex" xmlns:mc="http://schemas.openxmlformats.org/markup-compatibility/2006" xmlns:aink="http://schemas.microsoft.com/office/drawing/2016/ink" xmlns:am3d="http://schemas.microsoft.com/office/drawing/2017/model3d" xmlns:o="urn:schemas-microsoft-com:office:office" xmlns:r="http://schemas.openxmlformats.org/officeDocument/2006/relationships" xmlns:m="http://schemas.openxmlformats.org/officeDocument/2006/math" xmlns:v="urn:schemas-microsoft-com:vml" xmlns:wp14="http://schemas.microsoft.com/office/word/2010/wordprocessingDrawing" xmlns:wp="http://schemas.openxmlformats.org/drawingml/2006/wordprocessingDrawing" xmlns:w10="urn:schemas-microsoft-com:office:word" xmlns:w="http://schemas.openxmlformats.org/wordprocessingml/2006/main" xmlns:w14="http://schemas.microsoft.com/office/word/2010/wordml" xmlns:w15="http://schemas.microsoft.com/office/word/2012/wordml" xmlns:w16cid="http://schemas.microsoft.com/office/word/2016/wordml/cid" xmlns:w16se="http://schemas.microsoft.com/office/word/2015/wordml/symex" xmlns:wpg="http://schemas.microsoft.com/office/word/2010/wordprocessingGroup" xmlns:wpi="http://schemas.microsoft.com/office/word/2010/wordprocessingInk" xmlns:wne="http://schemas.microsoft.com/office/word/2006/wordml" xmlns:wps="http://schemas.microsoft.com/office/word/2010/wordprocessingShape" mc:Ignorable="w14 w15 w16se w16cid wp14">
   <w:body>
     <w:p>
       <w:pPr>
@@ -222,34 +222,49 @@
     <w:p>
       <w:pPr>
         <w:pStyle w:val="11"/>
-        <w:jc w:val="left"/>
-        <w:rPr>
-          <w:rFonts w:ascii="Arial Narrow" w:eastAsia="Arial Narrow" w:hAnsi="Arial Narrow" w:cs="Arial Narrow"/>
-        </w:rPr>
-      </w:pPr>
-      <w:r>
-        <w:rPr>
-          <w:rFonts w:ascii="Arial Narrow" w:hAnsi="Arial Narrow"/>
-          <w:bCs/>
-        </w:rPr>
-        <w:t>{</w:t>
-      </w:r>
-      <w:r>
+        <w:jc w:val="both"/>
+        <w:rPr>
+          <w:rFonts w:ascii="Arial Narrow" w:hAnsi="Arial Narrow"/>
+        </w:rPr>
+      </w:pPr>
+      <w:r>
+        <w:rPr>
+          <w:rFonts w:ascii="Arial Narrow" w:hAnsi="Arial Narrow"/>
+          <w:b/>
+        </w:rPr>
+        <w:t xml:space="preserve">Общество с ограниченной ответственностью «Джет </w:t>
+      </w:r>
+      <w:proofErr w:type="spellStart"/>
+      <w:r>
+        <w:rPr>
+          <w:rFonts w:ascii="Arial Narrow" w:hAnsi="Arial Narrow"/>
+          <w:b/>
+        </w:rPr>
+        <w:t>Партнерс</w:t>
+      </w:r>
+      <w:proofErr w:type="spellEnd"/>
+      <w:r>
+        <w:rPr>
+          <w:rFonts w:ascii="Arial Narrow" w:hAnsi="Arial Narrow"/>
+          <w:b/>
+        </w:rPr>
         <w:t xml:space="preserve"> </w:t>
       </w:r>
-      <w:r>
-        <w:rPr>
-          <w:rFonts w:ascii="Arial Narrow" w:hAnsi="Arial Narrow"/>
-          <w:bCs/>
-        </w:rPr>
-        <w:t>Полное наименование организации</w:t>
-      </w:r>
-      <w:r>
-        <w:rPr>
-          <w:rFonts w:ascii="Arial Narrow" w:hAnsi="Arial Narrow"/>
-          <w:bCs/>
-        </w:rPr>
-        <w:t xml:space="preserve"> }</w:t>
+      <w:proofErr w:type="spellStart"/>
+      <w:r>
+        <w:rPr>
+          <w:rFonts w:ascii="Arial Narrow" w:hAnsi="Arial Narrow"/>
+          <w:b/>
+        </w:rPr>
+        <w:t>Аэро</w:t>
+      </w:r>
+      <w:proofErr w:type="spellEnd"/>
+      <w:r>
+        <w:rPr>
+          <w:rFonts w:ascii="Arial Narrow" w:hAnsi="Arial Narrow"/>
+          <w:b/>
+        </w:rPr>
+        <w:t>»</w:t>
       </w:r>
       <w:r>
         <w:rPr>
@@ -268,135 +283,94 @@
         <w:rPr>
           <w:rFonts w:ascii="Arial Narrow" w:hAnsi="Arial Narrow"/>
         </w:rPr>
-        <w:t xml:space="preserve">ктора </w:t>
-      </w:r>
-      <w:r>
-        <w:rPr>
-          <w:rFonts w:ascii="Arial Narrow" w:hAnsi="Arial Narrow"/>
-        </w:rPr>
-        <w:t>{</w:t>
-      </w:r>
-      <w:r>
-        <w:rPr>
-          <w:rFonts w:ascii="Arial Narrow" w:hAnsi="Arial Narrow"/>
+        <w:t>ктора Ломакина Антона Вадимовича</w:t>
+      </w:r>
+      <w:r>
+        <w:rPr>
+          <w:rFonts w:ascii="Arial Narrow" w:hAnsi="Arial Narrow"/>
+        </w:rPr>
+        <w:t>, действующего на основании Устава</w:t>
+      </w:r>
+      <w:bookmarkEnd w:id="0"/>
+      <w:r>
+        <w:rPr>
+          <w:rFonts w:ascii="Arial Narrow" w:hAnsi="Arial Narrow"/>
+        </w:rPr>
+        <w:t xml:space="preserve">, с одной стороны и </w:t>
+      </w:r>
+    </w:p>
+    <w:p>
+      <w:pPr>
+        <w:pStyle w:val="11"/>
+        <w:ind w:firstLine="0"/>
+        <w:jc w:val="both"/>
+        <w:rPr>
+          <w:rFonts w:ascii="Arial Narrow" w:eastAsia="Arial Narrow" w:hAnsi="Arial Narrow" w:cs="Arial Narrow"/>
+        </w:rPr>
+      </w:pPr>
+      <w:r>
+        <w:rPr>
+          <w:rFonts w:ascii="Arial Narrow" w:hAnsi="Arial Narrow"/>
+        </w:rPr>
+        <w:tab/>
+      </w:r>
+      <w:r>
+        <w:rPr>
+          <w:rFonts w:ascii="Arial Narrow" w:hAnsi="Arial Narrow"/>
+          <w:b/>
+        </w:rPr>
+        <w:t>____</w:t>
+      </w:r>
+      <w:r>
+        <w:rPr>
+          <w:rFonts w:ascii="Arial Narrow" w:hAnsi="Arial Narrow"/>
+          <w:b/>
+        </w:rPr>
+        <w:t>____</w:t>
+      </w:r>
+      <w:r>
+        <w:rPr>
+          <w:rFonts w:ascii="Arial Narrow" w:hAnsi="Arial Narrow"/>
+          <w:b/>
+        </w:rPr>
+        <w:t>____________________________________________</w:t>
+      </w:r>
+      <w:r>
+        <w:rPr>
+          <w:rFonts w:ascii="Arial Narrow" w:hAnsi="Arial Narrow"/>
+          <w:b/>
         </w:rPr>
         <w:t xml:space="preserve"> </w:t>
       </w:r>
-      <w:proofErr w:type="spellStart"/>
-      <w:r>
-        <w:rPr>
-          <w:rFonts w:ascii="Arial Narrow" w:hAnsi="Arial Narrow"/>
-        </w:rPr>
-        <w:t>фио</w:t>
-      </w:r>
-      <w:proofErr w:type="spellEnd"/>
-      <w:r>
-        <w:rPr>
-          <w:rFonts w:ascii="Arial Narrow" w:hAnsi="Arial Narrow"/>
-        </w:rPr>
-        <w:t xml:space="preserve"> ген. </w:t>
-      </w:r>
-      <w:proofErr w:type="spellStart"/>
-      <w:r>
-        <w:rPr>
-          <w:rFonts w:ascii="Arial Narrow" w:hAnsi="Arial Narrow"/>
-        </w:rPr>
-        <w:t>дир</w:t>
-      </w:r>
-      <w:proofErr w:type="spellEnd"/>
-      <w:r>
-        <w:rPr>
-          <w:rFonts w:ascii="Arial Narrow" w:hAnsi="Arial Narrow"/>
-        </w:rPr>
-        <w:t>.</w:t>
-      </w:r>
-      <w:r>
-        <w:rPr>
-          <w:rFonts w:ascii="Arial Narrow" w:hAnsi="Arial Narrow"/>
-        </w:rPr>
-        <w:t xml:space="preserve"> </w:t>
-      </w:r>
-      <w:r>
-        <w:rPr>
-          <w:rFonts w:ascii="Arial Narrow" w:hAnsi="Arial Narrow"/>
-        </w:rPr>
-        <w:t>}</w:t>
-      </w:r>
-      <w:r>
-        <w:rPr>
-          <w:rFonts w:ascii="Arial Narrow" w:hAnsi="Arial Narrow"/>
-        </w:rPr>
-        <w:t>, действующего на основании Устава</w:t>
-      </w:r>
-      <w:bookmarkEnd w:id="0"/>
-      <w:r>
-        <w:rPr>
-          <w:rFonts w:ascii="Arial Narrow" w:hAnsi="Arial Narrow"/>
-        </w:rPr>
-        <w:t>, с одной стороны и</w:t>
-      </w:r>
-      <w:r>
-        <w:rPr>
-          <w:rFonts w:ascii="Arial Narrow" w:hAnsi="Arial Narrow"/>
-        </w:rPr>
-        <w:t xml:space="preserve"> </w:t>
-      </w:r>
-      <w:r>
-        <w:rPr>
-          <w:rFonts w:ascii="Arial Narrow" w:hAnsi="Arial Narrow"/>
-        </w:rPr>
-        <w:t>{</w:t>
-      </w:r>
-      <w:r>
-        <w:rPr>
-          <w:rFonts w:ascii="Arial Narrow" w:hAnsi="Arial Narrow"/>
-        </w:rPr>
-        <w:t xml:space="preserve"> </w:t>
-      </w:r>
-      <w:proofErr w:type="spellStart"/>
-      <w:r>
-        <w:rPr>
-          <w:rFonts w:ascii="Arial Narrow" w:hAnsi="Arial Narrow"/>
-        </w:rPr>
-        <w:t>фио</w:t>
-      </w:r>
-      <w:proofErr w:type="spellEnd"/>
-      <w:r>
-        <w:rPr>
-          <w:rFonts w:ascii="Arial Narrow" w:hAnsi="Arial Narrow"/>
-        </w:rPr>
-        <w:t xml:space="preserve"> </w:t>
-      </w:r>
-      <w:r>
-        <w:rPr>
-          <w:rFonts w:ascii="Arial Narrow" w:hAnsi="Arial Narrow"/>
-        </w:rPr>
-        <w:t>}</w:t>
-      </w:r>
-      <w:r>
-        <w:rPr>
-          <w:rFonts w:ascii="Arial Narrow" w:hAnsi="Arial Narrow"/>
-          <w:b/>
-        </w:rPr>
-        <w:t xml:space="preserve"> </w:t>
-      </w:r>
-      <w:r>
-        <w:rPr>
-          <w:rFonts w:ascii="Arial Narrow" w:hAnsi="Arial Narrow"/>
-        </w:rPr>
-        <w:t>далее именуем</w:t>
-      </w:r>
-      <w:r>
-        <w:rPr>
-          <w:rFonts w:ascii="Arial Narrow" w:hAnsi="Arial Narrow"/>
-        </w:rPr>
-        <w:t>ый</w:t>
-      </w:r>
-      <w:r>
-        <w:rPr>
-          <w:rFonts w:ascii="Arial Narrow" w:hAnsi="Arial Narrow"/>
-        </w:rPr>
-        <w:t xml:space="preserve"> «Заказчик», с другой стороны, вместе именуемые "Стороны", заключили настоящий Договор о нижеследующем.</w:t>
+      <w:r>
+        <w:rPr>
+          <w:rFonts w:ascii="Arial Narrow" w:hAnsi="Arial Narrow"/>
+        </w:rPr>
+        <w:t xml:space="preserve">далее именуемое «Заказчик», в лице </w:t>
+      </w:r>
+      <w:r>
+        <w:rPr>
+          <w:rFonts w:ascii="Arial Narrow" w:hAnsi="Arial Narrow"/>
+        </w:rPr>
+        <w:t>_________________________</w:t>
+      </w:r>
+      <w:r>
+        <w:rPr>
+          <w:rFonts w:ascii="Arial Narrow" w:hAnsi="Arial Narrow"/>
+        </w:rPr>
+        <w:t xml:space="preserve">, действующего на основании </w:t>
+      </w:r>
+      <w:r>
+        <w:rPr>
+          <w:rFonts w:ascii="Arial Narrow" w:hAnsi="Arial Narrow"/>
+        </w:rPr>
+        <w:t>_________________________</w:t>
+      </w:r>
+      <w:r>
+        <w:rPr>
+          <w:rFonts w:ascii="Arial Narrow" w:hAnsi="Arial Narrow"/>
+        </w:rPr>
+        <w:t>, с другой стороны, вместе именуемые "Стороны", заключили настоящий Договор о нижеследующем.</w:t>
       </w:r>
     </w:p>
     <w:p>
@@ -1469,7 +1443,7 @@
           <w:lang w:val="ru-RU"/>
         </w:rPr>
         <w:tab/>
-        <w:t xml:space="preserve">Заказчик информирует пассажиров об условиях перевозки, правилах пребывания и видах  услуг на борту, а </w:t>
+        <w:t xml:space="preserve">Заказчик информирует пассажиров об условиях перевозки, правилах пребывания и </w:t>
       </w:r>
       <w:proofErr w:type="gramStart"/>
       <w:r>
@@ -1479,7 +1453,7 @@
           <w:szCs w:val="20"/>
           <w:lang w:val="ru-RU"/>
         </w:rPr>
-        <w:t>так же</w:t>
+        <w:t>видах  услуг</w:t>
       </w:r>
       <w:proofErr w:type="gramEnd"/>
       <w:r>
@@ -1489,7 +1463,7 @@
           <w:szCs w:val="20"/>
           <w:lang w:val="ru-RU"/>
         </w:rPr>
-        <w:t xml:space="preserve"> требованиях законодательства РФ, распространяющихся на виды обслуживания согласно настоящему Договору.  </w:t>
+        <w:t xml:space="preserve"> на борту, а так же требованиях законодательства РФ, распространяющихся на виды обслуживания согласно настоящему Договору.  </w:t>
       </w:r>
     </w:p>
     <w:p>
@@ -1826,6 +1800,7 @@
           <w:szCs w:val="20"/>
           <w:lang w:val="ru-RU"/>
         </w:rPr>
+        <w:lastRenderedPageBreak/>
         <w:t xml:space="preserve">3.4. </w:t>
       </w:r>
       <w:r>
@@ -1894,7 +1869,6 @@
           <w:szCs w:val="20"/>
           <w:lang w:val="ru-RU"/>
         </w:rPr>
-        <w:lastRenderedPageBreak/>
         <w:t>Дополнительно, в случае просрочки платежа, согласно соответствующему Приложению, Заказчик уплачивает пени в размере 0,1% за каждый день просрочки от не перечисленной суммы, но не более 10% от первоначальной общей стоимости услуг по организации воздушной перевозки и дополнительных услуг.</w:t>
       </w:r>
     </w:p>
@@ -2587,106 +2561,25 @@
           <w:szCs w:val="20"/>
           <w:lang w:val="ru-RU"/>
         </w:rPr>
-        <w:t>«</w:t>
-      </w:r>
-      <w:r>
-        <w:rPr>
-          <w:rFonts w:ascii="Arial Narrow" w:hAnsi="Arial Narrow"/>
-          <w:sz w:val="20"/>
-          <w:szCs w:val="20"/>
-          <w:lang w:val="ru-RU"/>
-        </w:rPr>
-        <w:t xml:space="preserve">{ </w:t>
-      </w:r>
-      <w:r>
-        <w:rPr>
-          <w:rFonts w:ascii="Arial Narrow" w:hAnsi="Arial Narrow"/>
-          <w:sz w:val="20"/>
-          <w:szCs w:val="20"/>
-          <w:lang w:val="ru-RU"/>
-        </w:rPr>
-        <w:t>число</w:t>
-      </w:r>
-      <w:r>
-        <w:rPr>
-          <w:rFonts w:ascii="Arial Narrow" w:hAnsi="Arial Narrow"/>
-          <w:sz w:val="20"/>
-          <w:szCs w:val="20"/>
-          <w:lang w:val="ru-RU"/>
-        </w:rPr>
-        <w:t xml:space="preserve"> }</w:t>
-      </w:r>
-      <w:r>
-        <w:rPr>
-          <w:rFonts w:ascii="Arial Narrow" w:hAnsi="Arial Narrow"/>
-          <w:sz w:val="20"/>
-          <w:szCs w:val="20"/>
-          <w:lang w:val="ru-RU"/>
-        </w:rPr>
-        <w:t xml:space="preserve">» </w:t>
-      </w:r>
-      <w:r>
-        <w:rPr>
-          <w:rFonts w:ascii="Arial Narrow" w:hAnsi="Arial Narrow"/>
-          <w:sz w:val="20"/>
-          <w:szCs w:val="20"/>
-          <w:lang w:val="ru-RU"/>
-        </w:rPr>
-        <w:t>{</w:t>
-      </w:r>
-      <w:r>
-        <w:rPr>
-          <w:rFonts w:ascii="Arial Narrow" w:hAnsi="Arial Narrow"/>
-          <w:sz w:val="20"/>
-          <w:szCs w:val="20"/>
-          <w:lang w:val="ru-RU"/>
-        </w:rPr>
-        <w:t xml:space="preserve"> месяц </w:t>
-      </w:r>
-      <w:r>
-        <w:rPr>
-          <w:rFonts w:ascii="Arial Narrow" w:hAnsi="Arial Narrow"/>
-          <w:sz w:val="20"/>
-          <w:szCs w:val="20"/>
-          <w:lang w:val="ru-RU"/>
-        </w:rPr>
-        <w:t>}</w:t>
-      </w:r>
-      <w:r>
-        <w:rPr>
-          <w:rFonts w:ascii="Arial Narrow" w:hAnsi="Arial Narrow"/>
-          <w:sz w:val="20"/>
-          <w:szCs w:val="20"/>
-          <w:lang w:val="ru-RU"/>
-        </w:rPr>
-        <w:t xml:space="preserve"> </w:t>
-      </w:r>
-      <w:r>
-        <w:rPr>
-          <w:rFonts w:ascii="Arial Narrow" w:hAnsi="Arial Narrow"/>
-          <w:sz w:val="20"/>
-          <w:szCs w:val="20"/>
-          <w:lang w:val="ru-RU"/>
-        </w:rPr>
-        <w:t>{</w:t>
-      </w:r>
-      <w:r>
-        <w:rPr>
-          <w:rFonts w:ascii="Arial Narrow" w:hAnsi="Arial Narrow"/>
-          <w:sz w:val="20"/>
-          <w:szCs w:val="20"/>
-          <w:lang w:val="ru-RU"/>
-        </w:rPr>
-        <w:t>год</w:t>
-      </w:r>
-      <w:r>
-        <w:rPr>
-          <w:rFonts w:ascii="Arial Narrow" w:hAnsi="Arial Narrow"/>
-          <w:sz w:val="20"/>
-          <w:szCs w:val="20"/>
-          <w:lang w:val="ru-RU"/>
-        </w:rPr>
-        <w:t>}</w:t>
+        <w:t>«____» ___________</w:t>
+      </w:r>
+      <w:r>
+        <w:rPr>
+          <w:rFonts w:ascii="Arial Narrow" w:hAnsi="Arial Narrow"/>
+          <w:sz w:val="20"/>
+          <w:szCs w:val="20"/>
+          <w:lang w:val="ru-RU"/>
+        </w:rPr>
+        <w:t xml:space="preserve"> 20</w:t>
+      </w:r>
+      <w:r>
+        <w:rPr>
+          <w:rFonts w:ascii="Arial Narrow" w:hAnsi="Arial Narrow"/>
+          <w:sz w:val="20"/>
+          <w:szCs w:val="20"/>
+          <w:lang w:val="ru-RU"/>
+        </w:rPr>
+        <w:t>2___</w:t>
       </w:r>
       <w:r>
         <w:rPr>
@@ -5372,6 +5265,7 @@
           <w:szCs w:val="20"/>
           <w:lang w:val="ru-RU"/>
         </w:rPr>
+        <w:lastRenderedPageBreak/>
         <w:t>ПОРЯДОК РАСТОРЖЕНИЯ ДОГОВОРА</w:t>
       </w:r>
     </w:p>
@@ -5405,7 +5299,6 @@
           <w:szCs w:val="20"/>
           <w:lang w:val="ru-RU"/>
         </w:rPr>
-        <w:lastRenderedPageBreak/>
         <w:t xml:space="preserve">6.1. </w:t>
       </w:r>
       <w:r>
@@ -5703,15 +5596,6 @@
           <w:szCs w:val="20"/>
         </w:rPr>
       </w:pPr>
-      <w:r>
-        <w:rPr>
-          <w:rFonts w:ascii="Arial Narrow" w:hAnsi="Arial Narrow"/>
-          <w:sz w:val="20"/>
-          <w:szCs w:val="20"/>
-          <w:lang w:val="ru-RU"/>
-        </w:rPr>
-        <w:t xml:space="preserve">        </w:t>
-      </w:r>
       <w:proofErr w:type="spellStart"/>
       <w:r>
         <w:rPr>
@@ -6440,7 +6324,7 @@
     <w:tbl>
       <w:tblPr>
         <w:tblStyle w:val="TableNormal"/>
-        <w:tblW w:w="10368" w:type="dxa"/>
+        <w:tblW w:w="10440" w:type="dxa"/>
         <w:tblInd w:w="684" w:type="dxa"/>
         <w:tblBorders>
           <w:top w:val="single" w:sz="8" w:space="0" w:color="FFFFFF"/>
@@ -6455,8 +6339,8 @@
         <w:tblLook w:val="04A0" w:firstRow="1" w:lastRow="0" w:firstColumn="1" w:lastColumn="0" w:noHBand="0" w:noVBand="1"/>
       </w:tblPr>
       <w:tblGrid>
-        <w:gridCol w:w="5265"/>
-        <w:gridCol w:w="5103"/>
+        <w:gridCol w:w="5400"/>
+        <w:gridCol w:w="5040"/>
       </w:tblGrid>
       <w:tr>
         <w:trPr>
@@ -6464,7 +6348,7 @@
         </w:trPr>
         <w:tc>
           <w:tcPr>
-            <w:tcW w:w="5265" w:type="dxa"/>
+            <w:tcW w:w="5400" w:type="dxa"/>
             <w:tcBorders>
               <w:top w:val="single" w:sz="4" w:space="0" w:color="000000"/>
               <w:left w:val="single" w:sz="4" w:space="0" w:color="000000"/>
@@ -6503,8 +6387,6 @@
               <w:pStyle w:val="10"/>
               <w:spacing w:before="0" w:after="0"/>
               <w:jc w:val="center"/>
-            </w:pPr>
-            <w:r>
               <w:rPr>
                 <w:rFonts w:ascii="Arial Narrow" w:hAnsi="Arial Narrow"/>
                 <w:b w:val="0"/>
@@ -6513,13 +6395,100 @@
                 <w:szCs w:val="20"/>
                 <w:lang w:val="ru-RU"/>
               </w:rPr>
-              <w:t>{ Полное наименование организации }</w:t>
+            </w:pPr>
+            <w:r>
+              <w:rPr>
+                <w:rFonts w:ascii="Arial Narrow" w:hAnsi="Arial Narrow"/>
+                <w:b w:val="0"/>
+                <w:bCs w:val="0"/>
+                <w:sz w:val="20"/>
+                <w:szCs w:val="20"/>
+                <w:lang w:val="ru-RU"/>
+              </w:rPr>
+              <w:t>Общество с ограниченной ответственностью</w:t>
+            </w:r>
+          </w:p>
+          <w:p>
+            <w:pPr>
+              <w:pStyle w:val="10"/>
+              <w:spacing w:before="0" w:after="0"/>
+              <w:jc w:val="center"/>
+            </w:pPr>
+            <w:r>
+              <w:rPr>
+                <w:rFonts w:ascii="Arial Narrow" w:hAnsi="Arial Narrow"/>
+                <w:b w:val="0"/>
+                <w:bCs w:val="0"/>
+                <w:sz w:val="20"/>
+                <w:szCs w:val="20"/>
+                <w:lang w:val="ru-RU"/>
+              </w:rPr>
+              <w:t xml:space="preserve"> </w:t>
+            </w:r>
+            <w:r>
+              <w:rPr>
+                <w:rFonts w:ascii="Arial Narrow" w:hAnsi="Arial Narrow"/>
+                <w:b w:val="0"/>
+                <w:bCs w:val="0"/>
+                <w:sz w:val="20"/>
+                <w:szCs w:val="20"/>
+                <w:lang w:val="ru-RU"/>
+              </w:rPr>
+              <w:t xml:space="preserve">«Джет </w:t>
+            </w:r>
+            <w:proofErr w:type="spellStart"/>
+            <w:r>
+              <w:rPr>
+                <w:rFonts w:ascii="Arial Narrow" w:hAnsi="Arial Narrow"/>
+                <w:b w:val="0"/>
+                <w:bCs w:val="0"/>
+                <w:sz w:val="20"/>
+                <w:szCs w:val="20"/>
+                <w:lang w:val="ru-RU"/>
+              </w:rPr>
+              <w:t>Партнерс</w:t>
+            </w:r>
+            <w:proofErr w:type="spellEnd"/>
+            <w:r>
+              <w:rPr>
+                <w:rFonts w:ascii="Arial Narrow" w:hAnsi="Arial Narrow"/>
+                <w:b w:val="0"/>
+                <w:bCs w:val="0"/>
+                <w:sz w:val="20"/>
+                <w:szCs w:val="20"/>
+                <w:lang w:val="ru-RU"/>
+              </w:rPr>
+              <w:t xml:space="preserve"> </w:t>
+            </w:r>
+            <w:proofErr w:type="spellStart"/>
+            <w:r>
+              <w:rPr>
+                <w:rFonts w:ascii="Arial Narrow" w:hAnsi="Arial Narrow"/>
+                <w:b w:val="0"/>
+                <w:bCs w:val="0"/>
+                <w:sz w:val="20"/>
+                <w:szCs w:val="20"/>
+                <w:lang w:val="ru-RU"/>
+              </w:rPr>
+              <w:t>Аэро</w:t>
+            </w:r>
+            <w:proofErr w:type="spellEnd"/>
+            <w:r>
+              <w:rPr>
+                <w:rFonts w:ascii="Arial Narrow" w:hAnsi="Arial Narrow"/>
+                <w:b w:val="0"/>
+                <w:bCs w:val="0"/>
+                <w:sz w:val="20"/>
+                <w:szCs w:val="20"/>
+                <w:lang w:val="ru-RU"/>
+              </w:rPr>
+              <w:t>»</w:t>
             </w:r>
           </w:p>
         </w:tc>
         <w:tc>
           <w:tcPr>
-            <w:tcW w:w="5103" w:type="dxa"/>
+            <w:tcW w:w="5040" w:type="dxa"/>
             <w:tcBorders>
               <w:top w:val="single" w:sz="4" w:space="0" w:color="000000"/>
               <w:left w:val="single" w:sz="4" w:space="0" w:color="000000"/>
@@ -6560,16 +6529,10 @@
             <w:pPr>
               <w:pStyle w:val="a7"/>
               <w:jc w:val="center"/>
+              <w:rPr>
+                <w:lang w:val="ru-RU"/>
+              </w:rPr>
             </w:pPr>
-            <w:r>
-              <w:rPr>
-                <w:rFonts w:ascii="Arial Narrow" w:hAnsi="Arial Narrow"/>
-                <w:sz w:val="20"/>
-                <w:szCs w:val="20"/>
-              </w:rPr>
-              <w:t xml:space="preserve">{ </w:t>
-            </w:r>
-            <w:proofErr w:type="spellStart"/>
             <w:r>
               <w:rPr>
                 <w:rFonts w:ascii="Arial Narrow" w:hAnsi="Arial Narrow"/>
@@ -6577,25 +6540,7 @@
                 <w:szCs w:val="20"/>
                 <w:lang w:val="ru-RU"/>
               </w:rPr>
-              <w:t>фио</w:t>
-            </w:r>
-            <w:proofErr w:type="spellEnd"/>
-            <w:r>
-              <w:rPr>
-                <w:rFonts w:ascii="Arial Narrow" w:hAnsi="Arial Narrow"/>
-                <w:sz w:val="20"/>
-                <w:szCs w:val="20"/>
-                <w:lang w:val="ru-RU"/>
-              </w:rPr>
-              <w:t xml:space="preserve"> </w:t>
-            </w:r>
-            <w:r>
-              <w:rPr>
-                <w:rFonts w:ascii="Arial Narrow" w:hAnsi="Arial Narrow"/>
-                <w:sz w:val="20"/>
-                <w:szCs w:val="20"/>
-              </w:rPr>
-              <w:t>}</w:t>
+              <w:t>_____________________________________</w:t>
             </w:r>
           </w:p>
         </w:tc>
@@ -6606,7 +6551,7 @@
         </w:trPr>
         <w:tc>
           <w:tcPr>
-            <w:tcW w:w="5265" w:type="dxa"/>
+            <w:tcW w:w="5400" w:type="dxa"/>
             <w:tcBorders>
               <w:top w:val="single" w:sz="4" w:space="0" w:color="000000"/>
               <w:left w:val="single" w:sz="4" w:space="0" w:color="000000"/>
@@ -6638,17 +6583,9 @@
                 <w:szCs w:val="20"/>
                 <w:lang w:val="ru-RU"/>
               </w:rPr>
-              <w:t>Юридический адрес:</w:t>
+              <w:t xml:space="preserve">Юридический адрес: 121357, г. Москва, ул. </w:t>
             </w:r>
-            <w:r>
-              <w:rPr>
-                <w:rFonts w:ascii="Arial Narrow" w:eastAsia="Arial Narrow" w:hAnsi="Arial Narrow" w:cs="Arial Narrow"/>
-                <w:sz w:val="20"/>
-                <w:szCs w:val="20"/>
-                <w:lang w:val="en-US"/>
-              </w:rPr>
-              <w:t xml:space="preserve"> {</w:t>
-            </w:r>
+            <w:proofErr w:type="spellStart"/>
             <w:r>
               <w:rPr>
                 <w:rFonts w:ascii="Arial Narrow" w:eastAsia="Arial Narrow" w:hAnsi="Arial Narrow" w:cs="Arial Narrow"/>
@@ -6656,8 +6593,9 @@
                 <w:szCs w:val="20"/>
                 <w:lang w:val="ru-RU"/>
               </w:rPr>
-              <w:t xml:space="preserve"> </w:t>
+              <w:t>Верейская</w:t>
             </w:r>
+            <w:proofErr w:type="spellEnd"/>
             <w:r>
               <w:rPr>
                 <w:rFonts w:ascii="Arial Narrow" w:eastAsia="Arial Narrow" w:hAnsi="Arial Narrow" w:cs="Arial Narrow"/>
@@ -6665,16 +6603,63 @@
                 <w:szCs w:val="20"/>
                 <w:lang w:val="ru-RU"/>
               </w:rPr>
-              <w:t>Юридический адрес</w:t>
+              <w:t xml:space="preserve">, д.29, строение 33, 2 </w:t>
             </w:r>
+            <w:proofErr w:type="spellStart"/>
             <w:r>
               <w:rPr>
                 <w:rFonts w:ascii="Arial Narrow" w:eastAsia="Arial Narrow" w:hAnsi="Arial Narrow" w:cs="Arial Narrow"/>
                 <w:sz w:val="20"/>
                 <w:szCs w:val="20"/>
-                <w:lang w:val="en-US"/>
-              </w:rPr>
-              <w:t xml:space="preserve"> }</w:t>
+                <w:lang w:val="ru-RU"/>
+              </w:rPr>
+              <w:t>эт</w:t>
+            </w:r>
+            <w:proofErr w:type="spellEnd"/>
+            <w:r>
+              <w:rPr>
+                <w:rFonts w:ascii="Arial Narrow" w:eastAsia="Arial Narrow" w:hAnsi="Arial Narrow" w:cs="Arial Narrow"/>
+                <w:sz w:val="20"/>
+                <w:szCs w:val="20"/>
+                <w:lang w:val="ru-RU"/>
+              </w:rPr>
+              <w:t>., ком</w:t>
+            </w:r>
+            <w:r>
+              <w:rPr>
+                <w:rFonts w:ascii="Arial Narrow" w:eastAsia="Arial Narrow" w:hAnsi="Arial Narrow" w:cs="Arial Narrow"/>
+                <w:sz w:val="20"/>
+                <w:szCs w:val="20"/>
+                <w:lang w:val="ru-RU"/>
+              </w:rPr>
+              <w:t>н</w:t>
+            </w:r>
+            <w:r>
+              <w:rPr>
+                <w:rFonts w:ascii="Arial Narrow" w:eastAsia="Arial Narrow" w:hAnsi="Arial Narrow" w:cs="Arial Narrow"/>
+                <w:sz w:val="20"/>
+                <w:szCs w:val="20"/>
+                <w:lang w:val="ru-RU"/>
+              </w:rPr>
+              <w:t xml:space="preserve">. </w:t>
+            </w:r>
+            <w:r>
+              <w:rPr>
+                <w:rFonts w:ascii="Arial Narrow" w:eastAsia="Arial Narrow" w:hAnsi="Arial Narrow" w:cs="Arial Narrow"/>
+                <w:sz w:val="20"/>
+                <w:szCs w:val="20"/>
+                <w:lang w:val="ru-RU"/>
+              </w:rPr>
+              <w:t>1</w:t>
+            </w:r>
+            <w:r>
+              <w:rPr>
+                <w:rFonts w:ascii="Arial Narrow" w:eastAsia="Arial Narrow" w:hAnsi="Arial Narrow" w:cs="Arial Narrow"/>
+                <w:sz w:val="20"/>
+                <w:szCs w:val="20"/>
+                <w:lang w:val="ru-RU"/>
+              </w:rPr>
+              <w:t>3.</w:t>
             </w:r>
           </w:p>
           <w:p>
@@ -6684,7 +6669,7 @@
                 <w:rFonts w:ascii="Arial Narrow" w:eastAsia="Arial Narrow" w:hAnsi="Arial Narrow" w:cs="Arial Narrow"/>
                 <w:sz w:val="20"/>
                 <w:szCs w:val="20"/>
-                <w:lang w:val="en-US"/>
+                <w:lang w:val="ru-RU"/>
               </w:rPr>
             </w:pPr>
             <w:r>
@@ -6694,17 +6679,9 @@
                 <w:szCs w:val="20"/>
                 <w:lang w:val="ru-RU"/>
               </w:rPr>
-              <w:t xml:space="preserve">Почтовый адрес: </w:t>
+              <w:t xml:space="preserve">Почтовый адрес: 121357, г. Москва, ул. </w:t>
             </w:r>
-            <w:r>
-              <w:rPr>
-                <w:rFonts w:ascii="Arial Narrow" w:eastAsia="Arial Narrow" w:hAnsi="Arial Narrow" w:cs="Arial Narrow"/>
-                <w:sz w:val="20"/>
-                <w:szCs w:val="20"/>
-                <w:lang w:val="en-US"/>
-              </w:rPr>
-              <w:t xml:space="preserve">{ </w:t>
-            </w:r>
+            <w:proofErr w:type="spellStart"/>
             <w:r>
               <w:rPr>
                 <w:rFonts w:ascii="Arial Narrow" w:eastAsia="Arial Narrow" w:hAnsi="Arial Narrow" w:cs="Arial Narrow"/>
@@ -6712,16 +6689,26 @@
                 <w:szCs w:val="20"/>
                 <w:lang w:val="ru-RU"/>
               </w:rPr>
-              <w:t>Почтовый адрес</w:t>
+              <w:t>Верейская</w:t>
             </w:r>
+            <w:proofErr w:type="spellEnd"/>
             <w:r>
               <w:rPr>
                 <w:rFonts w:ascii="Arial Narrow" w:eastAsia="Arial Narrow" w:hAnsi="Arial Narrow" w:cs="Arial Narrow"/>
                 <w:sz w:val="20"/>
                 <w:szCs w:val="20"/>
-                <w:lang w:val="en-US"/>
-              </w:rPr>
-              <w:t xml:space="preserve"> }</w:t>
+                <w:lang w:val="ru-RU"/>
+              </w:rPr>
+              <w:t>, д.29, стр.134, оф.2</w:t>
+            </w:r>
+            <w:r>
+              <w:rPr>
+                <w:rFonts w:ascii="Arial Narrow" w:eastAsia="Arial Narrow" w:hAnsi="Arial Narrow" w:cs="Arial Narrow"/>
+                <w:sz w:val="20"/>
+                <w:szCs w:val="20"/>
+                <w:lang w:val="ru-RU"/>
+              </w:rPr>
+              <w:t>07</w:t>
             </w:r>
           </w:p>
           <w:p>
@@ -6751,33 +6738,7 @@
                 <w:lang w:val="ru-RU"/>
               </w:rPr>
               <w:tab/>
-            </w:r>
-            <w:r>
-              <w:rPr>
-                <w:rFonts w:ascii="Arial Narrow" w:eastAsia="Arial Narrow" w:hAnsi="Arial Narrow" w:cs="Arial Narrow"/>
-                <w:sz w:val="20"/>
-                <w:szCs w:val="20"/>
-                <w:lang w:val="en-US"/>
-              </w:rPr>
-              <w:t xml:space="preserve">{ </w:t>
-            </w:r>
-            <w:r>
-              <w:rPr>
-                <w:rFonts w:ascii="Arial Narrow" w:eastAsia="Arial Narrow" w:hAnsi="Arial Narrow" w:cs="Arial Narrow"/>
-                <w:sz w:val="20"/>
-                <w:szCs w:val="20"/>
-                <w:lang w:val="ru-RU"/>
-              </w:rPr>
-              <w:t xml:space="preserve">ИНН </w:t>
-            </w:r>
-            <w:r>
-              <w:rPr>
-                <w:rFonts w:ascii="Arial Narrow" w:eastAsia="Arial Narrow" w:hAnsi="Arial Narrow" w:cs="Arial Narrow"/>
-                <w:sz w:val="20"/>
-                <w:szCs w:val="20"/>
-                <w:lang w:val="en-US"/>
-              </w:rPr>
-              <w:t>}</w:t>
+              <w:t>7720430144</w:t>
             </w:r>
           </w:p>
           <w:p>
@@ -6807,33 +6768,7 @@
                 <w:lang w:val="ru-RU"/>
               </w:rPr>
               <w:tab/>
-            </w:r>
-            <w:r>
-              <w:rPr>
-                <w:rFonts w:ascii="Arial Narrow" w:eastAsia="Arial Narrow" w:hAnsi="Arial Narrow" w:cs="Arial Narrow"/>
-                <w:sz w:val="20"/>
-                <w:szCs w:val="20"/>
-                <w:lang w:val="ru-RU"/>
-              </w:rPr>
-              <w:t xml:space="preserve">{ </w:t>
-            </w:r>
-            <w:r>
-              <w:rPr>
-                <w:rFonts w:ascii="Arial Narrow" w:eastAsia="Arial Narrow" w:hAnsi="Arial Narrow" w:cs="Arial Narrow"/>
-                <w:sz w:val="20"/>
-                <w:szCs w:val="20"/>
-                <w:lang w:val="ru-RU"/>
-              </w:rPr>
-              <w:t>КПП</w:t>
-            </w:r>
-            <w:r>
-              <w:rPr>
-                <w:rFonts w:ascii="Arial Narrow" w:eastAsia="Arial Narrow" w:hAnsi="Arial Narrow" w:cs="Arial Narrow"/>
-                <w:sz w:val="20"/>
-                <w:szCs w:val="20"/>
-                <w:lang w:val="ru-RU"/>
-              </w:rPr>
-              <w:t xml:space="preserve"> }</w:t>
+              <w:t>773101001</w:t>
             </w:r>
           </w:p>
           <w:p>
@@ -6863,33 +6798,7 @@
                 <w:lang w:val="ru-RU"/>
               </w:rPr>
               <w:tab/>
-            </w:r>
-            <w:r>
-              <w:rPr>
-                <w:rFonts w:ascii="Arial Narrow" w:eastAsia="Arial Narrow" w:hAnsi="Arial Narrow" w:cs="Arial Narrow"/>
-                <w:sz w:val="20"/>
-                <w:szCs w:val="20"/>
-                <w:lang w:val="ru-RU"/>
-              </w:rPr>
-              <w:t xml:space="preserve">{ </w:t>
-            </w:r>
-            <w:r>
-              <w:rPr>
-                <w:rFonts w:ascii="Arial Narrow" w:eastAsia="Arial Narrow" w:hAnsi="Arial Narrow" w:cs="Arial Narrow"/>
-                <w:sz w:val="20"/>
-                <w:szCs w:val="20"/>
-                <w:lang w:val="ru-RU"/>
-              </w:rPr>
-              <w:t>ОРГН</w:t>
-            </w:r>
-            <w:r>
-              <w:rPr>
-                <w:rFonts w:ascii="Arial Narrow" w:eastAsia="Arial Narrow" w:hAnsi="Arial Narrow" w:cs="Arial Narrow"/>
-                <w:sz w:val="20"/>
-                <w:szCs w:val="20"/>
-                <w:lang w:val="ru-RU"/>
-              </w:rPr>
-              <w:t xml:space="preserve"> }</w:t>
+              <w:t>1187746528133</w:t>
             </w:r>
           </w:p>
           <w:p>
@@ -6909,34 +6818,7 @@
                 <w:szCs w:val="20"/>
                 <w:lang w:val="ru-RU"/>
               </w:rPr>
-              <w:t xml:space="preserve">р/с </w:t>
-            </w:r>
-            <w:r>
-              <w:rPr>
-                <w:rFonts w:ascii="Arial Narrow" w:eastAsia="Arial Narrow" w:hAnsi="Arial Narrow" w:cs="Arial Narrow"/>
-                <w:sz w:val="20"/>
-                <w:szCs w:val="20"/>
-                <w:lang w:val="ru-RU"/>
-              </w:rPr>
-              <w:t xml:space="preserve">{ </w:t>
-            </w:r>
-            <w:r>
-              <w:rPr>
-                <w:rFonts w:ascii="Arial Narrow" w:eastAsia="Arial Narrow" w:hAnsi="Arial Narrow" w:cs="Arial Narrow"/>
-                <w:sz w:val="20"/>
-                <w:szCs w:val="20"/>
-                <w:lang w:val="ru-RU"/>
-              </w:rPr>
-              <w:t>р/с</w:t>
-            </w:r>
-            <w:r>
-              <w:rPr>
-                <w:rFonts w:ascii="Arial Narrow" w:eastAsia="Arial Narrow" w:hAnsi="Arial Narrow" w:cs="Arial Narrow"/>
-                <w:sz w:val="20"/>
-                <w:szCs w:val="20"/>
-                <w:lang w:val="ru-RU"/>
-              </w:rPr>
-              <w:t xml:space="preserve"> }</w:t>
+              <w:t>р/с 40702810802320002431</w:t>
             </w:r>
           </w:p>
           <w:p>
@@ -6956,43 +6838,7 @@
                 <w:szCs w:val="20"/>
                 <w:lang w:val="ru-RU"/>
               </w:rPr>
-              <w:t xml:space="preserve">в </w:t>
-            </w:r>
-            <w:r>
-              <w:rPr>
-                <w:rFonts w:ascii="Arial Narrow" w:eastAsia="Arial Narrow" w:hAnsi="Arial Narrow" w:cs="Arial Narrow"/>
-                <w:sz w:val="20"/>
-                <w:szCs w:val="20"/>
-                <w:lang w:val="ru-RU"/>
-              </w:rPr>
-              <w:t xml:space="preserve">{ </w:t>
-            </w:r>
-            <w:r>
-              <w:rPr>
-                <w:rFonts w:ascii="Arial Narrow" w:eastAsia="Arial Narrow" w:hAnsi="Arial Narrow" w:cs="Arial Narrow"/>
-                <w:sz w:val="20"/>
-                <w:szCs w:val="20"/>
-                <w:lang w:val="ru-RU"/>
-              </w:rPr>
-              <w:t>Н</w:t>
-            </w:r>
-            <w:r>
-              <w:rPr>
-                <w:rFonts w:ascii="Arial Narrow" w:eastAsia="Arial Narrow" w:hAnsi="Arial Narrow" w:cs="Arial Narrow"/>
-                <w:sz w:val="20"/>
-                <w:szCs w:val="20"/>
-                <w:lang w:val="ru-RU"/>
-              </w:rPr>
-              <w:t>азвание банка</w:t>
-            </w:r>
-            <w:r>
-              <w:rPr>
-                <w:rFonts w:ascii="Arial Narrow" w:eastAsia="Arial Narrow" w:hAnsi="Arial Narrow" w:cs="Arial Narrow"/>
-                <w:sz w:val="20"/>
-                <w:szCs w:val="20"/>
-                <w:lang w:val="ru-RU"/>
-              </w:rPr>
-              <w:t xml:space="preserve"> }</w:t>
+              <w:t>в АО "АЛЬФА-БАНК"</w:t>
             </w:r>
           </w:p>
           <w:p>
@@ -7012,34 +6858,7 @@
                 <w:szCs w:val="20"/>
                 <w:lang w:val="ru-RU"/>
               </w:rPr>
-              <w:t xml:space="preserve">к/с </w:t>
-            </w:r>
-            <w:r>
-              <w:rPr>
-                <w:rFonts w:ascii="Arial Narrow" w:eastAsia="Arial Narrow" w:hAnsi="Arial Narrow" w:cs="Arial Narrow"/>
-                <w:sz w:val="20"/>
-                <w:szCs w:val="20"/>
-                <w:lang w:val="ru-RU"/>
-              </w:rPr>
-              <w:t xml:space="preserve">{ </w:t>
-            </w:r>
-            <w:r>
-              <w:rPr>
-                <w:rFonts w:ascii="Arial Narrow" w:eastAsia="Arial Narrow" w:hAnsi="Arial Narrow" w:cs="Arial Narrow"/>
-                <w:sz w:val="20"/>
-                <w:szCs w:val="20"/>
-                <w:lang w:val="ru-RU"/>
-              </w:rPr>
-              <w:t>к/с</w:t>
-            </w:r>
-            <w:r>
-              <w:rPr>
-                <w:rFonts w:ascii="Arial Narrow" w:eastAsia="Arial Narrow" w:hAnsi="Arial Narrow" w:cs="Arial Narrow"/>
-                <w:sz w:val="20"/>
-                <w:szCs w:val="20"/>
-                <w:lang w:val="ru-RU"/>
-              </w:rPr>
-              <w:t xml:space="preserve"> }</w:t>
+              <w:t>к/с 30101810200000000593</w:t>
             </w:r>
           </w:p>
           <w:p>
@@ -7059,34 +6878,7 @@
                 <w:szCs w:val="20"/>
                 <w:lang w:val="ru-RU"/>
               </w:rPr>
-              <w:t xml:space="preserve">БИК </w:t>
-            </w:r>
-            <w:r>
-              <w:rPr>
-                <w:rFonts w:ascii="Arial Narrow" w:eastAsia="Arial Narrow" w:hAnsi="Arial Narrow" w:cs="Arial Narrow"/>
-                <w:sz w:val="20"/>
-                <w:szCs w:val="20"/>
-                <w:lang w:val="ru-RU"/>
-              </w:rPr>
-              <w:t xml:space="preserve">{ </w:t>
-            </w:r>
-            <w:r>
-              <w:rPr>
-                <w:rFonts w:ascii="Arial Narrow" w:eastAsia="Arial Narrow" w:hAnsi="Arial Narrow" w:cs="Arial Narrow"/>
-                <w:sz w:val="20"/>
-                <w:szCs w:val="20"/>
-                <w:lang w:val="ru-RU"/>
-              </w:rPr>
-              <w:t>БИК</w:t>
-            </w:r>
-            <w:r>
-              <w:rPr>
-                <w:rFonts w:ascii="Arial Narrow" w:eastAsia="Arial Narrow" w:hAnsi="Arial Narrow" w:cs="Arial Narrow"/>
-                <w:sz w:val="20"/>
-                <w:szCs w:val="20"/>
-                <w:lang w:val="ru-RU"/>
-              </w:rPr>
-              <w:t xml:space="preserve"> }</w:t>
+              <w:t>БИК 044525593</w:t>
             </w:r>
             <w:r>
               <w:rPr>
@@ -7108,15 +6900,17 @@
                 <w:lang w:val="ru-RU"/>
               </w:rPr>
             </w:pPr>
-            <w:r>
+          </w:p>
+          <w:p>
+            <w:pPr>
+              <w:widowControl w:val="0"/>
               <w:rPr>
                 <w:rFonts w:ascii="Arial Narrow" w:eastAsia="Arial Narrow" w:hAnsi="Arial Narrow" w:cs="Arial Narrow"/>
                 <w:sz w:val="20"/>
                 <w:szCs w:val="20"/>
                 <w:lang w:val="ru-RU"/>
               </w:rPr>
-              <w:t xml:space="preserve">Адрес эл. почты: </w:t>
-            </w:r>
+            </w:pPr>
             <w:r>
               <w:rPr>
                 <w:rFonts w:ascii="Arial Narrow" w:eastAsia="Arial Narrow" w:hAnsi="Arial Narrow" w:cs="Arial Narrow"/>
@@ -7124,8 +6918,19 @@
                 <w:szCs w:val="20"/>
                 <w:lang w:val="ru-RU"/>
               </w:rPr>
-              <w:t>{</w:t>
+              <w:t xml:space="preserve">Адрес эл. почты: </w:t>
             </w:r>
+            <w:proofErr w:type="spellStart"/>
+            <w:r>
+              <w:rPr>
+                <w:rFonts w:ascii="Arial Narrow" w:eastAsia="Arial Narrow" w:hAnsi="Arial Narrow" w:cs="Arial Narrow"/>
+                <w:sz w:val="20"/>
+                <w:szCs w:val="20"/>
+                <w:lang w:val="en-US"/>
+              </w:rPr>
+              <w:t>anton</w:t>
+            </w:r>
+            <w:proofErr w:type="spellEnd"/>
             <w:r>
               <w:rPr>
                 <w:rFonts w:ascii="Arial Narrow" w:eastAsia="Arial Narrow" w:hAnsi="Arial Narrow" w:cs="Arial Narrow"/>
@@ -7133,7 +6938,7 @@
                 <w:szCs w:val="20"/>
                 <w:lang w:val="ru-RU"/>
               </w:rPr>
-              <w:t xml:space="preserve"> </w:t>
+              <w:t>@</w:t>
             </w:r>
             <w:r>
               <w:rPr>
@@ -7142,7 +6947,7 @@
                 <w:szCs w:val="20"/>
                 <w:lang w:val="en-US"/>
               </w:rPr>
-              <w:t>email</w:t>
+              <w:t>jet</w:t>
             </w:r>
             <w:r>
               <w:rPr>
@@ -7151,7 +6956,133 @@
                 <w:szCs w:val="20"/>
                 <w:lang w:val="ru-RU"/>
               </w:rPr>
-              <w:t xml:space="preserve"> }</w:t>
+              <w:t>-</w:t>
+            </w:r>
+            <w:r>
+              <w:rPr>
+                <w:rFonts w:ascii="Arial Narrow" w:eastAsia="Arial Narrow" w:hAnsi="Arial Narrow" w:cs="Arial Narrow"/>
+                <w:sz w:val="20"/>
+                <w:szCs w:val="20"/>
+                <w:lang w:val="en-US"/>
+              </w:rPr>
+              <w:t>partners</w:t>
+            </w:r>
+            <w:r>
+              <w:rPr>
+                <w:rFonts w:ascii="Arial Narrow" w:eastAsia="Arial Narrow" w:hAnsi="Arial Narrow" w:cs="Arial Narrow"/>
+                <w:sz w:val="20"/>
+                <w:szCs w:val="20"/>
+                <w:lang w:val="ru-RU"/>
+              </w:rPr>
+              <w:t>.</w:t>
+            </w:r>
+            <w:proofErr w:type="spellStart"/>
+            <w:r>
+              <w:rPr>
+                <w:rFonts w:ascii="Arial Narrow" w:eastAsia="Arial Narrow" w:hAnsi="Arial Narrow" w:cs="Arial Narrow"/>
+                <w:sz w:val="20"/>
+                <w:szCs w:val="20"/>
+                <w:lang w:val="en-US"/>
+              </w:rPr>
+              <w:t>ru</w:t>
+            </w:r>
+            <w:proofErr w:type="spellEnd"/>
+          </w:p>
+          <w:p>
+            <w:pPr>
+              <w:widowControl w:val="0"/>
+              <w:rPr>
+                <w:rFonts w:ascii="Arial Narrow" w:eastAsia="Arial Narrow" w:hAnsi="Arial Narrow" w:cs="Arial Narrow"/>
+                <w:sz w:val="20"/>
+                <w:szCs w:val="20"/>
+                <w:highlight w:val="yellow"/>
+                <w:lang w:val="ru-RU"/>
+              </w:rPr>
+            </w:pPr>
+            <w:r>
+              <w:rPr>
+                <w:rFonts w:ascii="Arial Narrow" w:eastAsia="Arial Narrow" w:hAnsi="Arial Narrow" w:cs="Arial Narrow"/>
+                <w:sz w:val="20"/>
+                <w:szCs w:val="20"/>
+                <w:lang w:val="ru-RU"/>
+              </w:rPr>
+              <w:t>Номер</w:t>
+            </w:r>
+            <w:r>
+              <w:rPr>
+                <w:rFonts w:ascii="Arial Narrow" w:eastAsia="Arial Narrow" w:hAnsi="Arial Narrow" w:cs="Arial Narrow"/>
+                <w:sz w:val="20"/>
+                <w:szCs w:val="20"/>
+                <w:lang w:val="ru-RU"/>
+              </w:rPr>
+              <w:t>/</w:t>
+            </w:r>
+            <w:proofErr w:type="spellStart"/>
+            <w:r>
+              <w:rPr>
+                <w:rFonts w:ascii="Arial Narrow" w:eastAsia="Arial Narrow" w:hAnsi="Arial Narrow" w:cs="Arial Narrow"/>
+                <w:sz w:val="20"/>
+                <w:szCs w:val="20"/>
+                <w:lang w:val="ru-RU"/>
+              </w:rPr>
+              <w:t>ра</w:t>
+            </w:r>
+            <w:proofErr w:type="spellEnd"/>
+            <w:r>
+              <w:rPr>
+                <w:rFonts w:ascii="Arial Narrow" w:eastAsia="Arial Narrow" w:hAnsi="Arial Narrow" w:cs="Arial Narrow"/>
+                <w:sz w:val="20"/>
+                <w:szCs w:val="20"/>
+                <w:lang w:val="ru-RU"/>
+              </w:rPr>
+              <w:t xml:space="preserve"> телефона</w:t>
+            </w:r>
+            <w:r>
+              <w:rPr>
+                <w:rFonts w:ascii="Arial Narrow" w:eastAsia="Arial Narrow" w:hAnsi="Arial Narrow" w:cs="Arial Narrow"/>
+                <w:sz w:val="20"/>
+                <w:szCs w:val="20"/>
+                <w:lang w:val="ru-RU"/>
+              </w:rPr>
+              <w:t>/</w:t>
+            </w:r>
+            <w:proofErr w:type="spellStart"/>
+            <w:r>
+              <w:rPr>
+                <w:rFonts w:ascii="Arial Narrow" w:eastAsia="Arial Narrow" w:hAnsi="Arial Narrow" w:cs="Arial Narrow"/>
+                <w:sz w:val="20"/>
+                <w:szCs w:val="20"/>
+                <w:lang w:val="ru-RU"/>
+              </w:rPr>
+              <w:t>ов</w:t>
+            </w:r>
+            <w:proofErr w:type="spellEnd"/>
+            <w:r>
+              <w:rPr>
+                <w:rFonts w:ascii="Arial Narrow" w:eastAsia="Arial Narrow" w:hAnsi="Arial Narrow" w:cs="Arial Narrow"/>
+                <w:sz w:val="20"/>
+                <w:szCs w:val="20"/>
+                <w:lang w:val="ru-RU"/>
+              </w:rPr>
+              <w:t xml:space="preserve"> для смс сообщений, аккаунта </w:t>
+            </w:r>
+            <w:r>
+              <w:rPr>
+                <w:rFonts w:ascii="Arial Narrow" w:eastAsia="Arial Narrow" w:hAnsi="Arial Narrow" w:cs="Arial Narrow"/>
+                <w:sz w:val="20"/>
+                <w:szCs w:val="20"/>
+                <w:lang w:val="en-US"/>
+              </w:rPr>
+              <w:t>WhatsApp</w:t>
+            </w:r>
+            <w:r>
+              <w:rPr>
+                <w:rFonts w:ascii="Arial Narrow" w:eastAsia="Arial Narrow" w:hAnsi="Arial Narrow" w:cs="Arial Narrow"/>
+                <w:sz w:val="20"/>
+                <w:szCs w:val="20"/>
+                <w:lang w:val="ru-RU"/>
+              </w:rPr>
+              <w:t>:</w:t>
             </w:r>
           </w:p>
           <w:p>
@@ -7161,7 +7092,7 @@
                 <w:rFonts w:ascii="Arial Narrow" w:eastAsia="Arial Narrow" w:hAnsi="Arial Narrow" w:cs="Arial Narrow"/>
                 <w:sz w:val="20"/>
                 <w:szCs w:val="20"/>
-                <w:lang w:val="ru-RU"/>
+                <w:lang w:val="en-US"/>
               </w:rPr>
             </w:pPr>
             <w:r>
@@ -7169,103 +7100,9 @@
                 <w:rFonts w:ascii="Arial Narrow" w:eastAsia="Arial Narrow" w:hAnsi="Arial Narrow" w:cs="Arial Narrow"/>
                 <w:sz w:val="20"/>
                 <w:szCs w:val="20"/>
-                <w:lang w:val="ru-RU"/>
-              </w:rPr>
-              <w:t>Номер</w:t>
-            </w:r>
-            <w:r>
-              <w:rPr>
-                <w:rFonts w:ascii="Arial Narrow" w:eastAsia="Arial Narrow" w:hAnsi="Arial Narrow" w:cs="Arial Narrow"/>
-                <w:sz w:val="20"/>
-                <w:szCs w:val="20"/>
-                <w:lang w:val="ru-RU"/>
-              </w:rPr>
-              <w:t>/</w:t>
-            </w:r>
-            <w:proofErr w:type="spellStart"/>
-            <w:r>
-              <w:rPr>
-                <w:rFonts w:ascii="Arial Narrow" w:eastAsia="Arial Narrow" w:hAnsi="Arial Narrow" w:cs="Arial Narrow"/>
-                <w:sz w:val="20"/>
-                <w:szCs w:val="20"/>
-                <w:lang w:val="ru-RU"/>
-              </w:rPr>
-              <w:t>ра</w:t>
-            </w:r>
-            <w:proofErr w:type="spellEnd"/>
-            <w:r>
-              <w:rPr>
-                <w:rFonts w:ascii="Arial Narrow" w:eastAsia="Arial Narrow" w:hAnsi="Arial Narrow" w:cs="Arial Narrow"/>
-                <w:sz w:val="20"/>
-                <w:szCs w:val="20"/>
-                <w:lang w:val="ru-RU"/>
-              </w:rPr>
-              <w:t xml:space="preserve"> телефона</w:t>
-            </w:r>
-            <w:r>
-              <w:rPr>
-                <w:rFonts w:ascii="Arial Narrow" w:eastAsia="Arial Narrow" w:hAnsi="Arial Narrow" w:cs="Arial Narrow"/>
-                <w:sz w:val="20"/>
-                <w:szCs w:val="20"/>
-                <w:lang w:val="ru-RU"/>
-              </w:rPr>
-              <w:t>/</w:t>
-            </w:r>
-            <w:proofErr w:type="spellStart"/>
-            <w:r>
-              <w:rPr>
-                <w:rFonts w:ascii="Arial Narrow" w:eastAsia="Arial Narrow" w:hAnsi="Arial Narrow" w:cs="Arial Narrow"/>
-                <w:sz w:val="20"/>
-                <w:szCs w:val="20"/>
-                <w:lang w:val="ru-RU"/>
-              </w:rPr>
-              <w:t>ов</w:t>
-            </w:r>
-            <w:proofErr w:type="spellEnd"/>
-            <w:r>
-              <w:rPr>
-                <w:rFonts w:ascii="Arial Narrow" w:eastAsia="Arial Narrow" w:hAnsi="Arial Narrow" w:cs="Arial Narrow"/>
-                <w:sz w:val="20"/>
-                <w:szCs w:val="20"/>
-                <w:lang w:val="ru-RU"/>
-              </w:rPr>
-              <w:t xml:space="preserve"> для смс сообщений</w:t>
-            </w:r>
-            <w:r>
-              <w:rPr>
-                <w:rFonts w:ascii="Arial Narrow" w:eastAsia="Arial Narrow" w:hAnsi="Arial Narrow" w:cs="Arial Narrow"/>
-                <w:sz w:val="20"/>
-                <w:szCs w:val="20"/>
-                <w:lang w:val="ru-RU"/>
-              </w:rPr>
-              <w:t xml:space="preserve">: </w:t>
-            </w:r>
-            <w:r>
-              <w:rPr>
-                <w:rFonts w:ascii="Arial Narrow" w:eastAsia="Arial Narrow" w:hAnsi="Arial Narrow" w:cs="Arial Narrow"/>
-                <w:sz w:val="20"/>
-                <w:szCs w:val="20"/>
-                <w:lang w:val="ru-RU"/>
-              </w:rPr>
-              <w:t xml:space="preserve">{ </w:t>
-            </w:r>
-            <w:r>
-              <w:rPr>
-                <w:rFonts w:ascii="Arial Narrow" w:eastAsia="Arial Narrow" w:hAnsi="Arial Narrow" w:cs="Arial Narrow"/>
-                <w:sz w:val="20"/>
-                <w:szCs w:val="20"/>
-                <w:lang w:val="ru-RU"/>
-              </w:rPr>
-              <w:t>Номер телефона</w:t>
-            </w:r>
-            <w:r>
-              <w:rPr>
-                <w:rFonts w:ascii="Arial Narrow" w:eastAsia="Arial Narrow" w:hAnsi="Arial Narrow" w:cs="Arial Narrow"/>
-                <w:sz w:val="20"/>
-                <w:szCs w:val="20"/>
-                <w:lang w:val="ru-RU"/>
-              </w:rPr>
-              <w:t xml:space="preserve"> }</w:t>
+                <w:lang w:val="en-US"/>
+              </w:rPr>
+              <w:t>+7 965 169-77-79</w:t>
             </w:r>
           </w:p>
           <w:p>
@@ -7298,7 +7135,7 @@
         </w:tc>
         <w:tc>
           <w:tcPr>
-            <w:tcW w:w="5103" w:type="dxa"/>
+            <w:tcW w:w="5040" w:type="dxa"/>
             <w:tcBorders>
               <w:top w:val="single" w:sz="4" w:space="0" w:color="000000"/>
               <w:left w:val="single" w:sz="4" w:space="0" w:color="000000"/>
@@ -7316,21 +7153,30 @@
           <w:p>
             <w:pPr>
               <w:rPr>
+                <w:rFonts w:ascii="Arial Narrow" w:eastAsia="Arial Narrow" w:hAnsi="Arial Narrow" w:cs="Arial Narrow"/>
+                <w:sz w:val="20"/>
+                <w:szCs w:val="20"/>
+              </w:rPr>
+            </w:pPr>
+            <w:r>
+              <w:rPr>
                 <w:rFonts w:ascii="Arial Narrow" w:hAnsi="Arial Narrow"/>
                 <w:sz w:val="20"/>
                 <w:szCs w:val="20"/>
                 <w:lang w:val="ru-RU"/>
               </w:rPr>
-            </w:pPr>
-            <w:r>
+              <w:t xml:space="preserve">      </w:t>
+            </w:r>
+          </w:p>
+          <w:p>
+            <w:pPr>
               <w:rPr>
                 <w:rFonts w:ascii="Arial Narrow" w:hAnsi="Arial Narrow"/>
                 <w:sz w:val="20"/>
                 <w:szCs w:val="20"/>
                 <w:lang w:val="ru-RU"/>
               </w:rPr>
-              <w:t>А</w:t>
-            </w:r>
+            </w:pPr>
             <w:r>
               <w:rPr>
                 <w:rFonts w:ascii="Arial Narrow" w:hAnsi="Arial Narrow"/>
@@ -7338,17 +7184,18 @@
                 <w:szCs w:val="20"/>
                 <w:lang w:val="ru-RU"/>
               </w:rPr>
-              <w:t>дрес</w:t>
+              <w:t xml:space="preserve">Юридический адрес: </w:t>
             </w:r>
-            <w:r>
+          </w:p>
+          <w:p>
+            <w:pPr>
               <w:rPr>
                 <w:rFonts w:ascii="Arial Narrow" w:hAnsi="Arial Narrow"/>
                 <w:sz w:val="20"/>
                 <w:szCs w:val="20"/>
                 <w:lang w:val="ru-RU"/>
               </w:rPr>
-              <w:t xml:space="preserve"> прописки</w:t>
-            </w:r>
+            </w:pPr>
             <w:r>
               <w:rPr>
                 <w:rFonts w:ascii="Arial Narrow" w:hAnsi="Arial Narrow"/>
@@ -7356,8 +7203,18 @@
                 <w:szCs w:val="20"/>
                 <w:lang w:val="ru-RU"/>
               </w:rPr>
-              <w:t>:</w:t>
+              <w:t xml:space="preserve">Фактический адрес: </w:t>
             </w:r>
+          </w:p>
+          <w:p>
+            <w:pPr>
+              <w:rPr>
+                <w:rFonts w:ascii="Arial Narrow" w:eastAsia="Arial Narrow" w:hAnsi="Arial Narrow" w:cs="Arial Narrow"/>
+                <w:sz w:val="20"/>
+                <w:szCs w:val="20"/>
+                <w:lang w:val="ru-RU"/>
+              </w:rPr>
+            </w:pPr>
             <w:r>
               <w:rPr>
                 <w:rFonts w:ascii="Arial Narrow" w:hAnsi="Arial Narrow"/>
@@ -7365,125 +7222,7 @@
                 <w:szCs w:val="20"/>
                 <w:lang w:val="ru-RU"/>
               </w:rPr>
-              <w:t xml:space="preserve"> </w:t>
-            </w:r>
-            <w:r>
-              <w:rPr>
-                <w:rFonts w:ascii="Arial Narrow" w:hAnsi="Arial Narrow"/>
-                <w:sz w:val="20"/>
-                <w:szCs w:val="20"/>
-                <w:lang w:val="ru-RU"/>
-              </w:rPr>
-              <w:t xml:space="preserve">{ </w:t>
-            </w:r>
-            <w:r>
-              <w:rPr>
-                <w:rFonts w:ascii="Arial Narrow" w:hAnsi="Arial Narrow"/>
-                <w:sz w:val="20"/>
-                <w:szCs w:val="20"/>
-                <w:lang w:val="ru-RU"/>
-              </w:rPr>
-              <w:t>А</w:t>
-            </w:r>
-            <w:r>
-              <w:rPr>
-                <w:rFonts w:ascii="Arial Narrow" w:hAnsi="Arial Narrow"/>
-                <w:sz w:val="20"/>
-                <w:szCs w:val="20"/>
-                <w:lang w:val="ru-RU"/>
-              </w:rPr>
-              <w:t>дрес</w:t>
-            </w:r>
-            <w:r>
-              <w:rPr>
-                <w:rFonts w:ascii="Arial Narrow" w:hAnsi="Arial Narrow"/>
-                <w:sz w:val="20"/>
-                <w:szCs w:val="20"/>
-                <w:lang w:val="ru-RU"/>
-              </w:rPr>
-              <w:t xml:space="preserve"> прописки</w:t>
-            </w:r>
-            <w:r>
-              <w:rPr>
-                <w:rFonts w:ascii="Arial Narrow" w:hAnsi="Arial Narrow"/>
-                <w:sz w:val="20"/>
-                <w:szCs w:val="20"/>
-                <w:lang w:val="ru-RU"/>
-              </w:rPr>
-              <w:t xml:space="preserve"> }</w:t>
-            </w:r>
-            <w:r>
-              <w:rPr>
-                <w:rFonts w:ascii="Arial Narrow" w:hAnsi="Arial Narrow"/>
-                <w:sz w:val="20"/>
-                <w:szCs w:val="20"/>
-                <w:lang w:val="ru-RU"/>
-              </w:rPr>
-              <w:t xml:space="preserve"> </w:t>
-            </w:r>
-          </w:p>
-          <w:p>
-            <w:pPr>
-              <w:rPr>
-                <w:rFonts w:ascii="Arial Narrow" w:hAnsi="Arial Narrow"/>
-                <w:sz w:val="20"/>
-                <w:szCs w:val="20"/>
-                <w:lang w:val="ru-RU"/>
-              </w:rPr>
-            </w:pPr>
-            <w:r>
-              <w:rPr>
-                <w:rFonts w:ascii="Arial Narrow" w:hAnsi="Arial Narrow"/>
-                <w:sz w:val="20"/>
-                <w:szCs w:val="20"/>
-                <w:lang w:val="ru-RU"/>
-              </w:rPr>
-              <w:t>Фактический адрес:</w:t>
-            </w:r>
-            <w:r>
-              <w:rPr>
-                <w:rFonts w:ascii="Arial Narrow" w:hAnsi="Arial Narrow"/>
-                <w:sz w:val="20"/>
-                <w:szCs w:val="20"/>
-                <w:lang w:val="ru-RU"/>
-              </w:rPr>
-              <w:t xml:space="preserve"> </w:t>
-            </w:r>
-            <w:r>
-              <w:rPr>
-                <w:rFonts w:ascii="Arial Narrow" w:hAnsi="Arial Narrow"/>
-                <w:sz w:val="20"/>
-                <w:szCs w:val="20"/>
-                <w:lang w:val="en-US"/>
-              </w:rPr>
-              <w:t xml:space="preserve">{ </w:t>
-            </w:r>
-            <w:r>
-              <w:rPr>
-                <w:rFonts w:ascii="Arial Narrow" w:hAnsi="Arial Narrow"/>
-                <w:sz w:val="20"/>
-                <w:szCs w:val="20"/>
-                <w:lang w:val="ru-RU"/>
-              </w:rPr>
-              <w:t>Фактический адрес</w:t>
-            </w:r>
-            <w:r>
-              <w:rPr>
-                <w:rFonts w:ascii="Arial Narrow" w:hAnsi="Arial Narrow"/>
-                <w:sz w:val="20"/>
-                <w:szCs w:val="20"/>
-                <w:lang w:val="en-US"/>
-              </w:rPr>
-              <w:t xml:space="preserve"> }</w:t>
-            </w:r>
-            <w:r>
-              <w:rPr>
-                <w:rFonts w:ascii="Arial Narrow" w:hAnsi="Arial Narrow"/>
-                <w:sz w:val="20"/>
-                <w:szCs w:val="20"/>
-                <w:lang w:val="ru-RU"/>
-              </w:rPr>
-              <w:t xml:space="preserve"> </w:t>
+              <w:t xml:space="preserve">Телефон: </w:t>
             </w:r>
           </w:p>
           <w:p>
@@ -7508,6 +7247,25 @@
           <w:p>
             <w:pPr>
               <w:rPr>
+                <w:rFonts w:ascii="Arial Narrow" w:hAnsi="Arial Narrow"/>
+                <w:sz w:val="20"/>
+                <w:szCs w:val="20"/>
+                <w:lang w:val="ru-RU"/>
+              </w:rPr>
+            </w:pPr>
+            <w:r>
+              <w:rPr>
+                <w:rFonts w:ascii="Arial Narrow" w:hAnsi="Arial Narrow"/>
+                <w:sz w:val="20"/>
+                <w:szCs w:val="20"/>
+                <w:lang w:val="ru-RU"/>
+              </w:rPr>
+              <w:t xml:space="preserve">КПП </w:t>
+            </w:r>
+          </w:p>
+          <w:p>
+            <w:pPr>
+              <w:rPr>
                 <w:rFonts w:ascii="Arial Narrow" w:eastAsia="Arial Narrow" w:hAnsi="Arial Narrow" w:cs="Arial Narrow"/>
                 <w:sz w:val="20"/>
                 <w:szCs w:val="20"/>
@@ -7526,11 +7284,28 @@
           <w:p>
             <w:pPr>
               <w:rPr>
+                <w:rFonts w:ascii="Arial Narrow" w:eastAsia="Arial Narrow" w:hAnsi="Arial Narrow" w:cs="Arial Narrow"/>
+                <w:sz w:val="20"/>
+                <w:szCs w:val="20"/>
+              </w:rPr>
+            </w:pPr>
+            <w:r>
+              <w:rPr>
                 <w:rFonts w:ascii="Arial Narrow" w:hAnsi="Arial Narrow"/>
                 <w:sz w:val="20"/>
                 <w:szCs w:val="20"/>
                 <w:lang w:val="ru-RU"/>
               </w:rPr>
+              <w:t xml:space="preserve">Р\с </w:t>
+            </w:r>
+          </w:p>
+          <w:p>
+            <w:pPr>
+              <w:rPr>
+                <w:rFonts w:ascii="Arial Narrow" w:eastAsia="Arial Narrow" w:hAnsi="Arial Narrow" w:cs="Arial Narrow"/>
+                <w:sz w:val="20"/>
+                <w:szCs w:val="20"/>
+              </w:rPr>
             </w:pPr>
             <w:r>
               <w:rPr>
@@ -7539,34 +7314,45 @@
                 <w:szCs w:val="20"/>
                 <w:lang w:val="ru-RU"/>
               </w:rPr>
-              <w:t xml:space="preserve">Банк </w:t>
+              <w:t xml:space="preserve">К\с </w:t>
             </w:r>
-            <w:r>
-              <w:rPr>
-                <w:rFonts w:ascii="Arial Narrow" w:eastAsia="Arial Narrow" w:hAnsi="Arial Narrow" w:cs="Arial Narrow"/>
+          </w:p>
+          <w:p>
+            <w:pPr>
+              <w:rPr>
+                <w:rFonts w:ascii="Arial Narrow" w:hAnsi="Arial Narrow"/>
                 <w:sz w:val="20"/>
                 <w:szCs w:val="20"/>
                 <w:lang w:val="ru-RU"/>
               </w:rPr>
-              <w:t xml:space="preserve">{ </w:t>
-            </w:r>
+            </w:pPr>
             <w:r>
               <w:rPr>
-                <w:rFonts w:ascii="Arial Narrow" w:eastAsia="Arial Narrow" w:hAnsi="Arial Narrow" w:cs="Arial Narrow"/>
+                <w:rFonts w:ascii="Arial Narrow" w:hAnsi="Arial Narrow"/>
                 <w:sz w:val="20"/>
                 <w:szCs w:val="20"/>
                 <w:lang w:val="ru-RU"/>
               </w:rPr>
-              <w:t>Название банка</w:t>
+              <w:t xml:space="preserve">Банк </w:t>
             </w:r>
-            <w:r>
-              <w:rPr>
-                <w:rFonts w:ascii="Arial Narrow" w:eastAsia="Arial Narrow" w:hAnsi="Arial Narrow" w:cs="Arial Narrow"/>
+          </w:p>
+          <w:p>
+            <w:pPr>
+              <w:rPr>
+                <w:rFonts w:ascii="Arial Narrow" w:hAnsi="Arial Narrow"/>
                 <w:sz w:val="20"/>
                 <w:szCs w:val="20"/>
                 <w:lang w:val="ru-RU"/>
               </w:rPr>
-              <w:t xml:space="preserve"> }</w:t>
+            </w:pPr>
+            <w:r>
+              <w:rPr>
+                <w:rFonts w:ascii="Arial Narrow" w:hAnsi="Arial Narrow"/>
+                <w:sz w:val="20"/>
+                <w:szCs w:val="20"/>
+                <w:lang w:val="ru-RU"/>
+              </w:rPr>
+              <w:t xml:space="preserve">БИК </w:t>
             </w:r>
           </w:p>
           <w:p>
@@ -7586,55 +7372,25 @@
                 <w:szCs w:val="20"/>
                 <w:lang w:val="ru-RU"/>
               </w:rPr>
-              <w:t xml:space="preserve">БИК </w:t>
-            </w:r>
-            <w:r>
-              <w:rPr>
-                <w:rFonts w:ascii="Arial Narrow" w:eastAsia="Arial Narrow" w:hAnsi="Arial Narrow" w:cs="Arial Narrow"/>
-                <w:sz w:val="20"/>
-                <w:szCs w:val="20"/>
-                <w:lang w:val="ru-RU"/>
-              </w:rPr>
-              <w:t xml:space="preserve">{ </w:t>
-            </w:r>
-            <w:r>
-              <w:rPr>
-                <w:rFonts w:ascii="Arial Narrow" w:eastAsia="Arial Narrow" w:hAnsi="Arial Narrow" w:cs="Arial Narrow"/>
-                <w:sz w:val="20"/>
-                <w:szCs w:val="20"/>
-                <w:lang w:val="ru-RU"/>
-              </w:rPr>
-              <w:t>БИК</w:t>
-            </w:r>
-            <w:r>
-              <w:rPr>
-                <w:rFonts w:ascii="Arial Narrow" w:eastAsia="Arial Narrow" w:hAnsi="Arial Narrow" w:cs="Arial Narrow"/>
-                <w:sz w:val="20"/>
-                <w:szCs w:val="20"/>
-                <w:lang w:val="ru-RU"/>
-              </w:rPr>
-              <w:t xml:space="preserve"> }</w:t>
-            </w:r>
-            <w:r>
-              <w:rPr>
-                <w:rFonts w:ascii="Arial Narrow" w:eastAsia="Arial Narrow" w:hAnsi="Arial Narrow" w:cs="Arial Narrow"/>
-                <w:sz w:val="20"/>
-                <w:szCs w:val="20"/>
-                <w:lang w:val="ru-RU"/>
-              </w:rPr>
-              <w:t> </w:t>
+              <w:t>Адрес эл. почты: _______________________________</w:t>
             </w:r>
           </w:p>
           <w:p>
             <w:pPr>
               <w:widowControl w:val="0"/>
               <w:rPr>
+                <w:lang w:val="ru-RU"/>
+              </w:rPr>
+            </w:pPr>
+            <w:r>
+              <w:rPr>
                 <w:rFonts w:ascii="Arial Narrow" w:eastAsia="Arial Narrow" w:hAnsi="Arial Narrow" w:cs="Arial Narrow"/>
                 <w:sz w:val="20"/>
                 <w:szCs w:val="20"/>
                 <w:lang w:val="ru-RU"/>
               </w:rPr>
-            </w:pPr>
+              <w:t>Номер</w:t>
+            </w:r>
             <w:r>
               <w:rPr>
                 <w:rFonts w:ascii="Arial Narrow" w:eastAsia="Arial Narrow" w:hAnsi="Arial Narrow" w:cs="Arial Narrow"/>
@@ -7642,8 +7398,9 @@
                 <w:szCs w:val="20"/>
                 <w:lang w:val="ru-RU"/>
               </w:rPr>
-              <w:t xml:space="preserve">Адрес эл. почты: </w:t>
+              <w:t>/</w:t>
             </w:r>
+            <w:proofErr w:type="spellStart"/>
             <w:r>
               <w:rPr>
                 <w:rFonts w:ascii="Arial Narrow" w:eastAsia="Arial Narrow" w:hAnsi="Arial Narrow" w:cs="Arial Narrow"/>
@@ -7651,7 +7408,46 @@
                 <w:szCs w:val="20"/>
                 <w:lang w:val="ru-RU"/>
               </w:rPr>
-              <w:t xml:space="preserve">{ </w:t>
+              <w:t>ра</w:t>
+            </w:r>
+            <w:proofErr w:type="spellEnd"/>
+            <w:r>
+              <w:rPr>
+                <w:rFonts w:ascii="Arial Narrow" w:eastAsia="Arial Narrow" w:hAnsi="Arial Narrow" w:cs="Arial Narrow"/>
+                <w:sz w:val="20"/>
+                <w:szCs w:val="20"/>
+                <w:lang w:val="ru-RU"/>
+              </w:rPr>
+              <w:t xml:space="preserve"> телефона</w:t>
+            </w:r>
+            <w:r>
+              <w:rPr>
+                <w:rFonts w:ascii="Arial Narrow" w:eastAsia="Arial Narrow" w:hAnsi="Arial Narrow" w:cs="Arial Narrow"/>
+                <w:sz w:val="20"/>
+                <w:szCs w:val="20"/>
+                <w:lang w:val="ru-RU"/>
+              </w:rPr>
+              <w:t>/</w:t>
+            </w:r>
+            <w:proofErr w:type="spellStart"/>
+            <w:r>
+              <w:rPr>
+                <w:rFonts w:ascii="Arial Narrow" w:eastAsia="Arial Narrow" w:hAnsi="Arial Narrow" w:cs="Arial Narrow"/>
+                <w:sz w:val="20"/>
+                <w:szCs w:val="20"/>
+                <w:lang w:val="ru-RU"/>
+              </w:rPr>
+              <w:t>ов</w:t>
+            </w:r>
+            <w:proofErr w:type="spellEnd"/>
+            <w:r>
+              <w:rPr>
+                <w:rFonts w:ascii="Arial Narrow" w:eastAsia="Arial Narrow" w:hAnsi="Arial Narrow" w:cs="Arial Narrow"/>
+                <w:sz w:val="20"/>
+                <w:szCs w:val="20"/>
+                <w:lang w:val="ru-RU"/>
+              </w:rPr>
+              <w:t xml:space="preserve"> для смс сообщений, аккаунта </w:t>
             </w:r>
             <w:r>
               <w:rPr>
@@ -7660,7 +7456,7 @@
                 <w:szCs w:val="20"/>
                 <w:lang w:val="en-US"/>
               </w:rPr>
-              <w:t>email</w:t>
+              <w:t>WhatsApp</w:t>
             </w:r>
             <w:r>
               <w:rPr>
@@ -7669,127 +7465,7 @@
                 <w:szCs w:val="20"/>
                 <w:lang w:val="ru-RU"/>
               </w:rPr>
-              <w:t xml:space="preserve"> }</w:t>
-            </w:r>
-          </w:p>
-          <w:p>
-            <w:pPr>
-              <w:widowControl w:val="0"/>
-              <w:rPr>
-                <w:lang w:val="ru-RU"/>
-              </w:rPr>
-            </w:pPr>
-            <w:r>
-              <w:rPr>
-                <w:rFonts w:ascii="Arial Narrow" w:eastAsia="Arial Narrow" w:hAnsi="Arial Narrow" w:cs="Arial Narrow"/>
-                <w:sz w:val="20"/>
-                <w:szCs w:val="20"/>
-                <w:lang w:val="ru-RU"/>
-              </w:rPr>
-              <w:t>Номер</w:t>
-            </w:r>
-            <w:r>
-              <w:rPr>
-                <w:rFonts w:ascii="Arial Narrow" w:eastAsia="Arial Narrow" w:hAnsi="Arial Narrow" w:cs="Arial Narrow"/>
-                <w:sz w:val="20"/>
-                <w:szCs w:val="20"/>
-                <w:lang w:val="ru-RU"/>
-              </w:rPr>
-              <w:t>/</w:t>
-            </w:r>
-            <w:proofErr w:type="spellStart"/>
-            <w:r>
-              <w:rPr>
-                <w:rFonts w:ascii="Arial Narrow" w:eastAsia="Arial Narrow" w:hAnsi="Arial Narrow" w:cs="Arial Narrow"/>
-                <w:sz w:val="20"/>
-                <w:szCs w:val="20"/>
-                <w:lang w:val="ru-RU"/>
-              </w:rPr>
-              <w:t>ра</w:t>
-            </w:r>
-            <w:proofErr w:type="spellEnd"/>
-            <w:r>
-              <w:rPr>
-                <w:rFonts w:ascii="Arial Narrow" w:eastAsia="Arial Narrow" w:hAnsi="Arial Narrow" w:cs="Arial Narrow"/>
-                <w:sz w:val="20"/>
-                <w:szCs w:val="20"/>
-                <w:lang w:val="ru-RU"/>
-              </w:rPr>
-              <w:t xml:space="preserve"> телефона</w:t>
-            </w:r>
-            <w:r>
-              <w:rPr>
-                <w:rFonts w:ascii="Arial Narrow" w:eastAsia="Arial Narrow" w:hAnsi="Arial Narrow" w:cs="Arial Narrow"/>
-                <w:sz w:val="20"/>
-                <w:szCs w:val="20"/>
-                <w:lang w:val="ru-RU"/>
-              </w:rPr>
-              <w:t>/</w:t>
-            </w:r>
-            <w:proofErr w:type="spellStart"/>
-            <w:r>
-              <w:rPr>
-                <w:rFonts w:ascii="Arial Narrow" w:eastAsia="Arial Narrow" w:hAnsi="Arial Narrow" w:cs="Arial Narrow"/>
-                <w:sz w:val="20"/>
-                <w:szCs w:val="20"/>
-                <w:lang w:val="ru-RU"/>
-              </w:rPr>
-              <w:t>ов</w:t>
-            </w:r>
-            <w:proofErr w:type="spellEnd"/>
-            <w:r>
-              <w:rPr>
-                <w:rFonts w:ascii="Arial Narrow" w:eastAsia="Arial Narrow" w:hAnsi="Arial Narrow" w:cs="Arial Narrow"/>
-                <w:sz w:val="20"/>
-                <w:szCs w:val="20"/>
-                <w:lang w:val="ru-RU"/>
-              </w:rPr>
-              <w:t xml:space="preserve"> для смс сообщений</w:t>
-            </w:r>
-            <w:r>
-              <w:rPr>
-                <w:rFonts w:ascii="Arial Narrow" w:eastAsia="Arial Narrow" w:hAnsi="Arial Narrow" w:cs="Arial Narrow"/>
-                <w:sz w:val="20"/>
-                <w:szCs w:val="20"/>
-                <w:lang w:val="ru-RU"/>
-              </w:rPr>
-              <w:t>:</w:t>
-            </w:r>
-            <w:r>
-              <w:rPr>
-                <w:rFonts w:ascii="Arial Narrow" w:eastAsia="Arial Narrow" w:hAnsi="Arial Narrow" w:cs="Arial Narrow"/>
-                <w:sz w:val="20"/>
-                <w:szCs w:val="20"/>
-                <w:lang w:val="ru-RU"/>
-              </w:rPr>
-              <w:t xml:space="preserve"> </w:t>
-            </w:r>
-            <w:r>
-              <w:rPr>
-                <w:rFonts w:ascii="Arial Narrow" w:eastAsia="Arial Narrow" w:hAnsi="Arial Narrow" w:cs="Arial Narrow"/>
-                <w:sz w:val="20"/>
-                <w:szCs w:val="20"/>
-                <w:lang w:val="ru-RU"/>
-              </w:rPr>
-              <w:t xml:space="preserve">{ </w:t>
-            </w:r>
-            <w:r>
-              <w:rPr>
-                <w:rFonts w:ascii="Arial Narrow" w:eastAsia="Arial Narrow" w:hAnsi="Arial Narrow" w:cs="Arial Narrow"/>
-                <w:sz w:val="20"/>
-                <w:szCs w:val="20"/>
-                <w:lang w:val="ru-RU"/>
-              </w:rPr>
-              <w:t>Номер телефона</w:t>
-            </w:r>
-            <w:r>
-              <w:rPr>
-                <w:rFonts w:ascii="Arial Narrow" w:eastAsia="Arial Narrow" w:hAnsi="Arial Narrow" w:cs="Arial Narrow"/>
-                <w:sz w:val="20"/>
-                <w:szCs w:val="20"/>
-                <w:lang w:val="ru-RU"/>
-              </w:rPr>
-              <w:t xml:space="preserve"> }</w:t>
+              <w:t>:____________________________________________ </w:t>
             </w:r>
           </w:p>
         </w:tc>
@@ -7878,6 +7554,16 @@
             <w:pPr>
               <w:pStyle w:val="a5"/>
               <w:rPr>
+                <w:rFonts w:ascii="Arial Narrow" w:eastAsia="Arial Narrow" w:hAnsi="Arial Narrow" w:cs="Arial Narrow"/>
+                <w:b/>
+                <w:bCs/>
+                <w:spacing w:val="-1"/>
+                <w:sz w:val="20"/>
+                <w:szCs w:val="20"/>
+              </w:rPr>
+            </w:pPr>
+            <w:r>
+              <w:rPr>
                 <w:rFonts w:ascii="Arial Narrow" w:hAnsi="Arial Narrow"/>
                 <w:b/>
                 <w:bCs/>
@@ -7885,6 +7571,173 @@
                 <w:szCs w:val="20"/>
                 <w:lang w:val="ru-RU"/>
               </w:rPr>
+              <w:t xml:space="preserve">Генеральный директор </w:t>
+            </w:r>
+            <w:r>
+              <w:rPr>
+                <w:rFonts w:ascii="Arial Narrow" w:hAnsi="Arial Narrow"/>
+                <w:b/>
+                <w:bCs/>
+                <w:spacing w:val="-1"/>
+                <w:sz w:val="20"/>
+                <w:szCs w:val="20"/>
+              </w:rPr>
+              <w:t xml:space="preserve">ООО </w:t>
+            </w:r>
+            <w:r>
+              <w:rPr>
+                <w:rFonts w:ascii="Arial Narrow" w:hAnsi="Arial Narrow"/>
+                <w:b/>
+                <w:bCs/>
+                <w:spacing w:val="-1"/>
+                <w:sz w:val="20"/>
+                <w:szCs w:val="20"/>
+                <w:lang w:val="ru-RU"/>
+              </w:rPr>
+              <w:t xml:space="preserve">«Джет </w:t>
+            </w:r>
+            <w:proofErr w:type="spellStart"/>
+            <w:r>
+              <w:rPr>
+                <w:rFonts w:ascii="Arial Narrow" w:hAnsi="Arial Narrow"/>
+                <w:b/>
+                <w:bCs/>
+                <w:spacing w:val="-1"/>
+                <w:sz w:val="20"/>
+                <w:szCs w:val="20"/>
+                <w:lang w:val="ru-RU"/>
+              </w:rPr>
+              <w:t>Партнерс</w:t>
+            </w:r>
+            <w:proofErr w:type="spellEnd"/>
+            <w:r>
+              <w:rPr>
+                <w:rFonts w:ascii="Arial Narrow" w:hAnsi="Arial Narrow"/>
+                <w:b/>
+                <w:bCs/>
+                <w:spacing w:val="-1"/>
+                <w:sz w:val="20"/>
+                <w:szCs w:val="20"/>
+                <w:lang w:val="ru-RU"/>
+              </w:rPr>
+              <w:t xml:space="preserve"> </w:t>
+            </w:r>
+            <w:proofErr w:type="spellStart"/>
+            <w:r>
+              <w:rPr>
+                <w:rFonts w:ascii="Arial Narrow" w:hAnsi="Arial Narrow"/>
+                <w:b/>
+                <w:bCs/>
+                <w:spacing w:val="-1"/>
+                <w:sz w:val="20"/>
+                <w:szCs w:val="20"/>
+                <w:lang w:val="ru-RU"/>
+              </w:rPr>
+              <w:t>Аэро</w:t>
+            </w:r>
+            <w:proofErr w:type="spellEnd"/>
+            <w:r>
+              <w:rPr>
+                <w:rFonts w:ascii="Arial Narrow" w:hAnsi="Arial Narrow"/>
+                <w:b/>
+                <w:bCs/>
+                <w:spacing w:val="-1"/>
+                <w:sz w:val="20"/>
+                <w:szCs w:val="20"/>
+                <w:lang w:val="ru-RU"/>
+              </w:rPr>
+              <w:t>»</w:t>
+            </w:r>
+          </w:p>
+          <w:p>
+            <w:pPr>
+              <w:pStyle w:val="a5"/>
+              <w:rPr>
+                <w:rFonts w:ascii="Arial Narrow" w:eastAsia="Arial Narrow" w:hAnsi="Arial Narrow" w:cs="Arial Narrow"/>
+                <w:b/>
+                <w:bCs/>
+                <w:spacing w:val="-1"/>
+                <w:sz w:val="20"/>
+                <w:szCs w:val="20"/>
+                <w:lang w:val="ru-RU"/>
+              </w:rPr>
+            </w:pPr>
+          </w:p>
+          <w:p>
+            <w:pPr>
+              <w:pStyle w:val="a5"/>
+              <w:rPr>
+                <w:rFonts w:ascii="Arial Narrow" w:eastAsia="Arial Narrow" w:hAnsi="Arial Narrow" w:cs="Arial Narrow"/>
+                <w:b/>
+                <w:bCs/>
+                <w:sz w:val="20"/>
+                <w:szCs w:val="20"/>
+                <w:lang w:val="ru-RU"/>
+              </w:rPr>
+            </w:pPr>
+          </w:p>
+          <w:p>
+            <w:pPr>
+              <w:pStyle w:val="a5"/>
+              <w:rPr>
+                <w:rFonts w:ascii="Arial Narrow" w:eastAsia="Arial Narrow" w:hAnsi="Arial Narrow" w:cs="Arial Narrow"/>
+                <w:b/>
+                <w:bCs/>
+                <w:sz w:val="20"/>
+                <w:szCs w:val="20"/>
+                <w:lang w:val="ru-RU"/>
+              </w:rPr>
+            </w:pPr>
+          </w:p>
+          <w:p>
+            <w:pPr>
+              <w:pStyle w:val="a5"/>
+              <w:rPr>
+                <w:rFonts w:ascii="Arial Narrow" w:eastAsia="Arial Narrow" w:hAnsi="Arial Narrow" w:cs="Arial Narrow"/>
+                <w:b/>
+                <w:bCs/>
+                <w:sz w:val="20"/>
+                <w:szCs w:val="20"/>
+                <w:lang w:val="ru-RU"/>
+              </w:rPr>
+            </w:pPr>
+          </w:p>
+          <w:p>
+            <w:pPr>
+              <w:pStyle w:val="a5"/>
+              <w:rPr>
+                <w:rFonts w:ascii="Arial Narrow" w:eastAsia="Arial Narrow" w:hAnsi="Arial Narrow" w:cs="Arial Narrow"/>
+                <w:b/>
+                <w:bCs/>
+                <w:sz w:val="20"/>
+                <w:szCs w:val="20"/>
+                <w:lang w:val="ru-RU"/>
+              </w:rPr>
+            </w:pPr>
+          </w:p>
+          <w:p>
+            <w:pPr>
+              <w:pStyle w:val="a5"/>
+              <w:rPr>
+                <w:rFonts w:ascii="Arial Narrow" w:eastAsia="Arial Narrow" w:hAnsi="Arial Narrow" w:cs="Arial Narrow"/>
+                <w:b/>
+                <w:bCs/>
+                <w:sz w:val="20"/>
+                <w:szCs w:val="20"/>
+                <w:lang w:val="ru-RU"/>
+              </w:rPr>
+            </w:pPr>
+          </w:p>
+          <w:p>
+            <w:pPr>
+              <w:pStyle w:val="a5"/>
+              <w:rPr>
+                <w:rFonts w:ascii="Arial Narrow" w:eastAsia="Arial Narrow" w:hAnsi="Arial Narrow" w:cs="Arial Narrow"/>
+                <w:b/>
+                <w:bCs/>
+                <w:sz w:val="20"/>
+                <w:szCs w:val="20"/>
+              </w:rPr>
             </w:pPr>
             <w:r>
               <w:rPr>
@@ -7895,9 +7748,11 @@
                 <w:szCs w:val="20"/>
                 <w:lang w:val="ru-RU"/>
               </w:rPr>
-              <w:t xml:space="preserve">{ </w:t>
+              <w:t>___________________________ /</w:t>
             </w:r>
-            <w:proofErr w:type="spellStart"/>
+            <w:r>
+              <w:t xml:space="preserve"> </w:t>
+            </w:r>
             <w:r>
               <w:rPr>
                 <w:rFonts w:ascii="Arial Narrow" w:hAnsi="Arial Narrow"/>
@@ -7907,9 +7762,8 @@
                 <w:szCs w:val="20"/>
                 <w:lang w:val="ru-RU"/>
               </w:rPr>
-              <w:t>Полное</w:t>
+              <w:t>Ломакин А</w:t>
             </w:r>
-            <w:proofErr w:type="spellEnd"/>
             <w:r>
               <w:rPr>
                 <w:rFonts w:ascii="Arial Narrow" w:hAnsi="Arial Narrow"/>
@@ -7919,231 +7773,7 @@
                 <w:szCs w:val="20"/>
                 <w:lang w:val="ru-RU"/>
               </w:rPr>
-              <w:t xml:space="preserve"> </w:t>
-            </w:r>
-            <w:proofErr w:type="spellStart"/>
-            <w:r>
-              <w:rPr>
-                <w:rFonts w:ascii="Arial Narrow" w:hAnsi="Arial Narrow"/>
-                <w:b/>
-                <w:bCs/>
-                <w:sz w:val="20"/>
-                <w:szCs w:val="20"/>
-                <w:lang w:val="ru-RU"/>
-              </w:rPr>
-              <w:t>наименование</w:t>
-            </w:r>
-            <w:proofErr w:type="spellEnd"/>
-            <w:r>
-              <w:rPr>
-                <w:rFonts w:ascii="Arial Narrow" w:hAnsi="Arial Narrow"/>
-                <w:b/>
-                <w:bCs/>
-                <w:sz w:val="20"/>
-                <w:szCs w:val="20"/>
-                <w:lang w:val="ru-RU"/>
-              </w:rPr>
-              <w:t xml:space="preserve"> </w:t>
-            </w:r>
-            <w:proofErr w:type="spellStart"/>
-            <w:r>
-              <w:rPr>
-                <w:rFonts w:ascii="Arial Narrow" w:hAnsi="Arial Narrow"/>
-                <w:b/>
-                <w:bCs/>
-                <w:sz w:val="20"/>
-                <w:szCs w:val="20"/>
-                <w:lang w:val="ru-RU"/>
-              </w:rPr>
-              <w:t>организации</w:t>
-            </w:r>
-            <w:proofErr w:type="spellEnd"/>
-            <w:r>
-              <w:rPr>
-                <w:rFonts w:ascii="Arial Narrow" w:hAnsi="Arial Narrow"/>
-                <w:b/>
-                <w:bCs/>
-                <w:sz w:val="20"/>
-                <w:szCs w:val="20"/>
-                <w:lang w:val="ru-RU"/>
-              </w:rPr>
-              <w:t xml:space="preserve"> } </w:t>
-            </w:r>
-          </w:p>
-          <w:p>
-            <w:pPr>
-              <w:pStyle w:val="a5"/>
-              <w:rPr>
-                <w:rFonts w:ascii="Arial Narrow" w:eastAsia="Arial Narrow" w:hAnsi="Arial Narrow" w:cs="Arial Narrow"/>
-                <w:b/>
-                <w:bCs/>
-                <w:sz w:val="20"/>
-                <w:szCs w:val="20"/>
-                <w:lang w:val="ru-RU"/>
-              </w:rPr>
-            </w:pPr>
-          </w:p>
-          <w:p>
-            <w:pPr>
-              <w:pStyle w:val="a5"/>
-              <w:rPr>
-                <w:rFonts w:ascii="Arial Narrow" w:eastAsia="Arial Narrow" w:hAnsi="Arial Narrow" w:cs="Arial Narrow"/>
-                <w:b/>
-                <w:bCs/>
-                <w:sz w:val="20"/>
-                <w:szCs w:val="20"/>
-                <w:lang w:val="ru-RU"/>
-              </w:rPr>
-            </w:pPr>
-          </w:p>
-          <w:p>
-            <w:pPr>
-              <w:pStyle w:val="a5"/>
-              <w:rPr>
-                <w:rFonts w:ascii="Arial Narrow" w:eastAsia="Arial Narrow" w:hAnsi="Arial Narrow" w:cs="Arial Narrow"/>
-                <w:b/>
-                <w:bCs/>
-                <w:sz w:val="20"/>
-                <w:szCs w:val="20"/>
-                <w:lang w:val="ru-RU"/>
-              </w:rPr>
-            </w:pPr>
-          </w:p>
-          <w:p>
-            <w:pPr>
-              <w:pStyle w:val="a5"/>
-              <w:rPr>
-                <w:rFonts w:ascii="Arial Narrow" w:eastAsia="Arial Narrow" w:hAnsi="Arial Narrow" w:cs="Arial Narrow"/>
-                <w:b/>
-                <w:bCs/>
-                <w:sz w:val="20"/>
-                <w:szCs w:val="20"/>
-                <w:lang w:val="ru-RU"/>
-              </w:rPr>
-            </w:pPr>
-          </w:p>
-          <w:p>
-            <w:pPr>
-              <w:pStyle w:val="a5"/>
-              <w:rPr>
-                <w:rFonts w:ascii="Arial Narrow" w:eastAsia="Arial Narrow" w:hAnsi="Arial Narrow" w:cs="Arial Narrow"/>
-                <w:b/>
-                <w:bCs/>
-                <w:sz w:val="20"/>
-                <w:szCs w:val="20"/>
-                <w:lang w:val="ru-RU"/>
-              </w:rPr>
-            </w:pPr>
-          </w:p>
-          <w:p>
-            <w:pPr>
-              <w:pStyle w:val="a5"/>
-              <w:rPr>
-                <w:rFonts w:ascii="Arial Narrow" w:eastAsia="Arial Narrow" w:hAnsi="Arial Narrow" w:cs="Arial Narrow"/>
-                <w:b/>
-                <w:bCs/>
-                <w:sz w:val="20"/>
-                <w:szCs w:val="20"/>
-              </w:rPr>
-            </w:pPr>
-            <w:r>
-              <w:rPr>
-                <w:rFonts w:ascii="Arial Narrow" w:hAnsi="Arial Narrow"/>
-                <w:b/>
-                <w:bCs/>
-                <w:sz w:val="20"/>
-                <w:szCs w:val="20"/>
-                <w:lang w:val="ru-RU"/>
-              </w:rPr>
-              <w:t>___________________________ /</w:t>
-            </w:r>
-            <w:r>
-              <w:t xml:space="preserve"> </w:t>
-            </w:r>
-            <w:r>
-              <w:rPr>
-                <w:rFonts w:ascii="Arial Narrow" w:eastAsia="Arial Narrow" w:hAnsi="Arial Narrow" w:cs="Arial Narrow"/>
-                <w:b/>
-                <w:sz w:val="20"/>
-                <w:szCs w:val="20"/>
-                <w:lang w:val="ru-RU"/>
-              </w:rPr>
-              <w:t xml:space="preserve">{ </w:t>
-            </w:r>
-            <w:proofErr w:type="spellStart"/>
-            <w:r>
-              <w:rPr>
-                <w:rFonts w:ascii="Arial Narrow" w:eastAsia="Arial Narrow" w:hAnsi="Arial Narrow" w:cs="Arial Narrow"/>
-                <w:b/>
-                <w:sz w:val="20"/>
-                <w:szCs w:val="20"/>
-                <w:lang w:val="ru-RU"/>
-              </w:rPr>
-              <w:t>фио</w:t>
-            </w:r>
-            <w:proofErr w:type="spellEnd"/>
-            <w:r>
-              <w:rPr>
-                <w:rFonts w:ascii="Arial Narrow" w:eastAsia="Arial Narrow" w:hAnsi="Arial Narrow" w:cs="Arial Narrow"/>
-                <w:b/>
-                <w:sz w:val="20"/>
-                <w:szCs w:val="20"/>
-                <w:lang w:val="ru-RU"/>
-              </w:rPr>
-              <w:t xml:space="preserve"> ген. </w:t>
-            </w:r>
-            <w:proofErr w:type="spellStart"/>
-            <w:r>
-              <w:rPr>
-                <w:rFonts w:ascii="Arial Narrow" w:eastAsia="Arial Narrow" w:hAnsi="Arial Narrow" w:cs="Arial Narrow"/>
-                <w:b/>
-                <w:sz w:val="20"/>
-                <w:szCs w:val="20"/>
-                <w:lang w:val="ru-RU"/>
-              </w:rPr>
-              <w:t>дир</w:t>
-            </w:r>
-            <w:proofErr w:type="spellEnd"/>
-            <w:r>
-              <w:rPr>
-                <w:rFonts w:ascii="Arial Narrow" w:eastAsia="Arial Narrow" w:hAnsi="Arial Narrow" w:cs="Arial Narrow"/>
-                <w:b/>
-                <w:sz w:val="20"/>
-                <w:szCs w:val="20"/>
-                <w:lang w:val="ru-RU"/>
-              </w:rPr>
-              <w:t xml:space="preserve">. </w:t>
-            </w:r>
-            <w:r>
-              <w:rPr>
-                <w:rFonts w:ascii="Arial Narrow" w:eastAsia="Arial Narrow" w:hAnsi="Arial Narrow" w:cs="Arial Narrow"/>
-                <w:b/>
-                <w:sz w:val="20"/>
-                <w:szCs w:val="20"/>
-                <w:lang w:val="ru-RU"/>
-              </w:rPr>
-              <w:t>}</w:t>
-            </w:r>
-            <w:r>
-              <w:rPr>
-                <w:rFonts w:ascii="Arial Narrow" w:eastAsia="Arial Narrow" w:hAnsi="Arial Narrow" w:cs="Arial Narrow"/>
-                <w:b/>
-                <w:sz w:val="20"/>
-                <w:szCs w:val="20"/>
-                <w:lang w:val="ru-RU"/>
-              </w:rPr>
-              <w:t xml:space="preserve"> </w:t>
-            </w:r>
-            <w:r>
-              <w:rPr>
-                <w:rFonts w:ascii="Arial Narrow" w:hAnsi="Arial Narrow"/>
-                <w:b/>
-                <w:bCs/>
-                <w:sz w:val="20"/>
-                <w:szCs w:val="20"/>
-                <w:lang w:val="ru-RU"/>
-              </w:rPr>
-              <w:t>/</w:t>
+              <w:t>.В./</w:t>
             </w:r>
           </w:p>
           <w:p>
@@ -8212,18 +7842,6 @@
                 <w:szCs w:val="20"/>
               </w:rPr>
             </w:pPr>
-            <w:proofErr w:type="gramStart"/>
-            <w:r>
-              <w:rPr>
-                <w:rFonts w:ascii="Arial Narrow" w:hAnsi="Arial Narrow"/>
-                <w:b/>
-                <w:bCs/>
-                <w:sz w:val="20"/>
-                <w:szCs w:val="20"/>
-              </w:rPr>
-              <w:t xml:space="preserve">{ </w:t>
-            </w:r>
-            <w:proofErr w:type="spellStart"/>
             <w:r>
               <w:rPr>
                 <w:rFonts w:ascii="Arial Narrow" w:hAnsi="Arial Narrow"/>
@@ -8233,19 +7851,7 @@
                 <w:szCs w:val="20"/>
                 <w:lang w:val="ru-RU"/>
               </w:rPr>
-              <w:t>фио</w:t>
-            </w:r>
-            <w:proofErr w:type="spellEnd"/>
-            <w:proofErr w:type="gramEnd"/>
-            <w:r>
-              <w:rPr>
-                <w:rFonts w:ascii="Arial Narrow" w:hAnsi="Arial Narrow"/>
-                <w:b/>
-                <w:bCs/>
-                <w:sz w:val="20"/>
-                <w:szCs w:val="20"/>
-              </w:rPr>
-              <w:t xml:space="preserve"> }</w:t>
+              <w:t>_____________________________________________</w:t>
             </w:r>
           </w:p>
           <w:p>
@@ -8256,6 +7862,7 @@
                 <w:bCs/>
                 <w:sz w:val="20"/>
                 <w:szCs w:val="20"/>
+                <w:lang w:val="ru-RU"/>
               </w:rPr>
             </w:pPr>
           </w:p>
@@ -8267,6 +7874,7 @@
                 <w:bCs/>
                 <w:sz w:val="20"/>
                 <w:szCs w:val="20"/>
+                <w:lang w:val="ru-RU"/>
               </w:rPr>
             </w:pPr>
           </w:p>
@@ -8278,6 +7886,7 @@
                 <w:bCs/>
                 <w:sz w:val="20"/>
                 <w:szCs w:val="20"/>
+                <w:lang w:val="ru-RU"/>
               </w:rPr>
             </w:pPr>
           </w:p>
@@ -8289,6 +7898,7 @@
                 <w:bCs/>
                 <w:sz w:val="20"/>
                 <w:szCs w:val="20"/>
+                <w:lang w:val="ru-RU"/>
               </w:rPr>
             </w:pPr>
           </w:p>
@@ -8300,6 +7910,7 @@
                 <w:bCs/>
                 <w:sz w:val="20"/>
                 <w:szCs w:val="20"/>
+                <w:lang w:val="ru-RU"/>
               </w:rPr>
             </w:pPr>
           </w:p>
@@ -8311,6 +7922,7 @@
                 <w:bCs/>
                 <w:sz w:val="20"/>
                 <w:szCs w:val="20"/>
+                <w:lang w:val="ru-RU"/>
               </w:rPr>
             </w:pPr>
           </w:p>
@@ -8324,37 +7936,6 @@
                 <w:szCs w:val="20"/>
               </w:rPr>
             </w:pPr>
-            <w:r>
-              <w:rPr>
-                <w:rFonts w:ascii="Arial Narrow" w:hAnsi="Arial Narrow"/>
-                <w:b/>
-                <w:bCs/>
-                <w:sz w:val="20"/>
-                <w:szCs w:val="20"/>
-              </w:rPr>
-              <w:t xml:space="preserve">___________________________ / </w:t>
-            </w:r>
-            <w:proofErr w:type="gramStart"/>
-            <w:r>
-              <w:rPr>
-                <w:rFonts w:ascii="Arial Narrow" w:hAnsi="Arial Narrow"/>
-                <w:b/>
-                <w:bCs/>
-                <w:sz w:val="20"/>
-                <w:szCs w:val="20"/>
-              </w:rPr>
-              <w:t>{</w:t>
-            </w:r>
-            <w:r>
-              <w:rPr>
-                <w:rFonts w:ascii="Arial Narrow" w:hAnsi="Arial Narrow"/>
-                <w:b/>
-                <w:bCs/>
-                <w:sz w:val="20"/>
-                <w:szCs w:val="20"/>
-              </w:rPr>
-              <w:t xml:space="preserve"> </w:t>
-            </w:r>
             <w:r>
               <w:rPr>
                 <w:rFonts w:ascii="Arial Narrow" w:hAnsi="Arial Narrow"/>
@@ -8364,41 +7945,8 @@
                 <w:szCs w:val="20"/>
                 <w:lang w:val="ru-RU"/>
               </w:rPr>
-              <w:t>Инициалы</w:t>
+              <w:t xml:space="preserve">___________________________ / </w:t>
             </w:r>
-            <w:proofErr w:type="gramEnd"/>
-            <w:r>
-              <w:rPr>
-                <w:rFonts w:ascii="Arial Narrow" w:hAnsi="Arial Narrow"/>
-                <w:b/>
-                <w:bCs/>
-                <w:sz w:val="20"/>
-                <w:szCs w:val="20"/>
-              </w:rPr>
-              <w:t xml:space="preserve"> </w:t>
-            </w:r>
-            <w:r>
-              <w:rPr>
-                <w:rFonts w:ascii="Arial Narrow" w:hAnsi="Arial Narrow"/>
-                <w:b/>
-                <w:bCs/>
-                <w:sz w:val="20"/>
-                <w:szCs w:val="20"/>
-              </w:rPr>
-              <w:t>}</w:t>
-            </w:r>
-            <w:r>
-              <w:rPr>
-                <w:rFonts w:ascii="Arial Narrow" w:hAnsi="Arial Narrow"/>
-                <w:b/>
-                <w:bCs/>
-                <w:sz w:val="20"/>
-                <w:szCs w:val="20"/>
-              </w:rPr>
-              <w:t xml:space="preserve"> /</w:t>
-            </w:r>
-          </w:p>
-          <w:p>
             <w:r>
               <w:rPr>
                 <w:rFonts w:ascii="Arial Narrow" w:hAnsi="Arial Narrow"/>
@@ -8408,17 +7956,7 @@
                 <w:szCs w:val="20"/>
                 <w:lang w:val="ru-RU"/>
               </w:rPr>
-              <w:t>М</w:t>
-            </w:r>
-            <w:r>
-              <w:rPr>
-                <w:rFonts w:ascii="Arial Narrow" w:hAnsi="Arial Narrow"/>
-                <w:b/>
-                <w:bCs/>
-                <w:sz w:val="20"/>
-                <w:szCs w:val="20"/>
-              </w:rPr>
-              <w:t>.</w:t>
+              <w:t>______________________</w:t>
             </w:r>
             <w:r>
               <w:rPr>
@@ -8429,8 +7967,10 @@
                 <w:szCs w:val="20"/>
                 <w:lang w:val="ru-RU"/>
               </w:rPr>
-              <w:t>П</w:t>
+              <w:t xml:space="preserve"> /</w:t>
             </w:r>
+          </w:p>
+          <w:p>
             <w:r>
               <w:rPr>
                 <w:rFonts w:ascii="Arial Narrow" w:hAnsi="Arial Narrow"/>
@@ -8438,8 +7978,9 @@
                 <w:bCs/>
                 <w:sz w:val="20"/>
                 <w:szCs w:val="20"/>
-              </w:rPr>
-              <w:t>.</w:t>
+                <w:lang w:val="ru-RU"/>
+              </w:rPr>
+              <w:t>М.П.</w:t>
             </w:r>
             <w:r>
               <w:rPr>
@@ -8448,6 +7989,7 @@
                 <w:bCs/>
                 <w:sz w:val="20"/>
                 <w:szCs w:val="20"/>
+                <w:lang w:val="ru-RU"/>
               </w:rPr>
               <w:tab/>
             </w:r>
@@ -8463,7 +8005,6 @@
           <w:rFonts w:ascii="Arial Narrow" w:hAnsi="Arial Narrow"/>
           <w:b/>
           <w:bCs/>
-          <w:lang w:val="de-DE"/>
         </w:rPr>
       </w:pPr>
     </w:p>
@@ -8475,7 +8016,6 @@
           <w:rFonts w:ascii="Arial Narrow" w:hAnsi="Arial Narrow"/>
           <w:b/>
           <w:bCs/>
-          <w:lang w:val="de-DE"/>
         </w:rPr>
       </w:pPr>
     </w:p>
@@ -8487,7 +8027,6 @@
           <w:rFonts w:ascii="Arial Narrow" w:hAnsi="Arial Narrow"/>
           <w:b/>
           <w:bCs/>
-          <w:lang w:val="de-DE"/>
         </w:rPr>
       </w:pPr>
     </w:p>
@@ -8507,6 +8046,7 @@
           <w:b/>
           <w:bCs/>
         </w:rPr>
+        <w:lastRenderedPageBreak/>
         <w:t>ПРИЛОЖЕНИЕ к</w:t>
       </w:r>
       <w:r>
@@ -8556,236 +8096,85 @@
           <w:b/>
           <w:bCs/>
         </w:rPr>
-        <w:t>{</w:t>
-      </w:r>
-      <w:r>
-        <w:rPr>
-          <w:rFonts w:ascii="Arial Narrow" w:hAnsi="Arial Narrow"/>
+        <w:t>________ от «____»_____________202__г.</w:t>
+      </w:r>
+    </w:p>
+    <w:p>
+      <w:pPr>
+        <w:pStyle w:val="20"/>
+        <w:jc w:val="center"/>
+        <w:rPr>
+          <w:rFonts w:ascii="Arial Narrow" w:eastAsia="Arial Narrow" w:hAnsi="Arial Narrow" w:cs="Arial Narrow"/>
+          <w:i w:val="0"/>
+          <w:iCs w:val="0"/>
+          <w:sz w:val="20"/>
+          <w:szCs w:val="20"/>
+          <w:lang w:val="ru-RU"/>
+        </w:rPr>
+      </w:pPr>
+      <w:r>
+        <w:rPr>
+          <w:rFonts w:ascii="Arial Narrow" w:hAnsi="Arial Narrow"/>
+          <w:i w:val="0"/>
+          <w:iCs w:val="0"/>
+          <w:sz w:val="20"/>
+          <w:szCs w:val="20"/>
+          <w:lang w:val="ru-RU"/>
+        </w:rPr>
+        <w:t xml:space="preserve">ЗАКАЗ № </w:t>
+      </w:r>
+      <w:r>
+        <w:rPr>
+          <w:rFonts w:ascii="Arial Narrow" w:hAnsi="Arial Narrow"/>
+          <w:i w:val="0"/>
+          <w:iCs w:val="0"/>
+          <w:sz w:val="20"/>
+          <w:szCs w:val="20"/>
+          <w:lang w:val="ru-RU"/>
+        </w:rPr>
+        <w:t>______</w:t>
+      </w:r>
+    </w:p>
+    <w:p>
+      <w:pPr>
+        <w:pStyle w:val="11"/>
+        <w:ind w:firstLine="0"/>
+        <w:rPr>
+          <w:rFonts w:ascii="Arial Narrow" w:eastAsia="Arial Narrow" w:hAnsi="Arial Narrow" w:cs="Arial Narrow"/>
           <w:b/>
           <w:bCs/>
         </w:rPr>
-        <w:t xml:space="preserve"> Номер приложения к договору </w:t>
-      </w:r>
+      </w:pPr>
       <w:r>
         <w:rPr>
           <w:rFonts w:ascii="Arial Narrow" w:hAnsi="Arial Narrow"/>
           <w:b/>
           <w:bCs/>
         </w:rPr>
-        <w:t>}</w:t>
-      </w:r>
-      <w:r>
-        <w:rPr>
-          <w:rFonts w:ascii="Arial Narrow" w:hAnsi="Arial Narrow"/>
+        <w:t>на предоставление услуг</w:t>
+      </w:r>
+    </w:p>
+    <w:p>
+      <w:pPr>
+        <w:pStyle w:val="11"/>
+        <w:ind w:firstLine="0"/>
+        <w:rPr>
+          <w:rFonts w:ascii="Arial Narrow" w:eastAsia="Arial Narrow" w:hAnsi="Arial Narrow" w:cs="Arial Narrow"/>
           <w:b/>
           <w:bCs/>
         </w:rPr>
-        <w:t xml:space="preserve"> от «</w:t>
-      </w:r>
+      </w:pPr>
       <w:r>
         <w:rPr>
           <w:rFonts w:ascii="Arial Narrow" w:hAnsi="Arial Narrow"/>
           <w:b/>
           <w:bCs/>
         </w:rPr>
-        <w:t>{</w:t>
-      </w:r>
-      <w:r>
-        <w:rPr>
-          <w:rFonts w:ascii="Arial Narrow" w:hAnsi="Arial Narrow"/>
-          <w:b/>
-          <w:bCs/>
-        </w:rPr>
-        <w:t xml:space="preserve"> день </w:t>
-      </w:r>
-      <w:r>
-        <w:rPr>
-          <w:rFonts w:ascii="Arial Narrow" w:hAnsi="Arial Narrow"/>
-          <w:b/>
-          <w:bCs/>
-        </w:rPr>
-        <w:t>}</w:t>
-      </w:r>
-      <w:r>
-        <w:rPr>
-          <w:rFonts w:ascii="Arial Narrow" w:hAnsi="Arial Narrow"/>
-          <w:b/>
-          <w:bCs/>
-        </w:rPr>
-        <w:t>»</w:t>
-      </w:r>
-      <w:r>
-        <w:rPr>
-          <w:rFonts w:ascii="Arial Narrow" w:hAnsi="Arial Narrow"/>
-          <w:b/>
-          <w:bCs/>
-        </w:rPr>
-        <w:t xml:space="preserve"> </w:t>
-      </w:r>
-      <w:r>
-        <w:rPr>
-          <w:rFonts w:ascii="Arial Narrow" w:hAnsi="Arial Narrow"/>
-          <w:b/>
-          <w:bCs/>
-        </w:rPr>
-        <w:t xml:space="preserve">{ </w:t>
-      </w:r>
-      <w:r>
-        <w:rPr>
-          <w:rFonts w:ascii="Arial Narrow" w:hAnsi="Arial Narrow"/>
-          <w:b/>
-          <w:bCs/>
-        </w:rPr>
-        <w:t>месяц</w:t>
-      </w:r>
-      <w:r>
-        <w:rPr>
-          <w:rFonts w:ascii="Arial Narrow" w:hAnsi="Arial Narrow"/>
-          <w:b/>
-          <w:bCs/>
-        </w:rPr>
-        <w:t xml:space="preserve"> }</w:t>
-      </w:r>
-      <w:r>
-        <w:rPr>
-          <w:rFonts w:ascii="Arial Narrow" w:hAnsi="Arial Narrow"/>
-          <w:b/>
-          <w:bCs/>
-        </w:rPr>
-        <w:t xml:space="preserve"> </w:t>
-      </w:r>
-      <w:r>
-        <w:rPr>
-          <w:rFonts w:ascii="Arial Narrow" w:hAnsi="Arial Narrow"/>
-          <w:b/>
-          <w:bCs/>
-        </w:rPr>
-        <w:t xml:space="preserve">{ </w:t>
-      </w:r>
-      <w:r>
-        <w:rPr>
-          <w:rFonts w:ascii="Arial Narrow" w:hAnsi="Arial Narrow"/>
-          <w:b/>
-          <w:bCs/>
-        </w:rPr>
-        <w:t>год</w:t>
-      </w:r>
-      <w:r>
-        <w:rPr>
-          <w:rFonts w:ascii="Arial Narrow" w:hAnsi="Arial Narrow"/>
-          <w:b/>
-          <w:bCs/>
-        </w:rPr>
-        <w:t xml:space="preserve"> }</w:t>
-      </w:r>
-      <w:r>
-        <w:rPr>
-          <w:rFonts w:ascii="Arial Narrow" w:hAnsi="Arial Narrow"/>
-          <w:b/>
-          <w:bCs/>
-        </w:rPr>
-        <w:t>г.</w:t>
+        <w:t>по организации чартерной воздушной перевозки</w:t>
       </w:r>
     </w:p>
     <w:p>
       <w:pPr>
-        <w:pStyle w:val="20"/>
-        <w:jc w:val="center"/>
-        <w:rPr>
-          <w:rFonts w:ascii="Arial Narrow" w:eastAsia="Arial Narrow" w:hAnsi="Arial Narrow" w:cs="Arial Narrow"/>
-          <w:i w:val="0"/>
-          <w:iCs w:val="0"/>
-          <w:sz w:val="20"/>
-          <w:szCs w:val="20"/>
-          <w:lang w:val="ru-RU"/>
-        </w:rPr>
-      </w:pPr>
-      <w:r>
-        <w:rPr>
-          <w:rFonts w:ascii="Arial Narrow" w:hAnsi="Arial Narrow"/>
-          <w:i w:val="0"/>
-          <w:iCs w:val="0"/>
-          <w:sz w:val="20"/>
-          <w:szCs w:val="20"/>
-          <w:lang w:val="ru-RU"/>
-        </w:rPr>
-        <w:lastRenderedPageBreak/>
-        <w:t xml:space="preserve">ЗАКАЗ № </w:t>
-      </w:r>
-      <w:r>
-        <w:rPr>
-          <w:rFonts w:ascii="Arial Narrow" w:hAnsi="Arial Narrow"/>
-          <w:i w:val="0"/>
-          <w:iCs w:val="0"/>
-          <w:sz w:val="20"/>
-          <w:szCs w:val="20"/>
-          <w:lang w:val="ru-RU"/>
-        </w:rPr>
-        <w:t xml:space="preserve">{ </w:t>
-      </w:r>
-      <w:r>
-        <w:rPr>
-          <w:rFonts w:ascii="Arial Narrow" w:hAnsi="Arial Narrow"/>
-          <w:i w:val="0"/>
-          <w:iCs w:val="0"/>
-          <w:sz w:val="20"/>
-          <w:szCs w:val="20"/>
-          <w:lang w:val="ru-RU"/>
-        </w:rPr>
-        <w:t>Номер заказа</w:t>
-      </w:r>
-      <w:r>
-        <w:rPr>
-          <w:rFonts w:ascii="Arial Narrow" w:hAnsi="Arial Narrow"/>
-          <w:i w:val="0"/>
-          <w:iCs w:val="0"/>
-          <w:sz w:val="20"/>
-          <w:szCs w:val="20"/>
-          <w:lang w:val="ru-RU"/>
-        </w:rPr>
-        <w:t xml:space="preserve"> }</w:t>
-      </w:r>
-    </w:p>
-    <w:p>
-      <w:pPr>
-        <w:pStyle w:val="11"/>
-        <w:ind w:firstLine="0"/>
-        <w:rPr>
-          <w:rFonts w:ascii="Arial Narrow" w:eastAsia="Arial Narrow" w:hAnsi="Arial Narrow" w:cs="Arial Narrow"/>
-          <w:b/>
-          <w:bCs/>
-        </w:rPr>
-      </w:pPr>
-      <w:r>
-        <w:rPr>
-          <w:rFonts w:ascii="Arial Narrow" w:hAnsi="Arial Narrow"/>
-          <w:b/>
-          <w:bCs/>
-        </w:rPr>
-        <w:t>на предоставление услуг</w:t>
-      </w:r>
-    </w:p>
-    <w:p>
-      <w:pPr>
-        <w:pStyle w:val="11"/>
-        <w:ind w:firstLine="0"/>
-        <w:rPr>
-          <w:rFonts w:ascii="Arial Narrow" w:eastAsia="Arial Narrow" w:hAnsi="Arial Narrow" w:cs="Arial Narrow"/>
-          <w:b/>
-          <w:bCs/>
-        </w:rPr>
-      </w:pPr>
-      <w:r>
-        <w:rPr>
-          <w:rFonts w:ascii="Arial Narrow" w:hAnsi="Arial Narrow"/>
-          <w:b/>
-          <w:bCs/>
-        </w:rPr>
-        <w:t>по организации чартерной воздушной перевозки</w:t>
-      </w:r>
-    </w:p>
-    <w:p>
-      <w:pPr>
         <w:rPr>
           <w:rFonts w:ascii="Arial Narrow" w:hAnsi="Arial Narrow"/>
           <w:sz w:val="20"/>
@@ -8845,25 +8234,7 @@
           <w:szCs w:val="20"/>
           <w:lang w:val="ru-RU"/>
         </w:rPr>
-        <w:t xml:space="preserve">{ </w:t>
-      </w:r>
-      <w:r>
-        <w:rPr>
-          <w:rFonts w:ascii="Arial Narrow" w:hAnsi="Arial Narrow"/>
-          <w:sz w:val="20"/>
-          <w:szCs w:val="20"/>
-          <w:lang w:val="ru-RU"/>
-        </w:rPr>
-        <w:t xml:space="preserve">день </w:t>
-      </w:r>
-      <w:r>
-        <w:rPr>
-          <w:rFonts w:ascii="Arial Narrow" w:hAnsi="Arial Narrow"/>
-          <w:sz w:val="20"/>
-          <w:szCs w:val="20"/>
-          <w:lang w:val="ru-RU"/>
-        </w:rPr>
-        <w:t>}</w:t>
+        <w:t>____</w:t>
       </w:r>
       <w:r>
         <w:rPr>
@@ -8881,43 +8252,7 @@
           <w:szCs w:val="20"/>
           <w:lang w:val="ru-RU"/>
         </w:rPr>
-        <w:t>{</w:t>
-      </w:r>
-      <w:r>
-        <w:rPr>
-          <w:rFonts w:ascii="Arial Narrow" w:hAnsi="Arial Narrow"/>
-          <w:sz w:val="20"/>
-          <w:szCs w:val="20"/>
-          <w:lang w:val="ru-RU"/>
-        </w:rPr>
-        <w:t xml:space="preserve"> месяц </w:t>
-      </w:r>
-      <w:r>
-        <w:rPr>
-          <w:rFonts w:ascii="Arial Narrow" w:hAnsi="Arial Narrow"/>
-          <w:sz w:val="20"/>
-          <w:szCs w:val="20"/>
-          <w:lang w:val="ru-RU"/>
-        </w:rPr>
-        <w:t>} {</w:t>
-      </w:r>
-      <w:r>
-        <w:rPr>
-          <w:rFonts w:ascii="Arial Narrow" w:hAnsi="Arial Narrow"/>
-          <w:sz w:val="20"/>
-          <w:szCs w:val="20"/>
-          <w:lang w:val="ru-RU"/>
-        </w:rPr>
-        <w:t xml:space="preserve"> год </w:t>
-      </w:r>
-      <w:r>
-        <w:rPr>
-          <w:rFonts w:ascii="Arial Narrow" w:hAnsi="Arial Narrow"/>
-          <w:sz w:val="20"/>
-          <w:szCs w:val="20"/>
-          <w:lang w:val="ru-RU"/>
-        </w:rPr>
-        <w:t>}</w:t>
+        <w:t>______________202__</w:t>
       </w:r>
       <w:r>
         <w:rPr>
@@ -8975,8 +8310,9 @@
           <w:szCs w:val="20"/>
           <w:lang w:val="ru-RU"/>
         </w:rPr>
-        <w:t>{ Полное наименование организации }</w:t>
-      </w:r>
+        <w:t xml:space="preserve">Общество с ограниченной ответственностью «Джет </w:t>
+      </w:r>
+      <w:proofErr w:type="spellStart"/>
       <w:r>
         <w:rPr>
           <w:rFonts w:ascii="Arial Narrow" w:hAnsi="Arial Narrow"/>
@@ -8986,16 +8322,52 @@
           <w:szCs w:val="20"/>
           <w:lang w:val="ru-RU"/>
         </w:rPr>
-        <w:t>,</w:t>
-      </w:r>
-      <w:r>
-        <w:rPr>
-          <w:rFonts w:ascii="Arial Narrow" w:hAnsi="Arial Narrow"/>
+        <w:t>Партнерс</w:t>
+      </w:r>
+      <w:proofErr w:type="spellEnd"/>
+      <w:r>
+        <w:rPr>
+          <w:rFonts w:ascii="Arial Narrow" w:hAnsi="Arial Narrow"/>
+          <w:b/>
           <w:spacing w:val="-1"/>
           <w:sz w:val="20"/>
           <w:szCs w:val="20"/>
           <w:lang w:val="ru-RU"/>
         </w:rPr>
+        <w:t xml:space="preserve"> </w:t>
+      </w:r>
+      <w:proofErr w:type="spellStart"/>
+      <w:r>
+        <w:rPr>
+          <w:rFonts w:ascii="Arial Narrow" w:hAnsi="Arial Narrow"/>
+          <w:b/>
+          <w:spacing w:val="-1"/>
+          <w:sz w:val="20"/>
+          <w:szCs w:val="20"/>
+          <w:lang w:val="ru-RU"/>
+        </w:rPr>
+        <w:t>Аэро</w:t>
+      </w:r>
+      <w:proofErr w:type="spellEnd"/>
+      <w:r>
+        <w:rPr>
+          <w:rFonts w:ascii="Arial Narrow" w:hAnsi="Arial Narrow"/>
+          <w:b/>
+          <w:spacing w:val="-1"/>
+          <w:sz w:val="20"/>
+          <w:szCs w:val="20"/>
+          <w:lang w:val="ru-RU"/>
+        </w:rPr>
+        <w:t>»,</w:t>
+      </w:r>
+      <w:r>
+        <w:rPr>
+          <w:rFonts w:ascii="Arial Narrow" w:hAnsi="Arial Narrow"/>
+          <w:spacing w:val="-1"/>
+          <w:sz w:val="20"/>
+          <w:szCs w:val="20"/>
+          <w:lang w:val="ru-RU"/>
+        </w:rPr>
         <w:t xml:space="preserve"> в дальнейшем именуемое "Исполнитель", в лице генерального дире</w:t>
       </w:r>
       <w:r>
@@ -9006,7 +8378,7 @@
           <w:szCs w:val="20"/>
           <w:lang w:val="ru-RU"/>
         </w:rPr>
-        <w:t xml:space="preserve">ктора </w:t>
+        <w:t>ктора Ломакина Антона Вадимовича</w:t>
       </w:r>
       <w:r>
         <w:rPr>
@@ -9016,9 +8388,8 @@
           <w:szCs w:val="20"/>
           <w:lang w:val="ru-RU"/>
         </w:rPr>
-        <w:t xml:space="preserve">{ </w:t>
-      </w:r>
-      <w:proofErr w:type="spellStart"/>
+        <w:t xml:space="preserve">, действующего на основании Устава, с одной стороны и </w:t>
+      </w:r>
       <w:r>
         <w:rPr>
           <w:rFonts w:ascii="Arial Narrow" w:hAnsi="Arial Narrow"/>
@@ -9027,9 +8398,8 @@
           <w:szCs w:val="20"/>
           <w:lang w:val="ru-RU"/>
         </w:rPr>
-        <w:t>фио</w:t>
-      </w:r>
-      <w:proofErr w:type="spellEnd"/>
+        <w:t>___________________________</w:t>
+      </w:r>
       <w:r>
         <w:rPr>
           <w:rFonts w:ascii="Arial Narrow" w:hAnsi="Arial Narrow"/>
@@ -9038,7 +8408,7 @@
           <w:szCs w:val="20"/>
           <w:lang w:val="ru-RU"/>
         </w:rPr>
-        <w:t xml:space="preserve"> </w:t>
+        <w:t xml:space="preserve"> далее именуемое «Заказчик», в </w:t>
       </w:r>
       <w:r>
         <w:rPr>
@@ -9048,7 +8418,7 @@
           <w:szCs w:val="20"/>
           <w:lang w:val="ru-RU"/>
         </w:rPr>
-        <w:t>}</w:t>
+        <w:t>______________________________________________________________</w:t>
       </w:r>
       <w:r>
         <w:rPr>
@@ -9058,7 +8428,7 @@
           <w:szCs w:val="20"/>
           <w:lang w:val="ru-RU"/>
         </w:rPr>
-        <w:t xml:space="preserve">, действующего на основании Устава, с одной стороны и </w:t>
+        <w:t xml:space="preserve"> , действующего на основании </w:t>
       </w:r>
       <w:r>
         <w:rPr>
@@ -9068,9 +8438,8 @@
           <w:szCs w:val="20"/>
           <w:lang w:val="ru-RU"/>
         </w:rPr>
-        <w:t xml:space="preserve">{ </w:t>
-      </w:r>
-      <w:proofErr w:type="spellStart"/>
+        <w:t>________________________</w:t>
+      </w:r>
       <w:r>
         <w:rPr>
           <w:rFonts w:ascii="Arial Narrow" w:hAnsi="Arial Narrow"/>
@@ -9079,38 +8448,7 @@
           <w:szCs w:val="20"/>
           <w:lang w:val="ru-RU"/>
         </w:rPr>
-        <w:t>фио</w:t>
-      </w:r>
-      <w:proofErr w:type="spellEnd"/>
-      <w:r>
-        <w:rPr>
-          <w:rFonts w:ascii="Arial Narrow" w:hAnsi="Arial Narrow"/>
-          <w:spacing w:val="-1"/>
-          <w:sz w:val="20"/>
-          <w:szCs w:val="20"/>
-          <w:lang w:val="ru-RU"/>
-        </w:rPr>
-        <w:t xml:space="preserve"> </w:t>
-      </w:r>
-      <w:r>
-        <w:rPr>
-          <w:rFonts w:ascii="Arial Narrow" w:hAnsi="Arial Narrow"/>
-          <w:spacing w:val="-1"/>
-          <w:sz w:val="20"/>
-          <w:szCs w:val="20"/>
-          <w:lang w:val="ru-RU"/>
-        </w:rPr>
-        <w:t xml:space="preserve">} </w:t>
-      </w:r>
-      <w:r>
-        <w:rPr>
-          <w:rFonts w:ascii="Arial Narrow" w:hAnsi="Arial Narrow"/>
-          <w:spacing w:val="-1"/>
-          <w:sz w:val="20"/>
-          <w:szCs w:val="20"/>
-          <w:lang w:val="ru-RU"/>
-        </w:rPr>
-        <w:t>далее именуемое «Заказчик», с другой стороны, вместе именуемые "Стороны", заключили настоящий Договор о нижеследующем.</w:t>
+        <w:t>, с другой стороны, вместе именуемые "Стороны", заключили настоящий Договор о нижеследующем.</w:t>
       </w:r>
     </w:p>
     <w:p>
@@ -9178,29 +8516,7 @@
           <w:szCs w:val="20"/>
           <w:lang w:val="ru-RU"/>
         </w:rPr>
-        <w:t xml:space="preserve">{ </w:t>
-      </w:r>
-      <w:r>
-        <w:rPr>
-          <w:rFonts w:ascii="Arial Narrow" w:hAnsi="Arial Narrow"/>
-          <w:b/>
-          <w:bCs/>
-          <w:sz w:val="20"/>
-          <w:szCs w:val="20"/>
-          <w:lang w:val="ru-RU"/>
-        </w:rPr>
-        <w:t xml:space="preserve">Номер воздушного судна </w:t>
-      </w:r>
-      <w:r>
-        <w:rPr>
-          <w:rFonts w:ascii="Arial Narrow" w:hAnsi="Arial Narrow"/>
-          <w:b/>
-          <w:bCs/>
-          <w:sz w:val="20"/>
-          <w:szCs w:val="20"/>
-          <w:lang w:val="ru-RU"/>
-        </w:rPr>
-        <w:t>}</w:t>
+        <w:t>________________________</w:t>
       </w:r>
     </w:p>
     <w:p>
@@ -9217,7 +8533,6 @@
           <w:bCs/>
           <w:sz w:val="20"/>
           <w:szCs w:val="20"/>
-          <w:lang w:val="ru-RU"/>
         </w:rPr>
       </w:pPr>
     </w:p>
@@ -10367,25 +9682,7 @@
           <w:szCs w:val="20"/>
           <w:lang w:val="ru-RU"/>
         </w:rPr>
-        <w:t xml:space="preserve">{ </w:t>
-      </w:r>
-      <w:r>
-        <w:rPr>
-          <w:rFonts w:ascii="Arial Narrow" w:hAnsi="Arial Narrow"/>
-          <w:sz w:val="20"/>
-          <w:szCs w:val="20"/>
-          <w:lang w:val="ru-RU"/>
-        </w:rPr>
-        <w:t xml:space="preserve">стоимость услуг </w:t>
-      </w:r>
-      <w:r>
-        <w:rPr>
-          <w:rFonts w:ascii="Arial Narrow" w:hAnsi="Arial Narrow"/>
-          <w:sz w:val="20"/>
-          <w:szCs w:val="20"/>
-          <w:lang w:val="ru-RU"/>
-        </w:rPr>
-        <w:t>}</w:t>
+        <w:t>_______________________________</w:t>
       </w:r>
       <w:r>
         <w:rPr>
@@ -10412,25 +9709,7 @@
           <w:szCs w:val="20"/>
           <w:lang w:val="ru-RU"/>
         </w:rPr>
-        <w:t xml:space="preserve">{ </w:t>
-      </w:r>
-      <w:r>
-        <w:rPr>
-          <w:rFonts w:ascii="Arial Narrow" w:hAnsi="Arial Narrow"/>
-          <w:sz w:val="20"/>
-          <w:szCs w:val="20"/>
-          <w:lang w:val="ru-RU"/>
-        </w:rPr>
-        <w:t>стоимость услуг текстом</w:t>
-      </w:r>
-      <w:r>
-        <w:rPr>
-          <w:rFonts w:ascii="Arial Narrow" w:hAnsi="Arial Narrow"/>
-          <w:sz w:val="20"/>
-          <w:szCs w:val="20"/>
-          <w:lang w:val="ru-RU"/>
-        </w:rPr>
-        <w:t xml:space="preserve"> }</w:t>
+        <w:t>________________</w:t>
       </w:r>
       <w:r>
         <w:rPr>
@@ -10621,106 +9900,7 @@
           <w:szCs w:val="20"/>
           <w:lang w:val="ru-RU"/>
         </w:rPr>
-        <w:t>«</w:t>
-      </w:r>
-      <w:r>
-        <w:rPr>
-          <w:rFonts w:ascii="Arial Narrow" w:hAnsi="Arial Narrow"/>
-          <w:sz w:val="20"/>
-          <w:szCs w:val="20"/>
-          <w:lang w:val="ru-RU"/>
-        </w:rPr>
-        <w:t>{</w:t>
-      </w:r>
-      <w:r>
-        <w:rPr>
-          <w:rFonts w:ascii="Arial Narrow" w:hAnsi="Arial Narrow"/>
-          <w:sz w:val="20"/>
-          <w:szCs w:val="20"/>
-          <w:lang w:val="ru-RU"/>
-        </w:rPr>
-        <w:t xml:space="preserve"> дата </w:t>
-      </w:r>
-      <w:r>
-        <w:rPr>
-          <w:rFonts w:ascii="Arial Narrow" w:hAnsi="Arial Narrow"/>
-          <w:sz w:val="20"/>
-          <w:szCs w:val="20"/>
-          <w:lang w:val="ru-RU"/>
-        </w:rPr>
-        <w:t>}</w:t>
-      </w:r>
-      <w:r>
-        <w:rPr>
-          <w:rFonts w:ascii="Arial Narrow" w:hAnsi="Arial Narrow"/>
-          <w:sz w:val="20"/>
-          <w:szCs w:val="20"/>
-          <w:lang w:val="ru-RU"/>
-        </w:rPr>
-        <w:t>»</w:t>
-      </w:r>
-      <w:r>
-        <w:rPr>
-          <w:rFonts w:ascii="Arial Narrow" w:hAnsi="Arial Narrow"/>
-          <w:sz w:val="20"/>
-          <w:szCs w:val="20"/>
-          <w:lang w:val="ru-RU"/>
-        </w:rPr>
-        <w:t xml:space="preserve"> </w:t>
-      </w:r>
-      <w:r>
-        <w:rPr>
-          <w:rFonts w:ascii="Arial Narrow" w:hAnsi="Arial Narrow"/>
-          <w:sz w:val="20"/>
-          <w:szCs w:val="20"/>
-          <w:lang w:val="ru-RU"/>
-        </w:rPr>
-        <w:t>{</w:t>
-      </w:r>
-      <w:r>
-        <w:rPr>
-          <w:rFonts w:ascii="Arial Narrow" w:hAnsi="Arial Narrow"/>
-          <w:sz w:val="20"/>
-          <w:szCs w:val="20"/>
-          <w:lang w:val="ru-RU"/>
-        </w:rPr>
-        <w:t xml:space="preserve"> месяц </w:t>
-      </w:r>
-      <w:r>
-        <w:rPr>
-          <w:rFonts w:ascii="Arial Narrow" w:hAnsi="Arial Narrow"/>
-          <w:sz w:val="20"/>
-          <w:szCs w:val="20"/>
-          <w:lang w:val="ru-RU"/>
-        </w:rPr>
-        <w:t xml:space="preserve">} { </w:t>
-      </w:r>
-      <w:r>
-        <w:rPr>
-          <w:rFonts w:ascii="Arial Narrow" w:hAnsi="Arial Narrow"/>
-          <w:sz w:val="20"/>
-          <w:szCs w:val="20"/>
-          <w:lang w:val="ru-RU"/>
-        </w:rPr>
-        <w:t xml:space="preserve">год </w:t>
-      </w:r>
-      <w:r>
-        <w:rPr>
-          <w:rFonts w:ascii="Arial Narrow" w:hAnsi="Arial Narrow"/>
-          <w:sz w:val="20"/>
-          <w:szCs w:val="20"/>
-          <w:lang w:val="ru-RU"/>
-        </w:rPr>
-        <w:t>}</w:t>
-      </w:r>
-      <w:r>
-        <w:rPr>
-          <w:rFonts w:ascii="Arial Narrow" w:hAnsi="Arial Narrow"/>
-          <w:sz w:val="20"/>
-          <w:szCs w:val="20"/>
-          <w:lang w:val="ru-RU"/>
-        </w:rPr>
-        <w:t>г.</w:t>
+        <w:t>«___»___________202__г.</w:t>
       </w:r>
     </w:p>
     <w:p>
@@ -10784,34 +9964,16 @@
           <w:szCs w:val="20"/>
           <w:lang w:val="ru-RU"/>
         </w:rPr>
-        <w:t>борт. Питание класса</w:t>
-      </w:r>
-      <w:r>
-        <w:rPr>
-          <w:rFonts w:ascii="Arial Narrow" w:hAnsi="Arial Narrow"/>
-          <w:sz w:val="20"/>
-          <w:szCs w:val="20"/>
-          <w:lang w:val="ru-RU"/>
-        </w:rPr>
-        <w:t xml:space="preserve"> { </w:t>
-      </w:r>
-      <w:r>
-        <w:rPr>
-          <w:rFonts w:ascii="Arial Narrow" w:hAnsi="Arial Narrow"/>
-          <w:sz w:val="20"/>
-          <w:szCs w:val="20"/>
-          <w:lang w:val="ru-RU"/>
-        </w:rPr>
-        <w:t>класс питания</w:t>
-      </w:r>
-      <w:r>
-        <w:rPr>
-          <w:rFonts w:ascii="Arial Narrow" w:hAnsi="Arial Narrow"/>
-          <w:sz w:val="20"/>
-          <w:szCs w:val="20"/>
-          <w:lang w:val="ru-RU"/>
-        </w:rPr>
-        <w:t xml:space="preserve"> }</w:t>
+        <w:t xml:space="preserve">борт. Питание класса </w:t>
+      </w:r>
+      <w:r>
+        <w:rPr>
+          <w:rFonts w:ascii="Arial Narrow" w:hAnsi="Arial Narrow"/>
+          <w:sz w:val="20"/>
+          <w:szCs w:val="20"/>
+          <w:lang w:val="ru-RU"/>
+        </w:rPr>
+        <w:t>_____</w:t>
       </w:r>
       <w:r>
         <w:rPr>
@@ -10877,6 +10039,8 @@
         </w:rPr>
         <w:t>В стоимость услуг не включено:</w:t>
       </w:r>
+      <w:bookmarkStart w:id="1" w:name="_GoBack"/>
+      <w:bookmarkEnd w:id="1"/>
     </w:p>
     <w:p>
       <w:pPr>
@@ -11088,8 +10252,9 @@
           <w:szCs w:val="20"/>
           <w:lang w:val="ru-RU"/>
         </w:rPr>
-        <w:t xml:space="preserve">{ Полное наименование организации } </w:t>
-      </w:r>
+        <w:t xml:space="preserve">Генеральный директор ООО «Джет </w:t>
+      </w:r>
+      <w:proofErr w:type="spellStart"/>
       <w:r>
         <w:rPr>
           <w:rFonts w:ascii="Arial Narrow" w:eastAsia="Arial Narrow" w:hAnsi="Arial Narrow" w:cs="Arial Narrow"/>
@@ -11098,8 +10263,9 @@
           <w:szCs w:val="20"/>
           <w:lang w:val="ru-RU"/>
         </w:rPr>
-        <w:t xml:space="preserve">                                              </w:t>
-      </w:r>
+        <w:t>Партнерс</w:t>
+      </w:r>
+      <w:proofErr w:type="spellEnd"/>
       <w:r>
         <w:rPr>
           <w:rFonts w:ascii="Arial Narrow" w:eastAsia="Arial Narrow" w:hAnsi="Arial Narrow" w:cs="Arial Narrow"/>
@@ -11108,8 +10274,9 @@
           <w:szCs w:val="20"/>
           <w:lang w:val="ru-RU"/>
         </w:rPr>
-        <w:t xml:space="preserve">                     </w:t>
-      </w:r>
+        <w:t xml:space="preserve"> </w:t>
+      </w:r>
+      <w:proofErr w:type="spellStart"/>
       <w:r>
         <w:rPr>
           <w:rFonts w:ascii="Arial Narrow" w:eastAsia="Arial Narrow" w:hAnsi="Arial Narrow" w:cs="Arial Narrow"/>
@@ -11118,9 +10285,9 @@
           <w:szCs w:val="20"/>
           <w:lang w:val="ru-RU"/>
         </w:rPr>
-        <w:t xml:space="preserve">{ </w:t>
-      </w:r>
-      <w:proofErr w:type="spellStart"/>
+        <w:t>Аэро</w:t>
+      </w:r>
+      <w:proofErr w:type="spellEnd"/>
       <w:r>
         <w:rPr>
           <w:rFonts w:ascii="Arial Narrow" w:eastAsia="Arial Narrow" w:hAnsi="Arial Narrow" w:cs="Arial Narrow"/>
@@ -11129,28 +10296,7 @@
           <w:szCs w:val="20"/>
           <w:lang w:val="ru-RU"/>
         </w:rPr>
-        <w:t>фио</w:t>
-      </w:r>
-      <w:proofErr w:type="spellEnd"/>
-      <w:r>
-        <w:rPr>
-          <w:rFonts w:ascii="Arial Narrow" w:eastAsia="Arial Narrow" w:hAnsi="Arial Narrow" w:cs="Arial Narrow"/>
-          <w:b/>
-          <w:sz w:val="20"/>
-          <w:szCs w:val="20"/>
-          <w:lang w:val="ru-RU"/>
-        </w:rPr>
-        <w:t xml:space="preserve"> </w:t>
-      </w:r>
-      <w:r>
-        <w:rPr>
-          <w:rFonts w:ascii="Arial Narrow" w:eastAsia="Arial Narrow" w:hAnsi="Arial Narrow" w:cs="Arial Narrow"/>
-          <w:b/>
-          <w:sz w:val="20"/>
-          <w:szCs w:val="20"/>
-          <w:lang w:val="ru-RU"/>
-        </w:rPr>
-        <w:t>}</w:t>
+        <w:t>»                                              _________________________________________</w:t>
       </w:r>
     </w:p>
     <w:p>
@@ -11215,153 +10361,7 @@
           <w:szCs w:val="20"/>
           <w:lang w:val="ru-RU"/>
         </w:rPr>
-        <w:t xml:space="preserve">___________________________ / </w:t>
-      </w:r>
-      <w:r>
-        <w:rPr>
-          <w:rFonts w:ascii="Arial Narrow" w:eastAsia="Arial Narrow" w:hAnsi="Arial Narrow" w:cs="Arial Narrow"/>
-          <w:b/>
-          <w:sz w:val="20"/>
-          <w:szCs w:val="20"/>
-          <w:lang w:val="en-US"/>
-        </w:rPr>
-        <w:t xml:space="preserve">{ </w:t>
-      </w:r>
-      <w:proofErr w:type="spellStart"/>
-      <w:r>
-        <w:rPr>
-          <w:rFonts w:ascii="Arial Narrow" w:eastAsia="Arial Narrow" w:hAnsi="Arial Narrow" w:cs="Arial Narrow"/>
-          <w:b/>
-          <w:sz w:val="20"/>
-          <w:szCs w:val="20"/>
-          <w:lang w:val="ru-RU"/>
-        </w:rPr>
-        <w:t>фио</w:t>
-      </w:r>
-      <w:proofErr w:type="spellEnd"/>
-      <w:r>
-        <w:rPr>
-          <w:rFonts w:ascii="Arial Narrow" w:eastAsia="Arial Narrow" w:hAnsi="Arial Narrow" w:cs="Arial Narrow"/>
-          <w:b/>
-          <w:sz w:val="20"/>
-          <w:szCs w:val="20"/>
-          <w:lang w:val="ru-RU"/>
-        </w:rPr>
-        <w:t xml:space="preserve"> ген. </w:t>
-      </w:r>
-      <w:proofErr w:type="spellStart"/>
-      <w:r>
-        <w:rPr>
-          <w:rFonts w:ascii="Arial Narrow" w:eastAsia="Arial Narrow" w:hAnsi="Arial Narrow" w:cs="Arial Narrow"/>
-          <w:b/>
-          <w:sz w:val="20"/>
-          <w:szCs w:val="20"/>
-          <w:lang w:val="ru-RU"/>
-        </w:rPr>
-        <w:t>дир</w:t>
-      </w:r>
-      <w:proofErr w:type="spellEnd"/>
-      <w:r>
-        <w:rPr>
-          <w:rFonts w:ascii="Arial Narrow" w:eastAsia="Arial Narrow" w:hAnsi="Arial Narrow" w:cs="Arial Narrow"/>
-          <w:b/>
-          <w:sz w:val="20"/>
-          <w:szCs w:val="20"/>
-          <w:lang w:val="ru-RU"/>
-        </w:rPr>
-        <w:t xml:space="preserve">. </w:t>
-      </w:r>
-      <w:r>
-        <w:rPr>
-          <w:rFonts w:ascii="Arial Narrow" w:eastAsia="Arial Narrow" w:hAnsi="Arial Narrow" w:cs="Arial Narrow"/>
-          <w:b/>
-          <w:sz w:val="20"/>
-          <w:szCs w:val="20"/>
-          <w:lang w:val="en-US"/>
-        </w:rPr>
-        <w:t>}</w:t>
-      </w:r>
-      <w:r>
-        <w:rPr>
-          <w:rFonts w:ascii="Arial Narrow" w:eastAsia="Arial Narrow" w:hAnsi="Arial Narrow" w:cs="Arial Narrow"/>
-          <w:b/>
-          <w:sz w:val="20"/>
-          <w:szCs w:val="20"/>
-          <w:lang w:val="ru-RU"/>
-        </w:rPr>
-        <w:t xml:space="preserve"> </w:t>
-      </w:r>
-      <w:r>
-        <w:rPr>
-          <w:rFonts w:ascii="Arial Narrow" w:eastAsia="Arial Narrow" w:hAnsi="Arial Narrow" w:cs="Arial Narrow"/>
-          <w:b/>
-          <w:sz w:val="20"/>
-          <w:szCs w:val="20"/>
-          <w:lang w:val="ru-RU"/>
-        </w:rPr>
-        <w:t>/                                                      _____________________________/</w:t>
-      </w:r>
-      <w:r>
-        <w:rPr>
-          <w:rFonts w:ascii="Arial Narrow" w:eastAsia="Arial Narrow" w:hAnsi="Arial Narrow" w:cs="Arial Narrow"/>
-          <w:b/>
-          <w:sz w:val="20"/>
-          <w:szCs w:val="20"/>
-          <w:lang w:val="ru-RU"/>
-        </w:rPr>
-        <w:t>{</w:t>
-      </w:r>
-      <w:r>
-        <w:rPr>
-          <w:rFonts w:ascii="Arial Narrow" w:eastAsia="Arial Narrow" w:hAnsi="Arial Narrow" w:cs="Arial Narrow"/>
-          <w:b/>
-          <w:sz w:val="20"/>
-          <w:szCs w:val="20"/>
-          <w:lang w:val="ru-RU"/>
-        </w:rPr>
-        <w:t xml:space="preserve"> </w:t>
-      </w:r>
-      <w:proofErr w:type="spellStart"/>
-      <w:r>
-        <w:rPr>
-          <w:rFonts w:ascii="Arial Narrow" w:eastAsia="Arial Narrow" w:hAnsi="Arial Narrow" w:cs="Arial Narrow"/>
-          <w:b/>
-          <w:sz w:val="20"/>
-          <w:szCs w:val="20"/>
-          <w:lang w:val="ru-RU"/>
-        </w:rPr>
-        <w:t>фио</w:t>
-      </w:r>
-      <w:proofErr w:type="spellEnd"/>
-      <w:r>
-        <w:rPr>
-          <w:rFonts w:ascii="Arial Narrow" w:eastAsia="Arial Narrow" w:hAnsi="Arial Narrow" w:cs="Arial Narrow"/>
-          <w:b/>
-          <w:sz w:val="20"/>
-          <w:szCs w:val="20"/>
-          <w:lang w:val="ru-RU"/>
-        </w:rPr>
-        <w:t xml:space="preserve"> </w:t>
-      </w:r>
-      <w:r>
-        <w:rPr>
-          <w:rFonts w:ascii="Arial Narrow" w:eastAsia="Arial Narrow" w:hAnsi="Arial Narrow" w:cs="Arial Narrow"/>
-          <w:b/>
-          <w:sz w:val="20"/>
-          <w:szCs w:val="20"/>
-          <w:lang w:val="ru-RU"/>
-        </w:rPr>
-        <w:t>}</w:t>
-      </w:r>
-      <w:r>
-        <w:rPr>
-          <w:rFonts w:ascii="Arial Narrow" w:eastAsia="Arial Narrow" w:hAnsi="Arial Narrow" w:cs="Arial Narrow"/>
-          <w:b/>
-          <w:sz w:val="20"/>
-          <w:szCs w:val="20"/>
-          <w:lang w:val="ru-RU"/>
-        </w:rPr>
-        <w:t>/</w:t>
+        <w:t>___________________________ / Ломакин А.В/                                                      _____________________________/_______________/</w:t>
       </w:r>
     </w:p>
     <w:p>
@@ -11408,7 +10408,7 @@
 </file>
 
 <file path=word/endnotes.xml><?xml version="1.0" encoding="utf-8"?>
-<w:endnotes xmlns:wpc="http://schemas.microsoft.com/office/word/2010/wordprocessingCanvas" xmlns:cx="http://schemas.microsoft.com/office/drawing/2014/chartex" xmlns:cx1="http://schemas.microsoft.com/office/drawing/2015/9/8/chartex" xmlns:cx2="http://schemas.microsoft.com/office/drawing/2015/10/21/chartex" xmlns:cx3="http://schemas.microsoft.com/office/drawing/2016/5/9/chartex" xmlns:cx4="http://schemas.microsoft.com/office/drawing/2016/5/10/chartex" xmlns:cx5="http://schemas.microsoft.com/office/drawing/2016/5/11/chartex" xmlns:cx6="http://schemas.microsoft.com/office/drawing/2016/5/12/chartex" xmlns:cx7="http://schemas.microsoft.com/office/drawing/2016/5/13/chartex" xmlns:cx8="http://schemas.microsoft.com/office/drawing/2016/5/14/chartex" xmlns:mc="http://schemas.openxmlformats.org/markup-compatibility/2006" xmlns:aink="http://schemas.microsoft.com/office/drawing/2016/ink" xmlns:am3d="http://schemas.microsoft.com/office/drawing/2017/model3d" xmlns:o="urn:schemas-microsoft-com:office:office" xmlns:r="http://schemas.openxmlformats.org/officeDocument/2006/relationships" xmlns:m="http://schemas.openxmlformats.org/officeDocument/2006/math" xmlns:v="urn:schemas-microsoft-com:vml" xmlns:wp14="http://schemas.microsoft.com/office/word/2010/wordprocessingDrawing" xmlns:wp="http://schemas.openxmlformats.org/drawingml/2006/wordprocessingDrawing" xmlns:w10="urn:schemas-microsoft-com:office:word" xmlns:w="http://schemas.openxmlformats.org/wordprocessingml/2006/main" xmlns:w14="http://schemas.microsoft.com/office/word/2010/wordml" xmlns:w15="http://schemas.microsoft.com/office/word/2012/wordml" xmlns:w16cex="http://schemas.microsoft.com/office/word/2018/wordml/cex" xmlns:w16cid="http://schemas.microsoft.com/office/word/2016/wordml/cid" xmlns:w16="http://schemas.microsoft.com/office/word/2018/wordml" xmlns:w16sdtdh="http://schemas.microsoft.com/office/word/2020/wordml/sdtdatahash" xmlns:w16se="http://schemas.microsoft.com/office/word/2015/wordml/symex" xmlns:wpg="http://schemas.microsoft.com/office/word/2010/wordprocessingGroup" xmlns:wpi="http://schemas.microsoft.com/office/word/2010/wordprocessingInk" xmlns:wne="http://schemas.microsoft.com/office/word/2006/wordml" xmlns:wps="http://schemas.microsoft.com/office/word/2010/wordprocessingShape" mc:Ignorable="w14 w15 w16se w16cid w16 w16cex w16sdtdh wp14">
+<w:endnotes xmlns:wpc="http://schemas.microsoft.com/office/word/2010/wordprocessingCanvas" xmlns:cx="http://schemas.microsoft.com/office/drawing/2014/chartex" xmlns:cx1="http://schemas.microsoft.com/office/drawing/2015/9/8/chartex" xmlns:cx2="http://schemas.microsoft.com/office/drawing/2015/10/21/chartex" xmlns:cx3="http://schemas.microsoft.com/office/drawing/2016/5/9/chartex" xmlns:cx4="http://schemas.microsoft.com/office/drawing/2016/5/10/chartex" xmlns:cx5="http://schemas.microsoft.com/office/drawing/2016/5/11/chartex" xmlns:cx6="http://schemas.microsoft.com/office/drawing/2016/5/12/chartex" xmlns:cx7="http://schemas.microsoft.com/office/drawing/2016/5/13/chartex" xmlns:cx8="http://schemas.microsoft.com/office/drawing/2016/5/14/chartex" xmlns:mc="http://schemas.openxmlformats.org/markup-compatibility/2006" xmlns:aink="http://schemas.microsoft.com/office/drawing/2016/ink" xmlns:am3d="http://schemas.microsoft.com/office/drawing/2017/model3d" xmlns:o="urn:schemas-microsoft-com:office:office" xmlns:r="http://schemas.openxmlformats.org/officeDocument/2006/relationships" xmlns:m="http://schemas.openxmlformats.org/officeDocument/2006/math" xmlns:v="urn:schemas-microsoft-com:vml" xmlns:wp14="http://schemas.microsoft.com/office/word/2010/wordprocessingDrawing" xmlns:wp="http://schemas.openxmlformats.org/drawingml/2006/wordprocessingDrawing" xmlns:w10="urn:schemas-microsoft-com:office:word" xmlns:w="http://schemas.openxmlformats.org/wordprocessingml/2006/main" xmlns:w14="http://schemas.microsoft.com/office/word/2010/wordml" xmlns:w15="http://schemas.microsoft.com/office/word/2012/wordml" xmlns:w16cid="http://schemas.microsoft.com/office/word/2016/wordml/cid" xmlns:w16se="http://schemas.microsoft.com/office/word/2015/wordml/symex" xmlns:wpg="http://schemas.microsoft.com/office/word/2010/wordprocessingGroup" xmlns:wpi="http://schemas.microsoft.com/office/word/2010/wordprocessingInk" xmlns:wne="http://schemas.microsoft.com/office/word/2006/wordml" xmlns:wps="http://schemas.microsoft.com/office/word/2010/wordprocessingShape" mc:Ignorable="w14 w15 w16se w16cid wp14">
   <w:endnote w:type="separator" w:id="-1">
     <w:p>
       <w:r>
@@ -11427,7 +10427,7 @@
 </file>
 
 <file path=word/footer1.xml><?xml version="1.0" encoding="utf-8"?>
-<w:ftr xmlns:wpc="http://schemas.microsoft.com/office/word/2010/wordprocessingCanvas" xmlns:cx="http://schemas.microsoft.com/office/drawing/2014/chartex" xmlns:cx1="http://schemas.microsoft.com/office/drawing/2015/9/8/chartex" xmlns:cx2="http://schemas.microsoft.com/office/drawing/2015/10/21/chartex" xmlns:cx3="http://schemas.microsoft.com/office/drawing/2016/5/9/chartex" xmlns:cx4="http://schemas.microsoft.com/office/drawing/2016/5/10/chartex" xmlns:cx5="http://schemas.microsoft.com/office/drawing/2016/5/11/chartex" xmlns:cx6="http://schemas.microsoft.com/office/drawing/2016/5/12/chartex" xmlns:cx7="http://schemas.microsoft.com/office/drawing/2016/5/13/chartex" xmlns:cx8="http://schemas.microsoft.com/office/drawing/2016/5/14/chartex" xmlns:mc="http://schemas.openxmlformats.org/markup-compatibility/2006" xmlns:aink="http://schemas.microsoft.com/office/drawing/2016/ink" xmlns:am3d="http://schemas.microsoft.com/office/drawing/2017/model3d" xmlns:o="urn:schemas-microsoft-com:office:office" xmlns:r="http://schemas.openxmlformats.org/officeDocument/2006/relationships" xmlns:m="http://schemas.openxmlformats.org/officeDocument/2006/math" xmlns:v="urn:schemas-microsoft-com:vml" xmlns:wp14="http://schemas.microsoft.com/office/word/2010/wordprocessingDrawing" xmlns:wp="http://schemas.openxmlformats.org/drawingml/2006/wordprocessingDrawing" xmlns:w10="urn:schemas-microsoft-com:office:word" xmlns:w="http://schemas.openxmlformats.org/wordprocessingml/2006/main" xmlns:w14="http://schemas.microsoft.com/office/word/2010/wordml" xmlns:w15="http://schemas.microsoft.com/office/word/2012/wordml" xmlns:w16cex="http://schemas.microsoft.com/office/word/2018/wordml/cex" xmlns:w16cid="http://schemas.microsoft.com/office/word/2016/wordml/cid" xmlns:w16="http://schemas.microsoft.com/office/word/2018/wordml" xmlns:w16sdtdh="http://schemas.microsoft.com/office/word/2020/wordml/sdtdatahash" xmlns:w16se="http://schemas.microsoft.com/office/word/2015/wordml/symex" xmlns:wpg="http://schemas.microsoft.com/office/word/2010/wordprocessingGroup" xmlns:wpi="http://schemas.microsoft.com/office/word/2010/wordprocessingInk" xmlns:wne="http://schemas.microsoft.com/office/word/2006/wordml" xmlns:wps="http://schemas.microsoft.com/office/word/2010/wordprocessingShape" mc:Ignorable="w14 w15 w16se w16cid w16 w16cex w16sdtdh wp14">
+<w:ftr xmlns:wpc="http://schemas.microsoft.com/office/word/2010/wordprocessingCanvas" xmlns:cx="http://schemas.microsoft.com/office/drawing/2014/chartex" xmlns:cx1="http://schemas.microsoft.com/office/drawing/2015/9/8/chartex" xmlns:cx2="http://schemas.microsoft.com/office/drawing/2015/10/21/chartex" xmlns:cx3="http://schemas.microsoft.com/office/drawing/2016/5/9/chartex" xmlns:cx4="http://schemas.microsoft.com/office/drawing/2016/5/10/chartex" xmlns:cx5="http://schemas.microsoft.com/office/drawing/2016/5/11/chartex" xmlns:cx6="http://schemas.microsoft.com/office/drawing/2016/5/12/chartex" xmlns:cx7="http://schemas.microsoft.com/office/drawing/2016/5/13/chartex" xmlns:cx8="http://schemas.microsoft.com/office/drawing/2016/5/14/chartex" xmlns:mc="http://schemas.openxmlformats.org/markup-compatibility/2006" xmlns:aink="http://schemas.microsoft.com/office/drawing/2016/ink" xmlns:am3d="http://schemas.microsoft.com/office/drawing/2017/model3d" xmlns:o="urn:schemas-microsoft-com:office:office" xmlns:r="http://schemas.openxmlformats.org/officeDocument/2006/relationships" xmlns:m="http://schemas.openxmlformats.org/officeDocument/2006/math" xmlns:v="urn:schemas-microsoft-com:vml" xmlns:wp14="http://schemas.microsoft.com/office/word/2010/wordprocessingDrawing" xmlns:wp="http://schemas.openxmlformats.org/drawingml/2006/wordprocessingDrawing" xmlns:w10="urn:schemas-microsoft-com:office:word" xmlns:w="http://schemas.openxmlformats.org/wordprocessingml/2006/main" xmlns:w14="http://schemas.microsoft.com/office/word/2010/wordml" xmlns:w15="http://schemas.microsoft.com/office/word/2012/wordml" xmlns:w16cid="http://schemas.microsoft.com/office/word/2016/wordml/cid" xmlns:w16se="http://schemas.microsoft.com/office/word/2015/wordml/symex" xmlns:wpg="http://schemas.microsoft.com/office/word/2010/wordprocessingGroup" xmlns:wpi="http://schemas.microsoft.com/office/word/2010/wordprocessingInk" xmlns:wne="http://schemas.microsoft.com/office/word/2006/wordml" xmlns:wps="http://schemas.microsoft.com/office/word/2010/wordprocessingShape" mc:Ignorable="w14 w15 w16se w16cid wp14">
   <w:p>
     <w:pPr>
       <w:pStyle w:val="a5"/>
@@ -11531,7 +10531,7 @@
 </file>
 
 <file path=word/footnotes.xml><?xml version="1.0" encoding="utf-8"?>
-<w:footnotes xmlns:wpc="http://schemas.microsoft.com/office/word/2010/wordprocessingCanvas" xmlns:cx="http://schemas.microsoft.com/office/drawing/2014/chartex" xmlns:cx1="http://schemas.microsoft.com/office/drawing/2015/9/8/chartex" xmlns:cx2="http://schemas.microsoft.com/office/drawing/2015/10/21/chartex" xmlns:cx3="http://schemas.microsoft.com/office/drawing/2016/5/9/chartex" xmlns:cx4="http://schemas.microsoft.com/office/drawing/2016/5/10/chartex" xmlns:cx5="http://schemas.microsoft.com/office/drawing/2016/5/11/chartex" xmlns:cx6="http://schemas.microsoft.com/office/drawing/2016/5/12/chartex" xmlns:cx7="http://schemas.microsoft.com/office/drawing/2016/5/13/chartex" xmlns:cx8="http://schemas.microsoft.com/office/drawing/2016/5/14/chartex" xmlns:mc="http://schemas.openxmlformats.org/markup-compatibility/2006" xmlns:aink="http://schemas.microsoft.com/office/drawing/2016/ink" xmlns:am3d="http://schemas.microsoft.com/office/drawing/2017/model3d" xmlns:o="urn:schemas-microsoft-com:office:office" xmlns:r="http://schemas.openxmlformats.org/officeDocument/2006/relationships" xmlns:m="http://schemas.openxmlformats.org/officeDocument/2006/math" xmlns:v="urn:schemas-microsoft-com:vml" xmlns:wp14="http://schemas.microsoft.com/office/word/2010/wordprocessingDrawing" xmlns:wp="http://schemas.openxmlformats.org/drawingml/2006/wordprocessingDrawing" xmlns:w10="urn:schemas-microsoft-com:office:word" xmlns:w="http://schemas.openxmlformats.org/wordprocessingml/2006/main" xmlns:w14="http://schemas.microsoft.com/office/word/2010/wordml" xmlns:w15="http://schemas.microsoft.com/office/word/2012/wordml" xmlns:w16cex="http://schemas.microsoft.com/office/word/2018/wordml/cex" xmlns:w16cid="http://schemas.microsoft.com/office/word/2016/wordml/cid" xmlns:w16="http://schemas.microsoft.com/office/word/2018/wordml" xmlns:w16sdtdh="http://schemas.microsoft.com/office/word/2020/wordml/sdtdatahash" xmlns:w16se="http://schemas.microsoft.com/office/word/2015/wordml/symex" xmlns:wpg="http://schemas.microsoft.com/office/word/2010/wordprocessingGroup" xmlns:wpi="http://schemas.microsoft.com/office/word/2010/wordprocessingInk" xmlns:wne="http://schemas.microsoft.com/office/word/2006/wordml" xmlns:wps="http://schemas.microsoft.com/office/word/2010/wordprocessingShape" mc:Ignorable="w14 w15 w16se w16cid w16 w16cex w16sdtdh wp14">
+<w:footnotes xmlns:wpc="http://schemas.microsoft.com/office/word/2010/wordprocessingCanvas" xmlns:cx="http://schemas.microsoft.com/office/drawing/2014/chartex" xmlns:cx1="http://schemas.microsoft.com/office/drawing/2015/9/8/chartex" xmlns:cx2="http://schemas.microsoft.com/office/drawing/2015/10/21/chartex" xmlns:cx3="http://schemas.microsoft.com/office/drawing/2016/5/9/chartex" xmlns:cx4="http://schemas.microsoft.com/office/drawing/2016/5/10/chartex" xmlns:cx5="http://schemas.microsoft.com/office/drawing/2016/5/11/chartex" xmlns:cx6="http://schemas.microsoft.com/office/drawing/2016/5/12/chartex" xmlns:cx7="http://schemas.microsoft.com/office/drawing/2016/5/13/chartex" xmlns:cx8="http://schemas.microsoft.com/office/drawing/2016/5/14/chartex" xmlns:mc="http://schemas.openxmlformats.org/markup-compatibility/2006" xmlns:aink="http://schemas.microsoft.com/office/drawing/2016/ink" xmlns:am3d="http://schemas.microsoft.com/office/drawing/2017/model3d" xmlns:o="urn:schemas-microsoft-com:office:office" xmlns:r="http://schemas.openxmlformats.org/officeDocument/2006/relationships" xmlns:m="http://schemas.openxmlformats.org/officeDocument/2006/math" xmlns:v="urn:schemas-microsoft-com:vml" xmlns:wp14="http://schemas.microsoft.com/office/word/2010/wordprocessingDrawing" xmlns:wp="http://schemas.openxmlformats.org/drawingml/2006/wordprocessingDrawing" xmlns:w10="urn:schemas-microsoft-com:office:word" xmlns:w="http://schemas.openxmlformats.org/wordprocessingml/2006/main" xmlns:w14="http://schemas.microsoft.com/office/word/2010/wordml" xmlns:w15="http://schemas.microsoft.com/office/word/2012/wordml" xmlns:w16cid="http://schemas.microsoft.com/office/word/2016/wordml/cid" xmlns:w16se="http://schemas.microsoft.com/office/word/2015/wordml/symex" xmlns:wpg="http://schemas.microsoft.com/office/word/2010/wordprocessingGroup" xmlns:wpi="http://schemas.microsoft.com/office/word/2010/wordprocessingInk" xmlns:wne="http://schemas.microsoft.com/office/word/2006/wordml" xmlns:wps="http://schemas.microsoft.com/office/word/2010/wordprocessingShape" mc:Ignorable="w14 w15 w16se w16cid wp14">
   <w:footnote w:type="separator" w:id="-1">
     <w:p>
       <w:r>
@@ -11550,7 +10550,7 @@
 </file>
 
 <file path=word/header1.xml><?xml version="1.0" encoding="utf-8"?>
-<w:hdr xmlns:wpc="http://schemas.microsoft.com/office/word/2010/wordprocessingCanvas" xmlns:cx="http://schemas.microsoft.com/office/drawing/2014/chartex" xmlns:cx1="http://schemas.microsoft.com/office/drawing/2015/9/8/chartex" xmlns:cx2="http://schemas.microsoft.com/office/drawing/2015/10/21/chartex" xmlns:cx3="http://schemas.microsoft.com/office/drawing/2016/5/9/chartex" xmlns:cx4="http://schemas.microsoft.com/office/drawing/2016/5/10/chartex" xmlns:cx5="http://schemas.microsoft.com/office/drawing/2016/5/11/chartex" xmlns:cx6="http://schemas.microsoft.com/office/drawing/2016/5/12/chartex" xmlns:cx7="http://schemas.microsoft.com/office/drawing/2016/5/13/chartex" xmlns:cx8="http://schemas.microsoft.com/office/drawing/2016/5/14/chartex" xmlns:mc="http://schemas.openxmlformats.org/markup-compatibility/2006" xmlns:aink="http://schemas.microsoft.com/office/drawing/2016/ink" xmlns:am3d="http://schemas.microsoft.com/office/drawing/2017/model3d" xmlns:o="urn:schemas-microsoft-com:office:office" xmlns:r="http://schemas.openxmlformats.org/officeDocument/2006/relationships" xmlns:m="http://schemas.openxmlformats.org/officeDocument/2006/math" xmlns:v="urn:schemas-microsoft-com:vml" xmlns:wp14="http://schemas.microsoft.com/office/word/2010/wordprocessingDrawing" xmlns:wp="http://schemas.openxmlformats.org/drawingml/2006/wordprocessingDrawing" xmlns:w10="urn:schemas-microsoft-com:office:word" xmlns:w="http://schemas.openxmlformats.org/wordprocessingml/2006/main" xmlns:w14="http://schemas.microsoft.com/office/word/2010/wordml" xmlns:w15="http://schemas.microsoft.com/office/word/2012/wordml" xmlns:w16cex="http://schemas.microsoft.com/office/word/2018/wordml/cex" xmlns:w16cid="http://schemas.microsoft.com/office/word/2016/wordml/cid" xmlns:w16="http://schemas.microsoft.com/office/word/2018/wordml" xmlns:w16sdtdh="http://schemas.microsoft.com/office/word/2020/wordml/sdtdatahash" xmlns:w16se="http://schemas.microsoft.com/office/word/2015/wordml/symex" xmlns:wpg="http://schemas.microsoft.com/office/word/2010/wordprocessingGroup" xmlns:wpi="http://schemas.microsoft.com/office/word/2010/wordprocessingInk" xmlns:wne="http://schemas.microsoft.com/office/word/2006/wordml" xmlns:wps="http://schemas.microsoft.com/office/word/2010/wordprocessingShape" mc:Ignorable="w14 w15 w16se w16cid w16 w16cex w16sdtdh wp14">
+<w:hdr xmlns:wpc="http://schemas.microsoft.com/office/word/2010/wordprocessingCanvas" xmlns:cx="http://schemas.microsoft.com/office/drawing/2014/chartex" xmlns:cx1="http://schemas.microsoft.com/office/drawing/2015/9/8/chartex" xmlns:cx2="http://schemas.microsoft.com/office/drawing/2015/10/21/chartex" xmlns:cx3="http://schemas.microsoft.com/office/drawing/2016/5/9/chartex" xmlns:cx4="http://schemas.microsoft.com/office/drawing/2016/5/10/chartex" xmlns:cx5="http://schemas.microsoft.com/office/drawing/2016/5/11/chartex" xmlns:cx6="http://schemas.microsoft.com/office/drawing/2016/5/12/chartex" xmlns:cx7="http://schemas.microsoft.com/office/drawing/2016/5/13/chartex" xmlns:cx8="http://schemas.microsoft.com/office/drawing/2016/5/14/chartex" xmlns:mc="http://schemas.openxmlformats.org/markup-compatibility/2006" xmlns:aink="http://schemas.microsoft.com/office/drawing/2016/ink" xmlns:am3d="http://schemas.microsoft.com/office/drawing/2017/model3d" xmlns:o="urn:schemas-microsoft-com:office:office" xmlns:r="http://schemas.openxmlformats.org/officeDocument/2006/relationships" xmlns:m="http://schemas.openxmlformats.org/officeDocument/2006/math" xmlns:v="urn:schemas-microsoft-com:vml" xmlns:wp14="http://schemas.microsoft.com/office/word/2010/wordprocessingDrawing" xmlns:wp="http://schemas.openxmlformats.org/drawingml/2006/wordprocessingDrawing" xmlns:w10="urn:schemas-microsoft-com:office:word" xmlns:w="http://schemas.openxmlformats.org/wordprocessingml/2006/main" xmlns:w14="http://schemas.microsoft.com/office/word/2010/wordml" xmlns:w15="http://schemas.microsoft.com/office/word/2012/wordml" xmlns:w16cid="http://schemas.microsoft.com/office/word/2016/wordml/cid" xmlns:w16se="http://schemas.microsoft.com/office/word/2015/wordml/symex" xmlns:wpg="http://schemas.microsoft.com/office/word/2010/wordprocessingGroup" xmlns:wpi="http://schemas.microsoft.com/office/word/2010/wordprocessingInk" xmlns:wne="http://schemas.microsoft.com/office/word/2006/wordml" xmlns:wps="http://schemas.microsoft.com/office/word/2010/wordprocessingShape" mc:Ignorable="w14 w15 w16se w16cid wp14">
   <w:p>
     <w:pPr>
       <w:pStyle w:val="a4"/>
@@ -11588,7 +10588,7 @@
 </file>
 
 <file path=word/numbering.xml><?xml version="1.0" encoding="utf-8"?>
-<w:numbering xmlns:wpc="http://schemas.microsoft.com/office/word/2010/wordprocessingCanvas" xmlns:cx="http://schemas.microsoft.com/office/drawing/2014/chartex" xmlns:cx1="http://schemas.microsoft.com/office/drawing/2015/9/8/chartex" xmlns:cx2="http://schemas.microsoft.com/office/drawing/2015/10/21/chartex" xmlns:cx3="http://schemas.microsoft.com/office/drawing/2016/5/9/chartex" xmlns:cx4="http://schemas.microsoft.com/office/drawing/2016/5/10/chartex" xmlns:cx5="http://schemas.microsoft.com/office/drawing/2016/5/11/chartex" xmlns:cx6="http://schemas.microsoft.com/office/drawing/2016/5/12/chartex" xmlns:cx7="http://schemas.microsoft.com/office/drawing/2016/5/13/chartex" xmlns:cx8="http://schemas.microsoft.com/office/drawing/2016/5/14/chartex" xmlns:mc="http://schemas.openxmlformats.org/markup-compatibility/2006" xmlns:aink="http://schemas.microsoft.com/office/drawing/2016/ink" xmlns:am3d="http://schemas.microsoft.com/office/drawing/2017/model3d" xmlns:o="urn:schemas-microsoft-com:office:office" xmlns:r="http://schemas.openxmlformats.org/officeDocument/2006/relationships" xmlns:m="http://schemas.openxmlformats.org/officeDocument/2006/math" xmlns:v="urn:schemas-microsoft-com:vml" xmlns:wp14="http://schemas.microsoft.com/office/word/2010/wordprocessingDrawing" xmlns:wp="http://schemas.openxmlformats.org/drawingml/2006/wordprocessingDrawing" xmlns:w10="urn:schemas-microsoft-com:office:word" xmlns:w="http://schemas.openxmlformats.org/wordprocessingml/2006/main" xmlns:w14="http://schemas.microsoft.com/office/word/2010/wordml" xmlns:w15="http://schemas.microsoft.com/office/word/2012/wordml" xmlns:w16cex="http://schemas.microsoft.com/office/word/2018/wordml/cex" xmlns:w16cid="http://schemas.microsoft.com/office/word/2016/wordml/cid" xmlns:w16="http://schemas.microsoft.com/office/word/2018/wordml" xmlns:w16sdtdh="http://schemas.microsoft.com/office/word/2020/wordml/sdtdatahash" xmlns:w16se="http://schemas.microsoft.com/office/word/2015/wordml/symex" xmlns:wpg="http://schemas.microsoft.com/office/word/2010/wordprocessingGroup" xmlns:wpi="http://schemas.microsoft.com/office/word/2010/wordprocessingInk" xmlns:wne="http://schemas.microsoft.com/office/word/2006/wordml" xmlns:wps="http://schemas.microsoft.com/office/word/2010/wordprocessingShape" mc:Ignorable="w14 w15 w16se w16cid w16 w16cex w16sdtdh wp14">
+<w:numbering xmlns:wpc="http://schemas.microsoft.com/office/word/2010/wordprocessingCanvas" xmlns:cx="http://schemas.microsoft.com/office/drawing/2014/chartex" xmlns:cx1="http://schemas.microsoft.com/office/drawing/2015/9/8/chartex" xmlns:cx2="http://schemas.microsoft.com/office/drawing/2015/10/21/chartex" xmlns:cx3="http://schemas.microsoft.com/office/drawing/2016/5/9/chartex" xmlns:cx4="http://schemas.microsoft.com/office/drawing/2016/5/10/chartex" xmlns:cx5="http://schemas.microsoft.com/office/drawing/2016/5/11/chartex" xmlns:cx6="http://schemas.microsoft.com/office/drawing/2016/5/12/chartex" xmlns:cx7="http://schemas.microsoft.com/office/drawing/2016/5/13/chartex" xmlns:cx8="http://schemas.microsoft.com/office/drawing/2016/5/14/chartex" xmlns:mc="http://schemas.openxmlformats.org/markup-compatibility/2006" xmlns:aink="http://schemas.microsoft.com/office/drawing/2016/ink" xmlns:am3d="http://schemas.microsoft.com/office/drawing/2017/model3d" xmlns:o="urn:schemas-microsoft-com:office:office" xmlns:r="http://schemas.openxmlformats.org/officeDocument/2006/relationships" xmlns:m="http://schemas.openxmlformats.org/officeDocument/2006/math" xmlns:v="urn:schemas-microsoft-com:vml" xmlns:wp14="http://schemas.microsoft.com/office/word/2010/wordprocessingDrawing" xmlns:wp="http://schemas.openxmlformats.org/drawingml/2006/wordprocessingDrawing" xmlns:w10="urn:schemas-microsoft-com:office:word" xmlns:w="http://schemas.openxmlformats.org/wordprocessingml/2006/main" xmlns:w14="http://schemas.microsoft.com/office/word/2010/wordml" xmlns:w15="http://schemas.microsoft.com/office/word/2012/wordml" xmlns:w16cid="http://schemas.microsoft.com/office/word/2016/wordml/cid" xmlns:w16se="http://schemas.microsoft.com/office/word/2015/wordml/symex" xmlns:wpg="http://schemas.microsoft.com/office/word/2010/wordprocessingGroup" xmlns:wpi="http://schemas.microsoft.com/office/word/2010/wordprocessingInk" xmlns:wne="http://schemas.microsoft.com/office/word/2006/wordml" xmlns:wps="http://schemas.microsoft.com/office/word/2010/wordprocessingShape" mc:Ignorable="w14 w15 w16se w16cid wp14">
   <w:abstractNum w:abstractNumId="0" w15:restartNumberingAfterBreak="0">
     <w:nsid w:val="03AB55A1"/>
     <w:multiLevelType w:val="multilevel"/>
@@ -14710,7 +13710,9 @@
   </w:num>
   <w:num w:numId="8">
     <w:abstractNumId w:val="2"/>
-    <w:lvlOverride w:ilvl="0"/>
+    <w:lvlOverride w:ilvl="1">
+      <w:startOverride w:val="3"/>
+    </w:lvlOverride>
   </w:num>
   <w:num w:numId="9">
     <w:abstractNumId w:val="7"/>
@@ -15015,7 +14017,7 @@
   <w:num w:numId="20">
     <w:abstractNumId w:val="13"/>
     <w:lvlOverride w:ilvl="0">
-      <w:lvl w:ilvl="0" w:tplc="B6205878">
+      <w:lvl w:ilvl="0" w:tplc="784468FA">
         <w:start w:val="1"/>
         <w:numFmt w:val="decimal"/>
         <w:lvlText w:val="%1."/>
@@ -15046,7 +14048,7 @@
       </w:lvl>
     </w:lvlOverride>
     <w:lvlOverride w:ilvl="1">
-      <w:lvl w:ilvl="1" w:tplc="575A8BB0">
+      <w:lvl w:ilvl="1" w:tplc="C05E63A6">
         <w:start w:val="1"/>
         <w:numFmt w:val="decimal"/>
         <w:lvlText w:val="%2."/>
@@ -15077,7 +14079,7 @@
       </w:lvl>
     </w:lvlOverride>
     <w:lvlOverride w:ilvl="2">
-      <w:lvl w:ilvl="2" w:tplc="4EE05ED4">
+      <w:lvl w:ilvl="2" w:tplc="4D76149C">
         <w:start w:val="1"/>
         <w:numFmt w:val="decimal"/>
         <w:lvlText w:val="%3."/>
@@ -15107,7 +14109,7 @@
       </w:lvl>
     </w:lvlOverride>
     <w:lvlOverride w:ilvl="3">
-      <w:lvl w:ilvl="3" w:tplc="4F18E1EA">
+      <w:lvl w:ilvl="3" w:tplc="19EA88B2">
         <w:start w:val="1"/>
         <w:numFmt w:val="decimal"/>
         <w:lvlText w:val="%4."/>
@@ -15137,7 +14139,7 @@
       </w:lvl>
     </w:lvlOverride>
     <w:lvlOverride w:ilvl="4">
-      <w:lvl w:ilvl="4" w:tplc="87F433E6">
+      <w:lvl w:ilvl="4" w:tplc="83968736">
         <w:start w:val="1"/>
         <w:numFmt w:val="decimal"/>
         <w:lvlText w:val="%5."/>
@@ -15168,7 +14170,7 @@
       </w:lvl>
     </w:lvlOverride>
     <w:lvlOverride w:ilvl="5">
-      <w:lvl w:ilvl="5" w:tplc="81FC4746">
+      <w:lvl w:ilvl="5" w:tplc="C390E8B6">
         <w:start w:val="1"/>
         <w:numFmt w:val="decimal"/>
         <w:lvlText w:val="%6."/>
@@ -15199,7 +14201,7 @@
       </w:lvl>
     </w:lvlOverride>
     <w:lvlOverride w:ilvl="6">
-      <w:lvl w:ilvl="6" w:tplc="BC1AB680">
+      <w:lvl w:ilvl="6" w:tplc="314EFE46">
         <w:start w:val="1"/>
         <w:numFmt w:val="decimal"/>
         <w:lvlText w:val="%7."/>
@@ -15230,7 +14232,7 @@
       </w:lvl>
     </w:lvlOverride>
     <w:lvlOverride w:ilvl="7">
-      <w:lvl w:ilvl="7" w:tplc="009EFFD4">
+      <w:lvl w:ilvl="7" w:tplc="7E60C3E0">
         <w:start w:val="1"/>
         <w:numFmt w:val="decimal"/>
         <w:lvlText w:val="%8."/>
@@ -15261,7 +14263,7 @@
       </w:lvl>
     </w:lvlOverride>
     <w:lvlOverride w:ilvl="8">
-      <w:lvl w:ilvl="8" w:tplc="27E83CB8">
+      <w:lvl w:ilvl="8" w:tplc="F640BDC8">
         <w:start w:val="1"/>
         <w:numFmt w:val="decimal"/>
         <w:lvlText w:val="%9."/>
@@ -15296,7 +14298,7 @@
     <w:abstractNumId w:val="13"/>
     <w:lvlOverride w:ilvl="0">
       <w:startOverride w:val="1"/>
-      <w:lvl w:ilvl="0" w:tplc="B6205878">
+      <w:lvl w:ilvl="0" w:tplc="784468FA">
         <w:start w:val="1"/>
         <w:numFmt w:val="decimal"/>
         <w:lvlText w:val="%1."/>
@@ -15328,7 +14330,7 @@
     </w:lvlOverride>
     <w:lvlOverride w:ilvl="1">
       <w:startOverride w:val="2"/>
-      <w:lvl w:ilvl="1" w:tplc="575A8BB0">
+      <w:lvl w:ilvl="1" w:tplc="C05E63A6">
         <w:start w:val="2"/>
         <w:numFmt w:val="decimal"/>
         <w:lvlText w:val="%2."/>
@@ -15360,7 +14362,7 @@
     </w:lvlOverride>
     <w:lvlOverride w:ilvl="2">
       <w:startOverride w:val="1"/>
-      <w:lvl w:ilvl="2" w:tplc="4EE05ED4">
+      <w:lvl w:ilvl="2" w:tplc="4D76149C">
         <w:start w:val="1"/>
         <w:numFmt w:val="decimal"/>
         <w:lvlText w:val="%3."/>
@@ -15388,7 +14390,7 @@
     </w:lvlOverride>
     <w:lvlOverride w:ilvl="3">
       <w:startOverride w:val="1"/>
-      <w:lvl w:ilvl="3" w:tplc="4F18E1EA">
+      <w:lvl w:ilvl="3" w:tplc="19EA88B2">
         <w:start w:val="1"/>
         <w:numFmt w:val="decimal"/>
         <w:lvlText w:val="%4."/>
@@ -15416,7 +14418,7 @@
     </w:lvlOverride>
     <w:lvlOverride w:ilvl="4">
       <w:startOverride w:val="1"/>
-      <w:lvl w:ilvl="4" w:tplc="87F433E6">
+      <w:lvl w:ilvl="4" w:tplc="83968736">
         <w:start w:val="1"/>
         <w:numFmt w:val="decimal"/>
         <w:lvlText w:val="%5."/>
@@ -15448,7 +14450,7 @@
     </w:lvlOverride>
     <w:lvlOverride w:ilvl="5">
       <w:startOverride w:val="1"/>
-      <w:lvl w:ilvl="5" w:tplc="81FC4746">
+      <w:lvl w:ilvl="5" w:tplc="C390E8B6">
         <w:start w:val="1"/>
         <w:numFmt w:val="decimal"/>
         <w:lvlText w:val="%6."/>
@@ -15480,7 +14482,7 @@
     </w:lvlOverride>
     <w:lvlOverride w:ilvl="6">
       <w:startOverride w:val="1"/>
-      <w:lvl w:ilvl="6" w:tplc="BC1AB680">
+      <w:lvl w:ilvl="6" w:tplc="314EFE46">
         <w:start w:val="1"/>
         <w:numFmt w:val="decimal"/>
         <w:lvlText w:val="%7."/>
@@ -15512,7 +14514,7 @@
     </w:lvlOverride>
     <w:lvlOverride w:ilvl="7">
       <w:startOverride w:val="1"/>
-      <w:lvl w:ilvl="7" w:tplc="009EFFD4">
+      <w:lvl w:ilvl="7" w:tplc="7E60C3E0">
         <w:start w:val="1"/>
         <w:numFmt w:val="decimal"/>
         <w:lvlText w:val="%8."/>
@@ -15544,7 +14546,7 @@
     </w:lvlOverride>
     <w:lvlOverride w:ilvl="8">
       <w:startOverride w:val="1"/>
-      <w:lvl w:ilvl="8" w:tplc="27E83CB8">
+      <w:lvl w:ilvl="8" w:tplc="F640BDC8">
         <w:start w:val="1"/>
         <w:numFmt w:val="decimal"/>
         <w:lvlText w:val="%9."/>
@@ -15577,7 +14579,9 @@
   </w:num>
   <w:num w:numId="22">
     <w:abstractNumId w:val="13"/>
-    <w:lvlOverride w:ilvl="0"/>
+    <w:lvlOverride w:ilvl="1">
+      <w:startOverride w:val="2"/>
+    </w:lvlOverride>
   </w:num>
   <w:num w:numId="23">
     <w:abstractNumId w:val="21"/>
@@ -15610,7 +14614,7 @@
 </file>
 
 <file path=word/styles.xml><?xml version="1.0" encoding="utf-8"?>
-<w:styles xmlns:mc="http://schemas.openxmlformats.org/markup-compatibility/2006" xmlns:r="http://schemas.openxmlformats.org/officeDocument/2006/relationships" xmlns:w="http://schemas.openxmlformats.org/wordprocessingml/2006/main" xmlns:w14="http://schemas.microsoft.com/office/word/2010/wordml" xmlns:w15="http://schemas.microsoft.com/office/word/2012/wordml" xmlns:w16cex="http://schemas.microsoft.com/office/word/2018/wordml/cex" xmlns:w16cid="http://schemas.microsoft.com/office/word/2016/wordml/cid" xmlns:w16="http://schemas.microsoft.com/office/word/2018/wordml" xmlns:w16sdtdh="http://schemas.microsoft.com/office/word/2020/wordml/sdtdatahash" xmlns:w16se="http://schemas.microsoft.com/office/word/2015/wordml/symex" mc:Ignorable="w14 w15 w16se w16cid w16 w16cex w16sdtdh">
+<w:styles xmlns:mc="http://schemas.openxmlformats.org/markup-compatibility/2006" xmlns:r="http://schemas.openxmlformats.org/officeDocument/2006/relationships" xmlns:w="http://schemas.openxmlformats.org/wordprocessingml/2006/main" xmlns:w14="http://schemas.microsoft.com/office/word/2010/wordml" xmlns:w15="http://schemas.microsoft.com/office/word/2012/wordml" xmlns:w16cid="http://schemas.microsoft.com/office/word/2016/wordml/cid" xmlns:w16se="http://schemas.microsoft.com/office/word/2015/wordml/symex" mc:Ignorable="w14 w15 w16se w16cid">
   <w:docDefaults>
     <w:rPrDefault>
       <w:rPr>
@@ -15632,7 +14636,7 @@
       </w:pPr>
     </w:pPrDefault>
   </w:docDefaults>
-  <w:latentStyles w:defLockedState="0" w:defUIPriority="99" w:defSemiHidden="0" w:defUnhideWhenUsed="0" w:defQFormat="0" w:count="376">
+  <w:latentStyles w:defLockedState="0" w:defUIPriority="99" w:defSemiHidden="0" w:defUnhideWhenUsed="0" w:defQFormat="0" w:count="375">
     <w:lsdException w:name="Normal" w:uiPriority="0" w:qFormat="1"/>
     <w:lsdException w:name="heading 1" w:uiPriority="9" w:qFormat="1"/>
     <w:lsdException w:name="heading 2" w:semiHidden="1" w:uiPriority="9" w:unhideWhenUsed="1" w:qFormat="1"/>
@@ -15738,6 +14742,7 @@
     <w:lsdException w:name="HTML Sample" w:semiHidden="1" w:unhideWhenUsed="1"/>
     <w:lsdException w:name="HTML Typewriter" w:semiHidden="1" w:unhideWhenUsed="1"/>
     <w:lsdException w:name="HTML Variable" w:semiHidden="1" w:unhideWhenUsed="1"/>
+    <w:lsdException w:name="Normal Table" w:semiHidden="1" w:unhideWhenUsed="1"/>
     <w:lsdException w:name="annotation subject" w:semiHidden="1" w:unhideWhenUsed="1"/>
     <w:lsdException w:name="No List" w:semiHidden="1" w:unhideWhenUsed="1"/>
     <w:lsdException w:name="Outline List 1" w:semiHidden="1" w:unhideWhenUsed="1"/>
@@ -15784,8 +14789,10 @@
     <w:lsdException w:name="Table Subtle 2" w:semiHidden="1" w:unhideWhenUsed="1"/>
     <w:lsdException w:name="Table Web 1" w:semiHidden="1" w:unhideWhenUsed="1"/>
     <w:lsdException w:name="Table Web 2" w:semiHidden="1" w:unhideWhenUsed="1"/>
+    <w:lsdException w:name="Table Web 3" w:semiHidden="1" w:unhideWhenUsed="1"/>
     <w:lsdException w:name="Balloon Text" w:semiHidden="1" w:unhideWhenUsed="1"/>
     <w:lsdException w:name="Table Grid" w:uiPriority="39"/>
+    <w:lsdException w:name="Table Theme" w:semiHidden="1" w:unhideWhenUsed="1"/>
     <w:lsdException w:name="Placeholder Text" w:semiHidden="1"/>
     <w:lsdException w:name="No Spacing" w:uiPriority="1" w:qFormat="1"/>
     <w:lsdException w:name="Light Shading" w:uiPriority="60"/>
@@ -16005,11 +15012,10 @@
     <w:lsdException w:name="Smart Hyperlink" w:semiHidden="1" w:unhideWhenUsed="1"/>
     <w:lsdException w:name="Hashtag" w:semiHidden="1" w:unhideWhenUsed="1"/>
     <w:lsdException w:name="Unresolved Mention" w:semiHidden="1" w:unhideWhenUsed="1"/>
-    <w:lsdException w:name="Smart Link" w:semiHidden="1" w:unhideWhenUsed="1"/>
   </w:latentStyles>
   <w:style w:type="paragraph" w:default="1" w:styleId="a">
     <w:name w:val="Normal"/>
-    <w:rsid w:val="00D20E25"/>
+    <w:rsid w:val="003339A0"/>
     <w:rPr>
       <w:rFonts w:eastAsia="Times New Roman"/>
       <w:color w:val="000000"/>

</xml_diff>